<commit_message>
Clarify submission status before final handoff
</commit_message>
<xml_diff>
--- a/LUMERA_הגשה_פרסום_בגוגל_עמית_סולימן.docx
+++ b/LUMERA_הגשה_פרסום_בגוגל_עמית_סולימן.docx
@@ -2350,7 +2350,7 @@
                 <w:color w:val="FFFFFF"/>
                 <w:sz w:val="21"/>
               </w:rPr>
-              <w:t>יישום</w:t>
+              <w:t>יישום / מצב</w:t>
             </w:r>
           </w:p>
         </w:tc>
@@ -2410,7 +2410,7 @@
                 <w:color w:val="1F2A24"/>
                 <w:sz w:val="20"/>
               </w:rPr>
-              <w:t>קישורים לדף יצירת קשר ולדפי המוצרים</w:t>
+              <w:t>קישורים לדף יצירת קשר ולדפי המוצרים — נכללו בייצוא</w:t>
             </w:r>
           </w:p>
         </w:tc>
@@ -2470,7 +2470,7 @@
                 <w:color w:val="1F2A24"/>
                 <w:sz w:val="20"/>
               </w:rPr>
-              <w:t>הדגשת יתרונות, יחס אישי וקבוצות קטנות</w:t>
+              <w:t>הדגשת יתרונות, יחס אישי וקבוצות קטנות — נכללו בייצוא</w:t>
             </w:r>
           </w:p>
         </w:tc>
@@ -2530,7 +2530,7 @@
                 <w:color w:val="1F2A24"/>
                 <w:sz w:val="20"/>
               </w:rPr>
-              <w:t>הצגת סוגי השירותים</w:t>
+              <w:t>הצגת סוגי השירותים — נכללו בייצוא</w:t>
             </w:r>
           </w:p>
         </w:tc>
@@ -2590,7 +2590,7 @@
                 <w:color w:val="1F2A24"/>
                 <w:sz w:val="20"/>
               </w:rPr>
-              <w:t>מספר הטלפון 0525381648, ישראל</w:t>
+              <w:t>מספר הטלפון 0525381648, ישראל — קיים וממתין לבדיקה</w:t>
             </w:r>
           </w:p>
         </w:tc>
@@ -2650,7 +2650,7 @@
                 <w:color w:val="1F2A24"/>
                 <w:sz w:val="20"/>
               </w:rPr>
-              <w:t>נכס ספירה לאחור לקידום הצעה מוגבלת בזמן</w:t>
+              <w:t>תוסף שנדרש להשלמה בחשבון לפני ההגשה הסופית</w:t>
             </w:r>
           </w:p>
         </w:tc>
@@ -2809,7 +2809,7 @@
           <w:color w:val="1F2A24"/>
           <w:sz w:val="22"/>
         </w:rPr>
-        <w:t>העבודה מציגה תהליך מלא של הקמת פעילות פרסום עבור עסק שירותי: אתר עם דפי נחיתה וטופס, מדידת המרות, קמפיין חיפוש וקמפיין מותג, קמפיין מדיה עם רימרקטינג, קמפיין וידאו ומודעות התקשרות. כל הקמפיינים בחשבון נשמרו במצב מושהה בהתאם להנחיות המטלה.</w:t>
+        <w:t>העבודה מציגה תהליך של הקמת פעילות פרסום עבור עסק שירותי: אתר עם דפי נחיתה וטופס, מדידת המרות, קמפיין חיפוש וקמפיין מותג, קמפיין מדיה עם רימרקטינג וקמפיין וידאו. כל הקמפיינים בחשבון נשמרו במצב מושהה בהתאם להנחיות המטלה. לפני שליחת ההגשה יש להשלים ולוודא בחשבון את תוסף הספירה לאחור, את מודעת ההתקשרות בלבד ואת ארבעת מיקומי ערוצי YouTube.</w:t>
       </w:r>
     </w:p>
     <w:p>

</xml_diff>

<commit_message>
Make submission document minimal
</commit_message>
<xml_diff>
--- a/LUMERA_הגשה_פרסום_בגוגל_עמית_סולימן.docx
+++ b/LUMERA_הגשה_פרסום_בגוגל_עמית_סולימן.docx
@@ -4,14 +4,14 @@
   <w:body>
     <w:p>
       <w:pPr>
-        <w:spacing w:after="160" w:line="276" w:lineRule="auto"/>
+        <w:spacing w:after="60" w:line="276" w:lineRule="auto"/>
         <w:jc w:val="center"/>
         <w:bidi w:val="1"/>
       </w:pPr>
       <w:r>
         <w:drawing>
           <wp:inline xmlns:a="http://schemas.openxmlformats.org/drawingml/2006/main" xmlns:pic="http://schemas.openxmlformats.org/drawingml/2006/picture">
-            <wp:extent cx="3383280" cy="845820"/>
+            <wp:extent cx="3108960" cy="777240"/>
             <wp:docPr id="1" name="Picture 1"/>
             <wp:cNvGraphicFramePr>
               <a:graphicFrameLocks noChangeAspect="1"/>
@@ -20,7 +20,7 @@
               <a:graphicData uri="http://schemas.openxmlformats.org/drawingml/2006/picture">
                 <pic:pic>
                   <pic:nvPicPr>
-                    <pic:cNvPr id="0" name="lumera-logo-landscape.png"/>
+                    <pic:cNvPr id="0" name="lumera-logo-landscape-transparent.png"/>
                     <pic:cNvPicPr/>
                   </pic:nvPicPr>
                   <pic:blipFill>
@@ -32,7 +32,7 @@
                   <pic:spPr>
                     <a:xfrm>
                       <a:off x="0" y="0"/>
-                      <a:ext cx="3383280" cy="845820"/>
+                      <a:ext cx="3108960" cy="777240"/>
                     </a:xfrm>
                     <a:prstGeom prst="rect"/>
                   </pic:spPr>
@@ -54,14 +54,14 @@
           <w:rFonts w:ascii="Arial" w:hAnsi="Arial"/>
           <w:b/>
           <w:color w:val="1F2A24"/>
-          <w:sz w:val="54"/>
+          <w:sz w:val="50"/>
         </w:rPr>
         <w:t>פרסום בגוגל</w:t>
       </w:r>
     </w:p>
     <w:p>
       <w:pPr>
-        <w:spacing w:after="360" w:line="276" w:lineRule="auto"/>
+        <w:spacing w:after="400" w:line="276" w:lineRule="auto"/>
         <w:jc w:val="center"/>
         <w:bidi w:val="1"/>
       </w:pPr>
@@ -72,53 +72,23 @@
           <w:color w:val="5F7D68"/>
           <w:sz w:val="26"/>
         </w:rPr>
-        <w:t>מטלת סיום · סמסטר ב׳ · תשפ״ו 2026</w:t>
+        <w:t>מטלת סיום · תשפ״ו 2026</w:t>
       </w:r>
     </w:p>
     <w:p>
       <w:pPr>
-        <w:spacing w:after="320" w:line="276" w:lineRule="auto"/>
-        <w:jc w:val="center"/>
-        <w:bidi w:val="1"/>
-      </w:pPr>
-      <w:r>
-        <w:rPr>
-          <w:color w:val="C9A45C"/>
-          <w:sz w:val="24"/>
-        </w:rPr>
-        <w:t>━━━━━━━━━━━━━━━━━━━━━━━━━━━━</w:t>
-      </w:r>
-    </w:p>
-    <w:p>
-      <w:pPr>
-        <w:spacing w:after="40" w:line="276" w:lineRule="auto"/>
-        <w:jc w:val="center"/>
+        <w:spacing w:after="140" w:line="276" w:lineRule="auto" w:before="280"/>
+        <w:jc w:val="right"/>
         <w:bidi w:val="1"/>
       </w:pPr>
       <w:r>
         <w:rPr>
           <w:rFonts w:ascii="Arial" w:hAnsi="Arial"/>
           <w:b/>
-          <w:color w:val="C9A45C"/>
-          <w:sz w:val="40"/>
+          <w:color w:val="5F7D68"/>
+          <w:sz w:val="34"/>
         </w:rPr>
-        <w:t>LUMERA</w:t>
-      </w:r>
-    </w:p>
-    <w:p>
-      <w:pPr>
-        <w:spacing w:after="500" w:line="276" w:lineRule="auto"/>
-        <w:jc w:val="center"/>
-        <w:bidi w:val="1"/>
-      </w:pPr>
-      <w:r>
-        <w:rPr>
-          <w:rFonts w:ascii="Arial" w:hAnsi="Arial"/>
-          <w:b w:val="0"/>
-          <w:color w:val="6F706A"/>
-          <w:sz w:val="28"/>
-        </w:rPr>
-        <w:t>סטודיו לפילאטיס בוטיק בנתניה</w:t>
+        <w:t>פרטי הסטודנט</w:t>
       </w:r>
     </w:p>
     <w:tbl>
@@ -129,26 +99,21 @@
         <w:tblLook w:firstColumn="1" w:firstRow="1" w:lastColumn="0" w:lastRow="0" w:noHBand="0" w:noVBand="1" w:val="04A0"/>
       </w:tblPr>
       <w:tblGrid>
-        <w:gridCol w:w="5112"/>
-        <w:gridCol w:w="5112"/>
+        <w:gridCol w:w="5040"/>
+        <w:gridCol w:w="5040"/>
       </w:tblGrid>
       <w:tr>
         <w:tc>
           <w:tcPr>
-            <w:tcW w:type="dxa" w:w="5112"/>
+            <w:tcW w:type="dxa" w:w="5040"/>
             <w:shd w:fill="5F7D68"/>
             <w:vAlign w:val="center"/>
-            <w:tcBorders>
-              <w:top w:val="single" w:sz="5" w:color="D8D1C3"/>
-              <w:left w:val="single" w:sz="5" w:color="D8D1C3"/>
-              <w:bottom w:val="single" w:sz="5" w:color="D8D1C3"/>
-              <w:right w:val="single" w:sz="5" w:color="D8D1C3"/>
-            </w:tcBorders>
           </w:tcPr>
           <w:p>
             <w:pPr>
-              <w:spacing w:after="40"/>
+              <w:spacing w:after="0"/>
               <w:jc w:val="right"/>
+              <w:bidi w:val="1"/>
             </w:pPr>
             <w:r/>
             <w:r>
@@ -164,20 +129,15 @@
         </w:tc>
         <w:tc>
           <w:tcPr>
-            <w:tcW w:type="dxa" w:w="5112"/>
+            <w:tcW w:type="dxa" w:w="5040"/>
             <w:shd w:fill="5F7D68"/>
             <w:vAlign w:val="center"/>
-            <w:tcBorders>
-              <w:top w:val="single" w:sz="5" w:color="D8D1C3"/>
-              <w:left w:val="single" w:sz="5" w:color="D8D1C3"/>
-              <w:bottom w:val="single" w:sz="5" w:color="D8D1C3"/>
-              <w:right w:val="single" w:sz="5" w:color="D8D1C3"/>
-            </w:tcBorders>
           </w:tcPr>
           <w:p>
             <w:pPr>
-              <w:spacing w:after="40"/>
+              <w:spacing w:after="0"/>
               <w:jc w:val="right"/>
+              <w:bidi w:val="1"/>
             </w:pPr>
             <w:r/>
             <w:r>
@@ -195,20 +155,15 @@
       <w:tr>
         <w:tc>
           <w:tcPr>
-            <w:tcW w:type="dxa" w:w="5112"/>
+            <w:tcW w:type="dxa" w:w="5040"/>
             <w:shd w:fill="F8F3EA"/>
             <w:vAlign w:val="center"/>
-            <w:tcBorders>
-              <w:top w:val="single" w:sz="5" w:color="D8D1C3"/>
-              <w:left w:val="single" w:sz="5" w:color="D8D1C3"/>
-              <w:bottom w:val="single" w:sz="5" w:color="D8D1C3"/>
-              <w:right w:val="single" w:sz="5" w:color="D8D1C3"/>
-            </w:tcBorders>
           </w:tcPr>
           <w:p>
             <w:pPr>
-              <w:spacing w:after="40"/>
+              <w:spacing w:after="0"/>
               <w:jc w:val="right"/>
+              <w:bidi w:val="1"/>
             </w:pPr>
             <w:r/>
             <w:r>
@@ -216,28 +171,23 @@
                 <w:rFonts w:ascii="Arial" w:hAnsi="Arial"/>
                 <w:b w:val="0"/>
                 <w:color w:val="1F2A24"/>
-                <w:sz w:val="20"/>
+                <w:sz w:val="21"/>
               </w:rPr>
-              <w:t>סטודנט</w:t>
+              <w:t>שם</w:t>
             </w:r>
           </w:p>
         </w:tc>
         <w:tc>
           <w:tcPr>
-            <w:tcW w:type="dxa" w:w="5112"/>
+            <w:tcW w:type="dxa" w:w="5040"/>
             <w:shd w:fill="F8F3EA"/>
             <w:vAlign w:val="center"/>
-            <w:tcBorders>
-              <w:top w:val="single" w:sz="5" w:color="D8D1C3"/>
-              <w:left w:val="single" w:sz="5" w:color="D8D1C3"/>
-              <w:bottom w:val="single" w:sz="5" w:color="D8D1C3"/>
-              <w:right w:val="single" w:sz="5" w:color="D8D1C3"/>
-            </w:tcBorders>
           </w:tcPr>
           <w:p>
             <w:pPr>
-              <w:spacing w:after="40"/>
+              <w:spacing w:after="0"/>
               <w:jc w:val="right"/>
+              <w:bidi w:val="1"/>
             </w:pPr>
             <w:r/>
             <w:r>
@@ -245,7 +195,7 @@
                 <w:rFonts w:ascii="Arial" w:hAnsi="Arial"/>
                 <w:b w:val="0"/>
                 <w:color w:val="1F2A24"/>
-                <w:sz w:val="20"/>
+                <w:sz w:val="21"/>
               </w:rPr>
               <w:t>עמית סולימן</w:t>
             </w:r>
@@ -255,20 +205,15 @@
       <w:tr>
         <w:tc>
           <w:tcPr>
-            <w:tcW w:type="dxa" w:w="5112"/>
+            <w:tcW w:type="dxa" w:w="5040"/>
             <w:shd w:fill="FFFFFF"/>
             <w:vAlign w:val="center"/>
-            <w:tcBorders>
-              <w:top w:val="single" w:sz="5" w:color="D8D1C3"/>
-              <w:left w:val="single" w:sz="5" w:color="D8D1C3"/>
-              <w:bottom w:val="single" w:sz="5" w:color="D8D1C3"/>
-              <w:right w:val="single" w:sz="5" w:color="D8D1C3"/>
-            </w:tcBorders>
           </w:tcPr>
           <w:p>
             <w:pPr>
-              <w:spacing w:after="40"/>
+              <w:spacing w:after="0"/>
               <w:jc w:val="right"/>
+              <w:bidi w:val="1"/>
             </w:pPr>
             <w:r/>
             <w:r>
@@ -276,28 +221,23 @@
                 <w:rFonts w:ascii="Arial" w:hAnsi="Arial"/>
                 <w:b w:val="0"/>
                 <w:color w:val="1F2A24"/>
-                <w:sz w:val="20"/>
+                <w:sz w:val="21"/>
               </w:rPr>
-              <w:t>מרצה</w:t>
+              <w:t>תעודת זהות</w:t>
             </w:r>
           </w:p>
         </w:tc>
         <w:tc>
           <w:tcPr>
-            <w:tcW w:type="dxa" w:w="5112"/>
+            <w:tcW w:type="dxa" w:w="5040"/>
             <w:shd w:fill="FFFFFF"/>
             <w:vAlign w:val="center"/>
-            <w:tcBorders>
-              <w:top w:val="single" w:sz="5" w:color="D8D1C3"/>
-              <w:left w:val="single" w:sz="5" w:color="D8D1C3"/>
-              <w:bottom w:val="single" w:sz="5" w:color="D8D1C3"/>
-              <w:right w:val="single" w:sz="5" w:color="D8D1C3"/>
-            </w:tcBorders>
           </w:tcPr>
           <w:p>
             <w:pPr>
-              <w:spacing w:after="40"/>
+              <w:spacing w:after="0"/>
               <w:jc w:val="right"/>
+              <w:bidi w:val="1"/>
             </w:pPr>
             <w:r/>
             <w:r>
@@ -305,9 +245,9 @@
                 <w:rFonts w:ascii="Arial" w:hAnsi="Arial"/>
                 <w:b w:val="0"/>
                 <w:color w:val="1F2A24"/>
-                <w:sz w:val="20"/>
+                <w:sz w:val="21"/>
               </w:rPr>
-              <w:t>אבישי פרוינד</w:t>
+              <w:t>213686108</w:t>
             </w:r>
           </w:p>
         </w:tc>
@@ -315,20 +255,15 @@
       <w:tr>
         <w:tc>
           <w:tcPr>
-            <w:tcW w:type="dxa" w:w="5112"/>
+            <w:tcW w:type="dxa" w:w="5040"/>
             <w:shd w:fill="F8F3EA"/>
             <w:vAlign w:val="center"/>
-            <w:tcBorders>
-              <w:top w:val="single" w:sz="5" w:color="D8D1C3"/>
-              <w:left w:val="single" w:sz="5" w:color="D8D1C3"/>
-              <w:bottom w:val="single" w:sz="5" w:color="D8D1C3"/>
-              <w:right w:val="single" w:sz="5" w:color="D8D1C3"/>
-            </w:tcBorders>
           </w:tcPr>
           <w:p>
             <w:pPr>
-              <w:spacing w:after="40"/>
+              <w:spacing w:after="0"/>
               <w:jc w:val="right"/>
+              <w:bidi w:val="1"/>
             </w:pPr>
             <w:r/>
             <w:r>
@@ -336,28 +271,23 @@
                 <w:rFonts w:ascii="Arial" w:hAnsi="Arial"/>
                 <w:b w:val="0"/>
                 <w:color w:val="1F2A24"/>
-                <w:sz w:val="20"/>
+                <w:sz w:val="21"/>
               </w:rPr>
-              <w:t>קורס</w:t>
+              <w:t>טלפון</w:t>
             </w:r>
           </w:p>
         </w:tc>
         <w:tc>
           <w:tcPr>
-            <w:tcW w:type="dxa" w:w="5112"/>
+            <w:tcW w:type="dxa" w:w="5040"/>
             <w:shd w:fill="F8F3EA"/>
             <w:vAlign w:val="center"/>
-            <w:tcBorders>
-              <w:top w:val="single" w:sz="5" w:color="D8D1C3"/>
-              <w:left w:val="single" w:sz="5" w:color="D8D1C3"/>
-              <w:bottom w:val="single" w:sz="5" w:color="D8D1C3"/>
-              <w:right w:val="single" w:sz="5" w:color="D8D1C3"/>
-            </w:tcBorders>
           </w:tcPr>
           <w:p>
             <w:pPr>
-              <w:spacing w:after="40"/>
+              <w:spacing w:after="0"/>
               <w:jc w:val="right"/>
+              <w:bidi w:val="1"/>
             </w:pPr>
             <w:r/>
             <w:r>
@@ -365,9 +295,9 @@
                 <w:rFonts w:ascii="Arial" w:hAnsi="Arial"/>
                 <w:b w:val="0"/>
                 <w:color w:val="1F2A24"/>
-                <w:sz w:val="20"/>
+                <w:sz w:val="21"/>
               </w:rPr>
-              <w:t>פרסום בגוגל</w:t>
+              <w:t>0587477769</w:t>
             </w:r>
           </w:p>
         </w:tc>
@@ -375,20 +305,15 @@
       <w:tr>
         <w:tc>
           <w:tcPr>
-            <w:tcW w:type="dxa" w:w="5112"/>
+            <w:tcW w:type="dxa" w:w="5040"/>
             <w:shd w:fill="FFFFFF"/>
             <w:vAlign w:val="center"/>
-            <w:tcBorders>
-              <w:top w:val="single" w:sz="5" w:color="D8D1C3"/>
-              <w:left w:val="single" w:sz="5" w:color="D8D1C3"/>
-              <w:bottom w:val="single" w:sz="5" w:color="D8D1C3"/>
-              <w:right w:val="single" w:sz="5" w:color="D8D1C3"/>
-            </w:tcBorders>
           </w:tcPr>
           <w:p>
             <w:pPr>
-              <w:spacing w:after="40"/>
+              <w:spacing w:after="0"/>
               <w:jc w:val="right"/>
+              <w:bidi w:val="1"/>
             </w:pPr>
             <w:r/>
             <w:r>
@@ -396,28 +321,23 @@
                 <w:rFonts w:ascii="Arial" w:hAnsi="Arial"/>
                 <w:b w:val="0"/>
                 <w:color w:val="1F2A24"/>
-                <w:sz w:val="20"/>
+                <w:sz w:val="21"/>
               </w:rPr>
-              <w:t>מספר חשבון Google Ads</w:t>
+              <w:t>אימייל</w:t>
             </w:r>
           </w:p>
         </w:tc>
         <w:tc>
           <w:tcPr>
-            <w:tcW w:type="dxa" w:w="5112"/>
+            <w:tcW w:type="dxa" w:w="5040"/>
             <w:shd w:fill="FFFFFF"/>
             <w:vAlign w:val="center"/>
-            <w:tcBorders>
-              <w:top w:val="single" w:sz="5" w:color="D8D1C3"/>
-              <w:left w:val="single" w:sz="5" w:color="D8D1C3"/>
-              <w:bottom w:val="single" w:sz="5" w:color="D8D1C3"/>
-              <w:right w:val="single" w:sz="5" w:color="D8D1C3"/>
-            </w:tcBorders>
           </w:tcPr>
           <w:p>
             <w:pPr>
-              <w:spacing w:after="40"/>
+              <w:spacing w:after="0"/>
               <w:jc w:val="right"/>
+              <w:bidi w:val="1"/>
             </w:pPr>
             <w:r/>
             <w:r>
@@ -425,69 +345,9 @@
                 <w:rFonts w:ascii="Arial" w:hAnsi="Arial"/>
                 <w:b w:val="0"/>
                 <w:color w:val="1F2A24"/>
-                <w:sz w:val="20"/>
+                <w:sz w:val="21"/>
               </w:rPr>
-              <w:t>580-214-1692</w:t>
-            </w:r>
-          </w:p>
-        </w:tc>
-      </w:tr>
-      <w:tr>
-        <w:tc>
-          <w:tcPr>
-            <w:tcW w:type="dxa" w:w="5112"/>
-            <w:shd w:fill="F8F3EA"/>
-            <w:vAlign w:val="center"/>
-            <w:tcBorders>
-              <w:top w:val="single" w:sz="5" w:color="D8D1C3"/>
-              <w:left w:val="single" w:sz="5" w:color="D8D1C3"/>
-              <w:bottom w:val="single" w:sz="5" w:color="D8D1C3"/>
-              <w:right w:val="single" w:sz="5" w:color="D8D1C3"/>
-            </w:tcBorders>
-          </w:tcPr>
-          <w:p>
-            <w:pPr>
-              <w:spacing w:after="40"/>
-              <w:jc w:val="right"/>
-            </w:pPr>
-            <w:r/>
-            <w:r>
-              <w:rPr>
-                <w:rFonts w:ascii="Arial" w:hAnsi="Arial"/>
-                <w:b w:val="0"/>
-                <w:color w:val="1F2A24"/>
-                <w:sz w:val="20"/>
-              </w:rPr>
-              <w:t>תאריך הגשה</w:t>
-            </w:r>
-          </w:p>
-        </w:tc>
-        <w:tc>
-          <w:tcPr>
-            <w:tcW w:type="dxa" w:w="5112"/>
-            <w:shd w:fill="F8F3EA"/>
-            <w:vAlign w:val="center"/>
-            <w:tcBorders>
-              <w:top w:val="single" w:sz="5" w:color="D8D1C3"/>
-              <w:left w:val="single" w:sz="5" w:color="D8D1C3"/>
-              <w:bottom w:val="single" w:sz="5" w:color="D8D1C3"/>
-              <w:right w:val="single" w:sz="5" w:color="D8D1C3"/>
-            </w:tcBorders>
-          </w:tcPr>
-          <w:p>
-            <w:pPr>
-              <w:spacing w:after="40"/>
-              <w:jc w:val="right"/>
-            </w:pPr>
-            <w:r/>
-            <w:r>
-              <w:rPr>
-                <w:rFonts w:ascii="Arial" w:hAnsi="Arial"/>
-                <w:b w:val="0"/>
-                <w:color w:val="1F2A24"/>
-                <w:sz w:val="20"/>
-              </w:rPr>
-              <w:t>12/07/2026</w:t>
+              <w:t>amitsuliman12@gmail.com</w:t>
             </w:r>
           </w:p>
         </w:tc>
@@ -495,35 +355,7 @@
     </w:tbl>
     <w:p>
       <w:pPr>
-        <w:spacing w:after="20" w:line="276" w:lineRule="auto"/>
-        <w:jc w:val="right"/>
-        <w:bidi w:val="1"/>
-      </w:pPr>
-    </w:p>
-    <w:p>
-      <w:pPr>
-        <w:spacing w:after="0" w:line="276" w:lineRule="auto"/>
-        <w:jc w:val="center"/>
-        <w:bidi w:val="1"/>
-      </w:pPr>
-      <w:r>
-        <w:rPr>
-          <w:rFonts w:ascii="Arial" w:hAnsi="Arial"/>
-          <w:b w:val="0"/>
-          <w:color w:val="6F706A"/>
-          <w:sz w:val="22"/>
-        </w:rPr>
-        <w:t>מסמך זה מציג את הארגון, דפי הנחיתה ומבנה הפעילות הפרסומית שנבנתה עבור LUMERA.</w:t>
-      </w:r>
-    </w:p>
-    <w:p>
-      <w:r>
-        <w:br w:type="page"/>
-      </w:r>
-    </w:p>
-    <w:p>
-      <w:pPr>
-        <w:spacing w:before="300" w:after="140"/>
+        <w:spacing w:after="140" w:line="276" w:lineRule="auto" w:before="280"/>
         <w:jc w:val="right"/>
         <w:bidi w:val="1"/>
       </w:pPr>
@@ -532,14 +364,192 @@
           <w:rFonts w:ascii="Arial" w:hAnsi="Arial"/>
           <w:b/>
           <w:color w:val="5F7D68"/>
-          <w:sz w:val="36"/>
+          <w:sz w:val="34"/>
         </w:rPr>
-        <w:t>1. תיאור הארגון</w:t>
+        <w:t>המוצרים</w:t>
+      </w:r>
+    </w:p>
+    <w:tbl>
+      <w:tblPr>
+        <w:tblStyle w:val="TableGrid"/>
+        <w:tblW w:type="auto" w:w="0"/>
+        <w:jc w:val="center"/>
+        <w:tblLook w:firstColumn="1" w:firstRow="1" w:lastColumn="0" w:lastRow="0" w:noHBand="0" w:noVBand="1" w:val="04A0"/>
+      </w:tblPr>
+      <w:tblGrid>
+        <w:gridCol w:w="5040"/>
+        <w:gridCol w:w="5040"/>
+      </w:tblGrid>
+      <w:tr>
+        <w:tc>
+          <w:tcPr>
+            <w:tcW w:type="dxa" w:w="5040"/>
+            <w:shd w:fill="5F7D68"/>
+            <w:vAlign w:val="center"/>
+          </w:tcPr>
+          <w:p>
+            <w:pPr>
+              <w:spacing w:after="0"/>
+              <w:jc w:val="right"/>
+              <w:bidi w:val="1"/>
+            </w:pPr>
+            <w:r/>
+            <w:r>
+              <w:rPr>
+                <w:rFonts w:ascii="Arial" w:hAnsi="Arial"/>
+                <w:b/>
+                <w:color w:val="FFFFFF"/>
+                <w:sz w:val="21"/>
+              </w:rPr>
+              <w:t>מוצר</w:t>
+            </w:r>
+          </w:p>
+        </w:tc>
+        <w:tc>
+          <w:tcPr>
+            <w:tcW w:type="dxa" w:w="5040"/>
+            <w:shd w:fill="5F7D68"/>
+            <w:vAlign w:val="center"/>
+          </w:tcPr>
+          <w:p>
+            <w:pPr>
+              <w:spacing w:after="0"/>
+              <w:jc w:val="right"/>
+              <w:bidi w:val="1"/>
+            </w:pPr>
+            <w:r/>
+            <w:r>
+              <w:rPr>
+                <w:rFonts w:ascii="Arial" w:hAnsi="Arial"/>
+                <w:b/>
+                <w:color w:val="FFFFFF"/>
+                <w:sz w:val="21"/>
+              </w:rPr>
+              <w:t>תיאור</w:t>
+            </w:r>
+          </w:p>
+        </w:tc>
+      </w:tr>
+      <w:tr>
+        <w:tc>
+          <w:tcPr>
+            <w:tcW w:type="dxa" w:w="5040"/>
+            <w:shd w:fill="F8F3EA"/>
+            <w:vAlign w:val="center"/>
+          </w:tcPr>
+          <w:p>
+            <w:pPr>
+              <w:spacing w:after="0"/>
+              <w:jc w:val="right"/>
+              <w:bidi w:val="1"/>
+            </w:pPr>
+            <w:r/>
+            <w:r>
+              <w:rPr>
+                <w:rFonts w:ascii="Arial" w:hAnsi="Arial"/>
+                <w:b w:val="0"/>
+                <w:color w:val="1F2A24"/>
+                <w:sz w:val="21"/>
+              </w:rPr>
+              <w:t>פילאטיס מכשירים / רפורמר</w:t>
+            </w:r>
+          </w:p>
+        </w:tc>
+        <w:tc>
+          <w:tcPr>
+            <w:tcW w:type="dxa" w:w="5040"/>
+            <w:shd w:fill="F8F3EA"/>
+            <w:vAlign w:val="center"/>
+          </w:tcPr>
+          <w:p>
+            <w:pPr>
+              <w:spacing w:after="0"/>
+              <w:jc w:val="right"/>
+              <w:bidi w:val="1"/>
+            </w:pPr>
+            <w:r/>
+            <w:r>
+              <w:rPr>
+                <w:rFonts w:ascii="Arial" w:hAnsi="Arial"/>
+                <w:b w:val="0"/>
+                <w:color w:val="1F2A24"/>
+                <w:sz w:val="21"/>
+              </w:rPr>
+              <w:t>אימון על מכשיר רפורמר לחיזוק, שיפור יציבה, שליטה בתנועה והתאמה לרמת המתאמן.</w:t>
+            </w:r>
+          </w:p>
+        </w:tc>
+      </w:tr>
+      <w:tr>
+        <w:tc>
+          <w:tcPr>
+            <w:tcW w:type="dxa" w:w="5040"/>
+            <w:shd w:fill="FFFFFF"/>
+            <w:vAlign w:val="center"/>
+          </w:tcPr>
+          <w:p>
+            <w:pPr>
+              <w:spacing w:after="0"/>
+              <w:jc w:val="right"/>
+              <w:bidi w:val="1"/>
+            </w:pPr>
+            <w:r/>
+            <w:r>
+              <w:rPr>
+                <w:rFonts w:ascii="Arial" w:hAnsi="Arial"/>
+                <w:b w:val="0"/>
+                <w:color w:val="1F2A24"/>
+                <w:sz w:val="21"/>
+              </w:rPr>
+              <w:t>אימון פילאטיס פרטי 1 על 1</w:t>
+            </w:r>
+          </w:p>
+        </w:tc>
+        <w:tc>
+          <w:tcPr>
+            <w:tcW w:type="dxa" w:w="5040"/>
+            <w:shd w:fill="FFFFFF"/>
+            <w:vAlign w:val="center"/>
+          </w:tcPr>
+          <w:p>
+            <w:pPr>
+              <w:spacing w:after="0"/>
+              <w:jc w:val="right"/>
+              <w:bidi w:val="1"/>
+            </w:pPr>
+            <w:r/>
+            <w:r>
+              <w:rPr>
+                <w:rFonts w:ascii="Arial" w:hAnsi="Arial"/>
+                <w:b w:val="0"/>
+                <w:color w:val="1F2A24"/>
+                <w:sz w:val="21"/>
+              </w:rPr>
+              <w:t>אימון אישי עם תוכנית מותאמת, ליווי צמוד וגמישות בתוכן ובקצב האימון.</w:t>
+            </w:r>
+          </w:p>
+        </w:tc>
+      </w:tr>
+    </w:tbl>
+    <w:p>
+      <w:pPr>
+        <w:spacing w:after="140" w:line="276" w:lineRule="auto" w:before="280"/>
+        <w:jc w:val="right"/>
+        <w:bidi w:val="1"/>
+      </w:pPr>
+      <w:r>
+        <w:rPr>
+          <w:rFonts w:ascii="Arial" w:hAnsi="Arial"/>
+          <w:b/>
+          <w:color w:val="5F7D68"/>
+          <w:sz w:val="34"/>
+        </w:rPr>
+        <w:t>תיאור הארגון</w:t>
       </w:r>
     </w:p>
     <w:p>
       <w:pPr>
-        <w:spacing w:after="140" w:line="276" w:lineRule="auto"/>
+        <w:spacing w:after="200" w:line="276" w:lineRule="auto"/>
         <w:jc w:val="right"/>
         <w:bidi w:val="1"/>
       </w:pPr>
@@ -550,44 +560,12 @@
           <w:color w:val="1F2A24"/>
           <w:sz w:val="22"/>
         </w:rPr>
-        <w:t>LUMERA הוא סטודיו בוטיק לפילאטיס בנתניה ובאזור השרון. הסטודיו מציע אימוני רפורמר, שיעורי פילאטיס רצפה ואימונים פרטיים. המותג פונה למתאמנים ומתאמנות שמחפשים מסגרת מקצועית, יחס אישי ואימון שניתן להתאים לרמה ולמטרה שלהם.</w:t>
+        <w:t>LUMERA הוא סטודיו בוטיק לפילאטיס בנתניה ובאזור השרון. הסטודיו מציע אימוני רפורמר ואימונים פרטיים, באווירה מקצועית ושקטה, עם דגש על יחס אישי, התאמה למטרות המתאמן ושיפור הכושר, היציבה ואיכות התנועה.</w:t>
       </w:r>
     </w:p>
     <w:p>
       <w:pPr>
-        <w:spacing w:after="140" w:line="276" w:lineRule="auto"/>
-        <w:jc w:val="right"/>
-        <w:bidi w:val="1"/>
-      </w:pPr>
-      <w:r>
-        <w:rPr>
-          <w:rFonts w:ascii="Arial" w:hAnsi="Arial"/>
-          <w:b w:val="0"/>
-          <w:color w:val="1F2A24"/>
-          <w:sz w:val="22"/>
-        </w:rPr>
-        <w:t>האתר נבנה כדף נחיתה רב־עמודי. בכל דף קיים טופס השארת פרטים, והשלמת הטופס מעבירה את המשתמש לדף תודה. בדף התודה מופעל אירוע המרה של Google Ads.</w:t>
-      </w:r>
-    </w:p>
-    <w:p>
-      <w:pPr>
-        <w:spacing w:before="180" w:after="140"/>
-        <w:jc w:val="right"/>
-        <w:bidi w:val="1"/>
-      </w:pPr>
-      <w:r>
-        <w:rPr>
-          <w:rFonts w:ascii="Arial" w:hAnsi="Arial"/>
-          <w:b/>
-          <w:color w:val="1F2A24"/>
-          <w:sz w:val="26"/>
-        </w:rPr>
-        <w:t>2. המוצרים שנבחרו</w:t>
-      </w:r>
-    </w:p>
-    <w:p>
-      <w:pPr>
-        <w:spacing w:after="60" w:line="276" w:lineRule="auto"/>
+        <w:spacing w:after="140" w:line="276" w:lineRule="auto" w:before="280"/>
         <w:jc w:val="right"/>
         <w:bidi w:val="1"/>
       </w:pPr>
@@ -596,73 +574,9 @@
           <w:rFonts w:ascii="Arial" w:hAnsi="Arial"/>
           <w:b/>
           <w:color w:val="5F7D68"/>
-          <w:sz w:val="24"/>
+          <w:sz w:val="34"/>
         </w:rPr>
-        <w:t>א. פילאטיס מכשירים / רפורמר</w:t>
-      </w:r>
-    </w:p>
-    <w:p>
-      <w:pPr>
-        <w:spacing w:after="140" w:line="276" w:lineRule="auto"/>
-        <w:jc w:val="right"/>
-        <w:bidi w:val="1"/>
-      </w:pPr>
-      <w:r>
-        <w:rPr>
-          <w:rFonts w:ascii="Arial" w:hAnsi="Arial"/>
-          <w:b w:val="0"/>
-          <w:color w:val="1F2A24"/>
-          <w:sz w:val="21"/>
-        </w:rPr>
-        <w:t>אימון על מכשיר רפורמר המשלב התנגדות, שליטה ודיוק. המסלול מתאים למתחילים ולמתאמנים מנוסים, ויכול לשמש לחיזוק שרירי הליבה, לשיפור היציבה, להגדלת טווחי תנועה ולבניית הרגלי תנועה נכונים. העבודה בקבוצה קטנה מאפשרת למדריך לתת תיקונים והתאמות במהלך השיעור.</w:t>
-      </w:r>
-    </w:p>
-    <w:p>
-      <w:pPr>
-        <w:spacing w:after="60" w:line="276" w:lineRule="auto"/>
-        <w:jc w:val="right"/>
-        <w:bidi w:val="1"/>
-      </w:pPr>
-      <w:r>
-        <w:rPr>
-          <w:rFonts w:ascii="Arial" w:hAnsi="Arial"/>
-          <w:b/>
-          <w:color w:val="5F7D68"/>
-          <w:sz w:val="24"/>
-        </w:rPr>
-        <w:t>ב. אימון פילאטיס פרטי 1 על 1</w:t>
-      </w:r>
-    </w:p>
-    <w:p>
-      <w:pPr>
-        <w:spacing w:after="140" w:line="276" w:lineRule="auto"/>
-        <w:jc w:val="right"/>
-        <w:bidi w:val="1"/>
-      </w:pPr>
-      <w:r>
-        <w:rPr>
-          <w:rFonts w:ascii="Arial" w:hAnsi="Arial"/>
-          <w:b w:val="0"/>
-          <w:color w:val="1F2A24"/>
-          <w:sz w:val="21"/>
-        </w:rPr>
-        <w:t>מסלול אישי שבו תוכן האימון, הקצב והתרגילים נבנים סביב המטרות והצרכים של המתאמן. האימון מתאים למי שמעדיף ליווי צמוד, למי שחוזר לפעילות לאחר הפסקה או פציעה, ולמי שמעוניין בתוכנית גמישה וממוקדת יותר.</w:t>
-      </w:r>
-    </w:p>
-    <w:p>
-      <w:pPr>
-        <w:spacing w:before="300" w:after="140"/>
-        <w:jc w:val="right"/>
-        <w:bidi w:val="1"/>
-      </w:pPr>
-      <w:r>
-        <w:rPr>
-          <w:rFonts w:ascii="Arial" w:hAnsi="Arial"/>
-          <w:b/>
-          <w:color w:val="5F7D68"/>
-          <w:sz w:val="36"/>
-        </w:rPr>
-        <w:t>3. דפי הנחיתה</w:t>
+        <w:t>כתובות דפי הנחיתה</w:t>
       </w:r>
     </w:p>
     <w:tbl>
@@ -673,26 +587,21 @@
         <w:tblLook w:firstColumn="1" w:firstRow="1" w:lastColumn="0" w:lastRow="0" w:noHBand="0" w:noVBand="1" w:val="04A0"/>
       </w:tblPr>
       <w:tblGrid>
-        <w:gridCol w:w="5112"/>
-        <w:gridCol w:w="5112"/>
+        <w:gridCol w:w="5040"/>
+        <w:gridCol w:w="5040"/>
       </w:tblGrid>
       <w:tr>
         <w:tc>
           <w:tcPr>
-            <w:tcW w:type="dxa" w:w="5112"/>
+            <w:tcW w:type="dxa" w:w="5040"/>
             <w:shd w:fill="5F7D68"/>
             <w:vAlign w:val="center"/>
-            <w:tcBorders>
-              <w:top w:val="single" w:sz="5" w:color="D8D1C3"/>
-              <w:left w:val="single" w:sz="5" w:color="D8D1C3"/>
-              <w:bottom w:val="single" w:sz="5" w:color="D8D1C3"/>
-              <w:right w:val="single" w:sz="5" w:color="D8D1C3"/>
-            </w:tcBorders>
           </w:tcPr>
           <w:p>
             <w:pPr>
-              <w:spacing w:after="40"/>
+              <w:spacing w:after="0"/>
               <w:jc w:val="right"/>
+              <w:bidi w:val="1"/>
             </w:pPr>
             <w:r/>
             <w:r>
@@ -708,20 +617,15 @@
         </w:tc>
         <w:tc>
           <w:tcPr>
-            <w:tcW w:type="dxa" w:w="5112"/>
+            <w:tcW w:type="dxa" w:w="5040"/>
             <w:shd w:fill="5F7D68"/>
             <w:vAlign w:val="center"/>
-            <w:tcBorders>
-              <w:top w:val="single" w:sz="5" w:color="D8D1C3"/>
-              <w:left w:val="single" w:sz="5" w:color="D8D1C3"/>
-              <w:bottom w:val="single" w:sz="5" w:color="D8D1C3"/>
-              <w:right w:val="single" w:sz="5" w:color="D8D1C3"/>
-            </w:tcBorders>
           </w:tcPr>
           <w:p>
             <w:pPr>
-              <w:spacing w:after="40"/>
+              <w:spacing w:after="0"/>
               <w:jc w:val="right"/>
+              <w:bidi w:val="1"/>
             </w:pPr>
             <w:r/>
             <w:r>
@@ -739,20 +643,15 @@
       <w:tr>
         <w:tc>
           <w:tcPr>
-            <w:tcW w:type="dxa" w:w="5112"/>
+            <w:tcW w:type="dxa" w:w="5040"/>
             <w:shd w:fill="F8F3EA"/>
             <w:vAlign w:val="center"/>
-            <w:tcBorders>
-              <w:top w:val="single" w:sz="5" w:color="D8D1C3"/>
-              <w:left w:val="single" w:sz="5" w:color="D8D1C3"/>
-              <w:bottom w:val="single" w:sz="5" w:color="D8D1C3"/>
-              <w:right w:val="single" w:sz="5" w:color="D8D1C3"/>
-            </w:tcBorders>
           </w:tcPr>
           <w:p>
             <w:pPr>
-              <w:spacing w:after="40"/>
+              <w:spacing w:after="0"/>
               <w:jc w:val="right"/>
+              <w:bidi w:val="1"/>
             </w:pPr>
             <w:r/>
             <w:r>
@@ -760,7 +659,7 @@
                 <w:rFonts w:ascii="Arial" w:hAnsi="Arial"/>
                 <w:b w:val="0"/>
                 <w:color w:val="1F2A24"/>
-                <w:sz w:val="20"/>
+                <w:sz w:val="21"/>
               </w:rPr>
               <w:t>דף הבית</w:t>
             </w:r>
@@ -768,20 +667,15 @@
         </w:tc>
         <w:tc>
           <w:tcPr>
-            <w:tcW w:type="dxa" w:w="5112"/>
+            <w:tcW w:type="dxa" w:w="5040"/>
             <w:shd w:fill="F8F3EA"/>
             <w:vAlign w:val="center"/>
-            <w:tcBorders>
-              <w:top w:val="single" w:sz="5" w:color="D8D1C3"/>
-              <w:left w:val="single" w:sz="5" w:color="D8D1C3"/>
-              <w:bottom w:val="single" w:sz="5" w:color="D8D1C3"/>
-              <w:right w:val="single" w:sz="5" w:color="D8D1C3"/>
-            </w:tcBorders>
           </w:tcPr>
           <w:p>
             <w:pPr>
-              <w:spacing w:after="40"/>
+              <w:spacing w:after="0"/>
               <w:jc w:val="right"/>
+              <w:bidi w:val="1"/>
             </w:pPr>
             <w:r/>
             <w:r>
@@ -789,7 +683,7 @@
                 <w:rFonts w:ascii="Arial" w:hAnsi="Arial"/>
                 <w:b w:val="0"/>
                 <w:color w:val="1F2A24"/>
-                <w:sz w:val="20"/>
+                <w:sz w:val="21"/>
               </w:rPr>
               <w:t>https://avitheuser1-ship-it.github.io/pilates-landing/</w:t>
             </w:r>
@@ -799,20 +693,15 @@
       <w:tr>
         <w:tc>
           <w:tcPr>
-            <w:tcW w:type="dxa" w:w="5112"/>
+            <w:tcW w:type="dxa" w:w="5040"/>
             <w:shd w:fill="FFFFFF"/>
             <w:vAlign w:val="center"/>
-            <w:tcBorders>
-              <w:top w:val="single" w:sz="5" w:color="D8D1C3"/>
-              <w:left w:val="single" w:sz="5" w:color="D8D1C3"/>
-              <w:bottom w:val="single" w:sz="5" w:color="D8D1C3"/>
-              <w:right w:val="single" w:sz="5" w:color="D8D1C3"/>
-            </w:tcBorders>
           </w:tcPr>
           <w:p>
             <w:pPr>
-              <w:spacing w:after="40"/>
+              <w:spacing w:after="0"/>
               <w:jc w:val="right"/>
+              <w:bidi w:val="1"/>
             </w:pPr>
             <w:r/>
             <w:r>
@@ -820,7 +709,7 @@
                 <w:rFonts w:ascii="Arial" w:hAnsi="Arial"/>
                 <w:b w:val="0"/>
                 <w:color w:val="1F2A24"/>
-                <w:sz w:val="20"/>
+                <w:sz w:val="21"/>
               </w:rPr>
               <w:t>פילאטיס מכשירים / רפורמר</w:t>
             </w:r>
@@ -828,20 +717,15 @@
         </w:tc>
         <w:tc>
           <w:tcPr>
-            <w:tcW w:type="dxa" w:w="5112"/>
+            <w:tcW w:type="dxa" w:w="5040"/>
             <w:shd w:fill="FFFFFF"/>
             <w:vAlign w:val="center"/>
-            <w:tcBorders>
-              <w:top w:val="single" w:sz="5" w:color="D8D1C3"/>
-              <w:left w:val="single" w:sz="5" w:color="D8D1C3"/>
-              <w:bottom w:val="single" w:sz="5" w:color="D8D1C3"/>
-              <w:right w:val="single" w:sz="5" w:color="D8D1C3"/>
-            </w:tcBorders>
           </w:tcPr>
           <w:p>
             <w:pPr>
-              <w:spacing w:after="40"/>
+              <w:spacing w:after="0"/>
               <w:jc w:val="right"/>
+              <w:bidi w:val="1"/>
             </w:pPr>
             <w:r/>
             <w:r>
@@ -849,7 +733,7 @@
                 <w:rFonts w:ascii="Arial" w:hAnsi="Arial"/>
                 <w:b w:val="0"/>
                 <w:color w:val="1F2A24"/>
-                <w:sz w:val="20"/>
+                <w:sz w:val="21"/>
               </w:rPr>
               <w:t>https://avitheuser1-ship-it.github.io/pilates-landing/product1.html</w:t>
             </w:r>
@@ -859,20 +743,15 @@
       <w:tr>
         <w:tc>
           <w:tcPr>
-            <w:tcW w:type="dxa" w:w="5112"/>
+            <w:tcW w:type="dxa" w:w="5040"/>
             <w:shd w:fill="F8F3EA"/>
             <w:vAlign w:val="center"/>
-            <w:tcBorders>
-              <w:top w:val="single" w:sz="5" w:color="D8D1C3"/>
-              <w:left w:val="single" w:sz="5" w:color="D8D1C3"/>
-              <w:bottom w:val="single" w:sz="5" w:color="D8D1C3"/>
-              <w:right w:val="single" w:sz="5" w:color="D8D1C3"/>
-            </w:tcBorders>
           </w:tcPr>
           <w:p>
             <w:pPr>
-              <w:spacing w:after="40"/>
+              <w:spacing w:after="0"/>
               <w:jc w:val="right"/>
+              <w:bidi w:val="1"/>
             </w:pPr>
             <w:r/>
             <w:r>
@@ -880,7 +759,7 @@
                 <w:rFonts w:ascii="Arial" w:hAnsi="Arial"/>
                 <w:b w:val="0"/>
                 <w:color w:val="1F2A24"/>
-                <w:sz w:val="20"/>
+                <w:sz w:val="21"/>
               </w:rPr>
               <w:t>חוג פילאטיס רצפה</w:t>
             </w:r>
@@ -888,20 +767,15 @@
         </w:tc>
         <w:tc>
           <w:tcPr>
-            <w:tcW w:type="dxa" w:w="5112"/>
+            <w:tcW w:type="dxa" w:w="5040"/>
             <w:shd w:fill="F8F3EA"/>
             <w:vAlign w:val="center"/>
-            <w:tcBorders>
-              <w:top w:val="single" w:sz="5" w:color="D8D1C3"/>
-              <w:left w:val="single" w:sz="5" w:color="D8D1C3"/>
-              <w:bottom w:val="single" w:sz="5" w:color="D8D1C3"/>
-              <w:right w:val="single" w:sz="5" w:color="D8D1C3"/>
-            </w:tcBorders>
           </w:tcPr>
           <w:p>
             <w:pPr>
-              <w:spacing w:after="40"/>
+              <w:spacing w:after="0"/>
               <w:jc w:val="right"/>
+              <w:bidi w:val="1"/>
             </w:pPr>
             <w:r/>
             <w:r>
@@ -909,7 +783,7 @@
                 <w:rFonts w:ascii="Arial" w:hAnsi="Arial"/>
                 <w:b w:val="0"/>
                 <w:color w:val="1F2A24"/>
-                <w:sz w:val="20"/>
+                <w:sz w:val="21"/>
               </w:rPr>
               <w:t>https://avitheuser1-ship-it.github.io/pilates-landing/product2.html</w:t>
             </w:r>
@@ -919,20 +793,15 @@
       <w:tr>
         <w:tc>
           <w:tcPr>
-            <w:tcW w:type="dxa" w:w="5112"/>
+            <w:tcW w:type="dxa" w:w="5040"/>
             <w:shd w:fill="FFFFFF"/>
             <w:vAlign w:val="center"/>
-            <w:tcBorders>
-              <w:top w:val="single" w:sz="5" w:color="D8D1C3"/>
-              <w:left w:val="single" w:sz="5" w:color="D8D1C3"/>
-              <w:bottom w:val="single" w:sz="5" w:color="D8D1C3"/>
-              <w:right w:val="single" w:sz="5" w:color="D8D1C3"/>
-            </w:tcBorders>
           </w:tcPr>
           <w:p>
             <w:pPr>
-              <w:spacing w:after="40"/>
+              <w:spacing w:after="0"/>
               <w:jc w:val="right"/>
+              <w:bidi w:val="1"/>
             </w:pPr>
             <w:r/>
             <w:r>
@@ -940,7 +809,7 @@
                 <w:rFonts w:ascii="Arial" w:hAnsi="Arial"/>
                 <w:b w:val="0"/>
                 <w:color w:val="1F2A24"/>
-                <w:sz w:val="20"/>
+                <w:sz w:val="21"/>
               </w:rPr>
               <w:t>אימון פרטי 1 על 1</w:t>
             </w:r>
@@ -948,20 +817,15 @@
         </w:tc>
         <w:tc>
           <w:tcPr>
-            <w:tcW w:type="dxa" w:w="5112"/>
+            <w:tcW w:type="dxa" w:w="5040"/>
             <w:shd w:fill="FFFFFF"/>
             <w:vAlign w:val="center"/>
-            <w:tcBorders>
-              <w:top w:val="single" w:sz="5" w:color="D8D1C3"/>
-              <w:left w:val="single" w:sz="5" w:color="D8D1C3"/>
-              <w:bottom w:val="single" w:sz="5" w:color="D8D1C3"/>
-              <w:right w:val="single" w:sz="5" w:color="D8D1C3"/>
-            </w:tcBorders>
           </w:tcPr>
           <w:p>
             <w:pPr>
-              <w:spacing w:after="40"/>
+              <w:spacing w:after="0"/>
               <w:jc w:val="right"/>
+              <w:bidi w:val="1"/>
             </w:pPr>
             <w:r/>
             <w:r>
@@ -969,7 +833,7 @@
                 <w:rFonts w:ascii="Arial" w:hAnsi="Arial"/>
                 <w:b w:val="0"/>
                 <w:color w:val="1F2A24"/>
-                <w:sz w:val="20"/>
+                <w:sz w:val="21"/>
               </w:rPr>
               <w:t>https://avitheuser1-ship-it.github.io/pilates-landing/product3.html</w:t>
             </w:r>
@@ -979,20 +843,15 @@
       <w:tr>
         <w:tc>
           <w:tcPr>
-            <w:tcW w:type="dxa" w:w="5112"/>
+            <w:tcW w:type="dxa" w:w="5040"/>
             <w:shd w:fill="F8F3EA"/>
             <w:vAlign w:val="center"/>
-            <w:tcBorders>
-              <w:top w:val="single" w:sz="5" w:color="D8D1C3"/>
-              <w:left w:val="single" w:sz="5" w:color="D8D1C3"/>
-              <w:bottom w:val="single" w:sz="5" w:color="D8D1C3"/>
-              <w:right w:val="single" w:sz="5" w:color="D8D1C3"/>
-            </w:tcBorders>
           </w:tcPr>
           <w:p>
             <w:pPr>
-              <w:spacing w:after="40"/>
+              <w:spacing w:after="0"/>
               <w:jc w:val="right"/>
+              <w:bidi w:val="1"/>
             </w:pPr>
             <w:r/>
             <w:r>
@@ -1000,7 +859,7 @@
                 <w:rFonts w:ascii="Arial" w:hAnsi="Arial"/>
                 <w:b w:val="0"/>
                 <w:color w:val="1F2A24"/>
-                <w:sz w:val="20"/>
+                <w:sz w:val="21"/>
               </w:rPr>
               <w:t>דף תודה</w:t>
             </w:r>
@@ -1008,20 +867,15 @@
         </w:tc>
         <w:tc>
           <w:tcPr>
-            <w:tcW w:type="dxa" w:w="5112"/>
+            <w:tcW w:type="dxa" w:w="5040"/>
             <w:shd w:fill="F8F3EA"/>
             <w:vAlign w:val="center"/>
-            <w:tcBorders>
-              <w:top w:val="single" w:sz="5" w:color="D8D1C3"/>
-              <w:left w:val="single" w:sz="5" w:color="D8D1C3"/>
-              <w:bottom w:val="single" w:sz="5" w:color="D8D1C3"/>
-              <w:right w:val="single" w:sz="5" w:color="D8D1C3"/>
-            </w:tcBorders>
           </w:tcPr>
           <w:p>
             <w:pPr>
-              <w:spacing w:after="40"/>
+              <w:spacing w:after="0"/>
               <w:jc w:val="right"/>
+              <w:bidi w:val="1"/>
             </w:pPr>
             <w:r/>
             <w:r>
@@ -1029,7 +883,7 @@
                 <w:rFonts w:ascii="Arial" w:hAnsi="Arial"/>
                 <w:b w:val="0"/>
                 <w:color w:val="1F2A24"/>
-                <w:sz w:val="20"/>
+                <w:sz w:val="21"/>
               </w:rPr>
               <w:t>https://avitheuser1-ship-it.github.io/pilates-landing/thank-you.html</w:t>
             </w:r>
@@ -1039,28 +893,7 @@
     </w:tbl>
     <w:p>
       <w:pPr>
-        <w:spacing w:after="140" w:line="276" w:lineRule="auto"/>
-        <w:jc w:val="right"/>
-        <w:bidi w:val="1"/>
-      </w:pPr>
-      <w:r>
-        <w:rPr>
-          <w:rFonts w:ascii="Arial" w:hAnsi="Arial"/>
-          <w:b w:val="0"/>
-          <w:color w:val="6F706A"/>
-          <w:sz w:val="21"/>
-        </w:rPr>
-        <w:t>האתר אינו כולל תפריט ניווט, טלפון או הפניות לרשתות חברתיות. בדפים משולב הלוגו של LUMERA, והטופס מוביל לדף תודה לאחר שליחה.</w:t>
-      </w:r>
-    </w:p>
-    <w:p>
-      <w:r>
-        <w:br w:type="page"/>
-      </w:r>
-    </w:p>
-    <w:p>
-      <w:pPr>
-        <w:spacing w:before="300" w:after="140"/>
+        <w:spacing w:after="140" w:line="276" w:lineRule="auto" w:before="280"/>
         <w:jc w:val="right"/>
         <w:bidi w:val="1"/>
       </w:pPr>
@@ -1069,1688 +902,14 @@
           <w:rFonts w:ascii="Arial" w:hAnsi="Arial"/>
           <w:b/>
           <w:color w:val="5F7D68"/>
-          <w:sz w:val="36"/>
+          <w:sz w:val="34"/>
         </w:rPr>
-        <w:t>4. מבנה חשבון Google Ads</w:t>
-      </w:r>
-    </w:p>
-    <w:tbl>
-      <w:tblPr>
-        <w:tblStyle w:val="TableGrid"/>
-        <w:tblW w:type="auto" w:w="0"/>
-        <w:jc w:val="center"/>
-        <w:tblLook w:firstColumn="1" w:firstRow="1" w:lastColumn="0" w:lastRow="0" w:noHBand="0" w:noVBand="1" w:val="04A0"/>
-      </w:tblPr>
-      <w:tblGrid>
-        <w:gridCol w:w="2556"/>
-        <w:gridCol w:w="2556"/>
-        <w:gridCol w:w="2556"/>
-        <w:gridCol w:w="2556"/>
-      </w:tblGrid>
-      <w:tr>
-        <w:tc>
-          <w:tcPr>
-            <w:tcW w:type="dxa" w:w="2556"/>
-            <w:shd w:fill="5F7D68"/>
-            <w:vAlign w:val="center"/>
-            <w:tcBorders>
-              <w:top w:val="single" w:sz="5" w:color="D8D1C3"/>
-              <w:left w:val="single" w:sz="5" w:color="D8D1C3"/>
-              <w:bottom w:val="single" w:sz="5" w:color="D8D1C3"/>
-              <w:right w:val="single" w:sz="5" w:color="D8D1C3"/>
-            </w:tcBorders>
-          </w:tcPr>
-          <w:p>
-            <w:pPr>
-              <w:spacing w:after="40"/>
-              <w:jc w:val="right"/>
-            </w:pPr>
-            <w:r/>
-            <w:r>
-              <w:rPr>
-                <w:rFonts w:ascii="Arial" w:hAnsi="Arial"/>
-                <w:b/>
-                <w:color w:val="FFFFFF"/>
-                <w:sz w:val="21"/>
-              </w:rPr>
-              <w:t>קמפיין</w:t>
-            </w:r>
-          </w:p>
-        </w:tc>
-        <w:tc>
-          <w:tcPr>
-            <w:tcW w:type="dxa" w:w="2556"/>
-            <w:shd w:fill="5F7D68"/>
-            <w:vAlign w:val="center"/>
-            <w:tcBorders>
-              <w:top w:val="single" w:sz="5" w:color="D8D1C3"/>
-              <w:left w:val="single" w:sz="5" w:color="D8D1C3"/>
-              <w:bottom w:val="single" w:sz="5" w:color="D8D1C3"/>
-              <w:right w:val="single" w:sz="5" w:color="D8D1C3"/>
-            </w:tcBorders>
-          </w:tcPr>
-          <w:p>
-            <w:pPr>
-              <w:spacing w:after="40"/>
-              <w:jc w:val="right"/>
-            </w:pPr>
-            <w:r/>
-            <w:r>
-              <w:rPr>
-                <w:rFonts w:ascii="Arial" w:hAnsi="Arial"/>
-                <w:b/>
-                <w:color w:val="FFFFFF"/>
-                <w:sz w:val="21"/>
-              </w:rPr>
-              <w:t>סוג</w:t>
-            </w:r>
-          </w:p>
-        </w:tc>
-        <w:tc>
-          <w:tcPr>
-            <w:tcW w:type="dxa" w:w="2556"/>
-            <w:shd w:fill="5F7D68"/>
-            <w:vAlign w:val="center"/>
-            <w:tcBorders>
-              <w:top w:val="single" w:sz="5" w:color="D8D1C3"/>
-              <w:left w:val="single" w:sz="5" w:color="D8D1C3"/>
-              <w:bottom w:val="single" w:sz="5" w:color="D8D1C3"/>
-              <w:right w:val="single" w:sz="5" w:color="D8D1C3"/>
-            </w:tcBorders>
-          </w:tcPr>
-          <w:p>
-            <w:pPr>
-              <w:spacing w:after="40"/>
-              <w:jc w:val="right"/>
-            </w:pPr>
-            <w:r/>
-            <w:r>
-              <w:rPr>
-                <w:rFonts w:ascii="Arial" w:hAnsi="Arial"/>
-                <w:b/>
-                <w:color w:val="FFFFFF"/>
-                <w:sz w:val="21"/>
-              </w:rPr>
-              <w:t>תקציב יומי</w:t>
-            </w:r>
-          </w:p>
-        </w:tc>
-        <w:tc>
-          <w:tcPr>
-            <w:tcW w:type="dxa" w:w="2556"/>
-            <w:shd w:fill="5F7D68"/>
-            <w:vAlign w:val="center"/>
-            <w:tcBorders>
-              <w:top w:val="single" w:sz="5" w:color="D8D1C3"/>
-              <w:left w:val="single" w:sz="5" w:color="D8D1C3"/>
-              <w:bottom w:val="single" w:sz="5" w:color="D8D1C3"/>
-              <w:right w:val="single" w:sz="5" w:color="D8D1C3"/>
-            </w:tcBorders>
-          </w:tcPr>
-          <w:p>
-            <w:pPr>
-              <w:spacing w:after="40"/>
-              <w:jc w:val="right"/>
-            </w:pPr>
-            <w:r/>
-            <w:r>
-              <w:rPr>
-                <w:rFonts w:ascii="Arial" w:hAnsi="Arial"/>
-                <w:b/>
-                <w:color w:val="FFFFFF"/>
-                <w:sz w:val="21"/>
-              </w:rPr>
-              <w:t>סטטוס</w:t>
-            </w:r>
-          </w:p>
-        </w:tc>
-      </w:tr>
-      <w:tr>
-        <w:tc>
-          <w:tcPr>
-            <w:tcW w:type="dxa" w:w="2556"/>
-            <w:shd w:fill="F8F3EA"/>
-            <w:vAlign w:val="center"/>
-            <w:tcBorders>
-              <w:top w:val="single" w:sz="5" w:color="D8D1C3"/>
-              <w:left w:val="single" w:sz="5" w:color="D8D1C3"/>
-              <w:bottom w:val="single" w:sz="5" w:color="D8D1C3"/>
-              <w:right w:val="single" w:sz="5" w:color="D8D1C3"/>
-            </w:tcBorders>
-          </w:tcPr>
-          <w:p>
-            <w:pPr>
-              <w:spacing w:after="40"/>
-              <w:jc w:val="right"/>
-            </w:pPr>
-            <w:r/>
-            <w:r>
-              <w:rPr>
-                <w:rFonts w:ascii="Arial" w:hAnsi="Arial"/>
-                <w:b w:val="0"/>
-                <w:color w:val="1F2A24"/>
-                <w:sz w:val="20"/>
-              </w:rPr>
-              <w:t>קמפיין חיפוש</w:t>
-            </w:r>
-          </w:p>
-        </w:tc>
-        <w:tc>
-          <w:tcPr>
-            <w:tcW w:type="dxa" w:w="2556"/>
-            <w:shd w:fill="F8F3EA"/>
-            <w:vAlign w:val="center"/>
-            <w:tcBorders>
-              <w:top w:val="single" w:sz="5" w:color="D8D1C3"/>
-              <w:left w:val="single" w:sz="5" w:color="D8D1C3"/>
-              <w:bottom w:val="single" w:sz="5" w:color="D8D1C3"/>
-              <w:right w:val="single" w:sz="5" w:color="D8D1C3"/>
-            </w:tcBorders>
-          </w:tcPr>
-          <w:p>
-            <w:pPr>
-              <w:spacing w:after="40"/>
-              <w:jc w:val="right"/>
-            </w:pPr>
-            <w:r/>
-            <w:r>
-              <w:rPr>
-                <w:rFonts w:ascii="Arial" w:hAnsi="Arial"/>
-                <w:b w:val="0"/>
-                <w:color w:val="1F2A24"/>
-                <w:sz w:val="20"/>
-              </w:rPr>
-              <w:t>Search</w:t>
-            </w:r>
-          </w:p>
-        </w:tc>
-        <w:tc>
-          <w:tcPr>
-            <w:tcW w:type="dxa" w:w="2556"/>
-            <w:shd w:fill="F8F3EA"/>
-            <w:vAlign w:val="center"/>
-            <w:tcBorders>
-              <w:top w:val="single" w:sz="5" w:color="D8D1C3"/>
-              <w:left w:val="single" w:sz="5" w:color="D8D1C3"/>
-              <w:bottom w:val="single" w:sz="5" w:color="D8D1C3"/>
-              <w:right w:val="single" w:sz="5" w:color="D8D1C3"/>
-            </w:tcBorders>
-          </w:tcPr>
-          <w:p>
-            <w:pPr>
-              <w:spacing w:after="40"/>
-              <w:jc w:val="right"/>
-            </w:pPr>
-            <w:r/>
-            <w:r>
-              <w:rPr>
-                <w:rFonts w:ascii="Arial" w:hAnsi="Arial"/>
-                <w:b w:val="0"/>
-                <w:color w:val="1F2A24"/>
-                <w:sz w:val="20"/>
-              </w:rPr>
-              <w:t>30 ₪</w:t>
-            </w:r>
-          </w:p>
-        </w:tc>
-        <w:tc>
-          <w:tcPr>
-            <w:tcW w:type="dxa" w:w="2556"/>
-            <w:shd w:fill="F8F3EA"/>
-            <w:vAlign w:val="center"/>
-            <w:tcBorders>
-              <w:top w:val="single" w:sz="5" w:color="D8D1C3"/>
-              <w:left w:val="single" w:sz="5" w:color="D8D1C3"/>
-              <w:bottom w:val="single" w:sz="5" w:color="D8D1C3"/>
-              <w:right w:val="single" w:sz="5" w:color="D8D1C3"/>
-            </w:tcBorders>
-          </w:tcPr>
-          <w:p>
-            <w:pPr>
-              <w:spacing w:after="40"/>
-              <w:jc w:val="right"/>
-            </w:pPr>
-            <w:r/>
-            <w:r>
-              <w:rPr>
-                <w:rFonts w:ascii="Arial" w:hAnsi="Arial"/>
-                <w:b w:val="0"/>
-                <w:color w:val="1F2A24"/>
-                <w:sz w:val="20"/>
-              </w:rPr>
-              <w:t>מושהה</w:t>
-            </w:r>
-          </w:p>
-        </w:tc>
-      </w:tr>
-      <w:tr>
-        <w:tc>
-          <w:tcPr>
-            <w:tcW w:type="dxa" w:w="2556"/>
-            <w:shd w:fill="FFFFFF"/>
-            <w:vAlign w:val="center"/>
-            <w:tcBorders>
-              <w:top w:val="single" w:sz="5" w:color="D8D1C3"/>
-              <w:left w:val="single" w:sz="5" w:color="D8D1C3"/>
-              <w:bottom w:val="single" w:sz="5" w:color="D8D1C3"/>
-              <w:right w:val="single" w:sz="5" w:color="D8D1C3"/>
-            </w:tcBorders>
-          </w:tcPr>
-          <w:p>
-            <w:pPr>
-              <w:spacing w:after="40"/>
-              <w:jc w:val="right"/>
-            </w:pPr>
-            <w:r/>
-            <w:r>
-              <w:rPr>
-                <w:rFonts w:ascii="Arial" w:hAnsi="Arial"/>
-                <w:b w:val="0"/>
-                <w:color w:val="1F2A24"/>
-                <w:sz w:val="20"/>
-              </w:rPr>
-              <w:t>קמפיין מותג</w:t>
-            </w:r>
-          </w:p>
-        </w:tc>
-        <w:tc>
-          <w:tcPr>
-            <w:tcW w:type="dxa" w:w="2556"/>
-            <w:shd w:fill="FFFFFF"/>
-            <w:vAlign w:val="center"/>
-            <w:tcBorders>
-              <w:top w:val="single" w:sz="5" w:color="D8D1C3"/>
-              <w:left w:val="single" w:sz="5" w:color="D8D1C3"/>
-              <w:bottom w:val="single" w:sz="5" w:color="D8D1C3"/>
-              <w:right w:val="single" w:sz="5" w:color="D8D1C3"/>
-            </w:tcBorders>
-          </w:tcPr>
-          <w:p>
-            <w:pPr>
-              <w:spacing w:after="40"/>
-              <w:jc w:val="right"/>
-            </w:pPr>
-            <w:r/>
-            <w:r>
-              <w:rPr>
-                <w:rFonts w:ascii="Arial" w:hAnsi="Arial"/>
-                <w:b w:val="0"/>
-                <w:color w:val="1F2A24"/>
-                <w:sz w:val="20"/>
-              </w:rPr>
-              <w:t>Search</w:t>
-            </w:r>
-          </w:p>
-        </w:tc>
-        <w:tc>
-          <w:tcPr>
-            <w:tcW w:type="dxa" w:w="2556"/>
-            <w:shd w:fill="FFFFFF"/>
-            <w:vAlign w:val="center"/>
-            <w:tcBorders>
-              <w:top w:val="single" w:sz="5" w:color="D8D1C3"/>
-              <w:left w:val="single" w:sz="5" w:color="D8D1C3"/>
-              <w:bottom w:val="single" w:sz="5" w:color="D8D1C3"/>
-              <w:right w:val="single" w:sz="5" w:color="D8D1C3"/>
-            </w:tcBorders>
-          </w:tcPr>
-          <w:p>
-            <w:pPr>
-              <w:spacing w:after="40"/>
-              <w:jc w:val="right"/>
-            </w:pPr>
-            <w:r/>
-            <w:r>
-              <w:rPr>
-                <w:rFonts w:ascii="Arial" w:hAnsi="Arial"/>
-                <w:b w:val="0"/>
-                <w:color w:val="1F2A24"/>
-                <w:sz w:val="20"/>
-              </w:rPr>
-              <w:t>50 ₪</w:t>
-            </w:r>
-          </w:p>
-        </w:tc>
-        <w:tc>
-          <w:tcPr>
-            <w:tcW w:type="dxa" w:w="2556"/>
-            <w:shd w:fill="FFFFFF"/>
-            <w:vAlign w:val="center"/>
-            <w:tcBorders>
-              <w:top w:val="single" w:sz="5" w:color="D8D1C3"/>
-              <w:left w:val="single" w:sz="5" w:color="D8D1C3"/>
-              <w:bottom w:val="single" w:sz="5" w:color="D8D1C3"/>
-              <w:right w:val="single" w:sz="5" w:color="D8D1C3"/>
-            </w:tcBorders>
-          </w:tcPr>
-          <w:p>
-            <w:pPr>
-              <w:spacing w:after="40"/>
-              <w:jc w:val="right"/>
-            </w:pPr>
-            <w:r/>
-            <w:r>
-              <w:rPr>
-                <w:rFonts w:ascii="Arial" w:hAnsi="Arial"/>
-                <w:b w:val="0"/>
-                <w:color w:val="1F2A24"/>
-                <w:sz w:val="20"/>
-              </w:rPr>
-              <w:t>מושהה</w:t>
-            </w:r>
-          </w:p>
-        </w:tc>
-      </w:tr>
-      <w:tr>
-        <w:tc>
-          <w:tcPr>
-            <w:tcW w:type="dxa" w:w="2556"/>
-            <w:shd w:fill="F8F3EA"/>
-            <w:vAlign w:val="center"/>
-            <w:tcBorders>
-              <w:top w:val="single" w:sz="5" w:color="D8D1C3"/>
-              <w:left w:val="single" w:sz="5" w:color="D8D1C3"/>
-              <w:bottom w:val="single" w:sz="5" w:color="D8D1C3"/>
-              <w:right w:val="single" w:sz="5" w:color="D8D1C3"/>
-            </w:tcBorders>
-          </w:tcPr>
-          <w:p>
-            <w:pPr>
-              <w:spacing w:after="40"/>
-              <w:jc w:val="right"/>
-            </w:pPr>
-            <w:r/>
-            <w:r>
-              <w:rPr>
-                <w:rFonts w:ascii="Arial" w:hAnsi="Arial"/>
-                <w:b w:val="0"/>
-                <w:color w:val="1F2A24"/>
-                <w:sz w:val="20"/>
-              </w:rPr>
-              <w:t>קמפיין GDN</w:t>
-            </w:r>
-          </w:p>
-        </w:tc>
-        <w:tc>
-          <w:tcPr>
-            <w:tcW w:type="dxa" w:w="2556"/>
-            <w:shd w:fill="F8F3EA"/>
-            <w:vAlign w:val="center"/>
-            <w:tcBorders>
-              <w:top w:val="single" w:sz="5" w:color="D8D1C3"/>
-              <w:left w:val="single" w:sz="5" w:color="D8D1C3"/>
-              <w:bottom w:val="single" w:sz="5" w:color="D8D1C3"/>
-              <w:right w:val="single" w:sz="5" w:color="D8D1C3"/>
-            </w:tcBorders>
-          </w:tcPr>
-          <w:p>
-            <w:pPr>
-              <w:spacing w:after="40"/>
-              <w:jc w:val="right"/>
-            </w:pPr>
-            <w:r/>
-            <w:r>
-              <w:rPr>
-                <w:rFonts w:ascii="Arial" w:hAnsi="Arial"/>
-                <w:b w:val="0"/>
-                <w:color w:val="1F2A24"/>
-                <w:sz w:val="20"/>
-              </w:rPr>
-              <w:t>Display</w:t>
-            </w:r>
-          </w:p>
-        </w:tc>
-        <w:tc>
-          <w:tcPr>
-            <w:tcW w:type="dxa" w:w="2556"/>
-            <w:shd w:fill="F8F3EA"/>
-            <w:vAlign w:val="center"/>
-            <w:tcBorders>
-              <w:top w:val="single" w:sz="5" w:color="D8D1C3"/>
-              <w:left w:val="single" w:sz="5" w:color="D8D1C3"/>
-              <w:bottom w:val="single" w:sz="5" w:color="D8D1C3"/>
-              <w:right w:val="single" w:sz="5" w:color="D8D1C3"/>
-            </w:tcBorders>
-          </w:tcPr>
-          <w:p>
-            <w:pPr>
-              <w:spacing w:after="40"/>
-              <w:jc w:val="right"/>
-            </w:pPr>
-            <w:r/>
-            <w:r>
-              <w:rPr>
-                <w:rFonts w:ascii="Arial" w:hAnsi="Arial"/>
-                <w:b w:val="0"/>
-                <w:color w:val="1F2A24"/>
-                <w:sz w:val="20"/>
-              </w:rPr>
-              <w:t>40 ₪</w:t>
-            </w:r>
-          </w:p>
-        </w:tc>
-        <w:tc>
-          <w:tcPr>
-            <w:tcW w:type="dxa" w:w="2556"/>
-            <w:shd w:fill="F8F3EA"/>
-            <w:vAlign w:val="center"/>
-            <w:tcBorders>
-              <w:top w:val="single" w:sz="5" w:color="D8D1C3"/>
-              <w:left w:val="single" w:sz="5" w:color="D8D1C3"/>
-              <w:bottom w:val="single" w:sz="5" w:color="D8D1C3"/>
-              <w:right w:val="single" w:sz="5" w:color="D8D1C3"/>
-            </w:tcBorders>
-          </w:tcPr>
-          <w:p>
-            <w:pPr>
-              <w:spacing w:after="40"/>
-              <w:jc w:val="right"/>
-            </w:pPr>
-            <w:r/>
-            <w:r>
-              <w:rPr>
-                <w:rFonts w:ascii="Arial" w:hAnsi="Arial"/>
-                <w:b w:val="0"/>
-                <w:color w:val="1F2A24"/>
-                <w:sz w:val="20"/>
-              </w:rPr>
-              <w:t>מושהה</w:t>
-            </w:r>
-          </w:p>
-        </w:tc>
-      </w:tr>
-      <w:tr>
-        <w:tc>
-          <w:tcPr>
-            <w:tcW w:type="dxa" w:w="2556"/>
-            <w:shd w:fill="FFFFFF"/>
-            <w:vAlign w:val="center"/>
-            <w:tcBorders>
-              <w:top w:val="single" w:sz="5" w:color="D8D1C3"/>
-              <w:left w:val="single" w:sz="5" w:color="D8D1C3"/>
-              <w:bottom w:val="single" w:sz="5" w:color="D8D1C3"/>
-              <w:right w:val="single" w:sz="5" w:color="D8D1C3"/>
-            </w:tcBorders>
-          </w:tcPr>
-          <w:p>
-            <w:pPr>
-              <w:spacing w:after="40"/>
-              <w:jc w:val="right"/>
-            </w:pPr>
-            <w:r/>
-            <w:r>
-              <w:rPr>
-                <w:rFonts w:ascii="Arial" w:hAnsi="Arial"/>
-                <w:b w:val="0"/>
-                <w:color w:val="1F2A24"/>
-                <w:sz w:val="20"/>
-              </w:rPr>
-              <w:t>קמפיין וידאו</w:t>
-            </w:r>
-          </w:p>
-        </w:tc>
-        <w:tc>
-          <w:tcPr>
-            <w:tcW w:type="dxa" w:w="2556"/>
-            <w:shd w:fill="FFFFFF"/>
-            <w:vAlign w:val="center"/>
-            <w:tcBorders>
-              <w:top w:val="single" w:sz="5" w:color="D8D1C3"/>
-              <w:left w:val="single" w:sz="5" w:color="D8D1C3"/>
-              <w:bottom w:val="single" w:sz="5" w:color="D8D1C3"/>
-              <w:right w:val="single" w:sz="5" w:color="D8D1C3"/>
-            </w:tcBorders>
-          </w:tcPr>
-          <w:p>
-            <w:pPr>
-              <w:spacing w:after="40"/>
-              <w:jc w:val="right"/>
-            </w:pPr>
-            <w:r/>
-            <w:r>
-              <w:rPr>
-                <w:rFonts w:ascii="Arial" w:hAnsi="Arial"/>
-                <w:b w:val="0"/>
-                <w:color w:val="1F2A24"/>
-                <w:sz w:val="20"/>
-              </w:rPr>
-              <w:t>Demand Gen / נכסי וידאו</w:t>
-            </w:r>
-          </w:p>
-        </w:tc>
-        <w:tc>
-          <w:tcPr>
-            <w:tcW w:type="dxa" w:w="2556"/>
-            <w:shd w:fill="FFFFFF"/>
-            <w:vAlign w:val="center"/>
-            <w:tcBorders>
-              <w:top w:val="single" w:sz="5" w:color="D8D1C3"/>
-              <w:left w:val="single" w:sz="5" w:color="D8D1C3"/>
-              <w:bottom w:val="single" w:sz="5" w:color="D8D1C3"/>
-              <w:right w:val="single" w:sz="5" w:color="D8D1C3"/>
-            </w:tcBorders>
-          </w:tcPr>
-          <w:p>
-            <w:pPr>
-              <w:spacing w:after="40"/>
-              <w:jc w:val="right"/>
-            </w:pPr>
-            <w:r/>
-            <w:r>
-              <w:rPr>
-                <w:rFonts w:ascii="Arial" w:hAnsi="Arial"/>
-                <w:b w:val="0"/>
-                <w:color w:val="1F2A24"/>
-                <w:sz w:val="20"/>
-              </w:rPr>
-              <w:t>30 ₪</w:t>
-            </w:r>
-          </w:p>
-        </w:tc>
-        <w:tc>
-          <w:tcPr>
-            <w:tcW w:type="dxa" w:w="2556"/>
-            <w:shd w:fill="FFFFFF"/>
-            <w:vAlign w:val="center"/>
-            <w:tcBorders>
-              <w:top w:val="single" w:sz="5" w:color="D8D1C3"/>
-              <w:left w:val="single" w:sz="5" w:color="D8D1C3"/>
-              <w:bottom w:val="single" w:sz="5" w:color="D8D1C3"/>
-              <w:right w:val="single" w:sz="5" w:color="D8D1C3"/>
-            </w:tcBorders>
-          </w:tcPr>
-          <w:p>
-            <w:pPr>
-              <w:spacing w:after="40"/>
-              <w:jc w:val="right"/>
-            </w:pPr>
-            <w:r/>
-            <w:r>
-              <w:rPr>
-                <w:rFonts w:ascii="Arial" w:hAnsi="Arial"/>
-                <w:b w:val="0"/>
-                <w:color w:val="1F2A24"/>
-                <w:sz w:val="20"/>
-              </w:rPr>
-              <w:t>מושהה</w:t>
-            </w:r>
-          </w:p>
-        </w:tc>
-      </w:tr>
-      <w:tr>
-        <w:tc>
-          <w:tcPr>
-            <w:tcW w:type="dxa" w:w="2556"/>
-            <w:shd w:fill="F8F3EA"/>
-            <w:vAlign w:val="center"/>
-            <w:tcBorders>
-              <w:top w:val="single" w:sz="5" w:color="D8D1C3"/>
-              <w:left w:val="single" w:sz="5" w:color="D8D1C3"/>
-              <w:bottom w:val="single" w:sz="5" w:color="D8D1C3"/>
-              <w:right w:val="single" w:sz="5" w:color="D8D1C3"/>
-            </w:tcBorders>
-          </w:tcPr>
-          <w:p>
-            <w:pPr>
-              <w:spacing w:after="40"/>
-              <w:jc w:val="right"/>
-            </w:pPr>
-            <w:r/>
-            <w:r>
-              <w:rPr>
-                <w:rFonts w:ascii="Arial" w:hAnsi="Arial"/>
-                <w:b w:val="0"/>
-                <w:color w:val="1F2A24"/>
-                <w:sz w:val="20"/>
-              </w:rPr>
-              <w:t>קמפיין התקשרות בלבד</w:t>
-            </w:r>
-          </w:p>
-        </w:tc>
-        <w:tc>
-          <w:tcPr>
-            <w:tcW w:type="dxa" w:w="2556"/>
-            <w:shd w:fill="F8F3EA"/>
-            <w:vAlign w:val="center"/>
-            <w:tcBorders>
-              <w:top w:val="single" w:sz="5" w:color="D8D1C3"/>
-              <w:left w:val="single" w:sz="5" w:color="D8D1C3"/>
-              <w:bottom w:val="single" w:sz="5" w:color="D8D1C3"/>
-              <w:right w:val="single" w:sz="5" w:color="D8D1C3"/>
-            </w:tcBorders>
-          </w:tcPr>
-          <w:p>
-            <w:pPr>
-              <w:spacing w:after="40"/>
-              <w:jc w:val="right"/>
-            </w:pPr>
-            <w:r/>
-            <w:r>
-              <w:rPr>
-                <w:rFonts w:ascii="Arial" w:hAnsi="Arial"/>
-                <w:b w:val="0"/>
-                <w:color w:val="1F2A24"/>
-                <w:sz w:val="20"/>
-              </w:rPr>
-              <w:t>Search</w:t>
-            </w:r>
-          </w:p>
-        </w:tc>
-        <w:tc>
-          <w:tcPr>
-            <w:tcW w:type="dxa" w:w="2556"/>
-            <w:shd w:fill="F8F3EA"/>
-            <w:vAlign w:val="center"/>
-            <w:tcBorders>
-              <w:top w:val="single" w:sz="5" w:color="D8D1C3"/>
-              <w:left w:val="single" w:sz="5" w:color="D8D1C3"/>
-              <w:bottom w:val="single" w:sz="5" w:color="D8D1C3"/>
-              <w:right w:val="single" w:sz="5" w:color="D8D1C3"/>
-            </w:tcBorders>
-          </w:tcPr>
-          <w:p>
-            <w:pPr>
-              <w:spacing w:after="40"/>
-              <w:jc w:val="right"/>
-            </w:pPr>
-            <w:r/>
-            <w:r>
-              <w:rPr>
-                <w:rFonts w:ascii="Arial" w:hAnsi="Arial"/>
-                <w:b w:val="0"/>
-                <w:color w:val="1F2A24"/>
-                <w:sz w:val="20"/>
-              </w:rPr>
-              <w:t>40 ₪</w:t>
-            </w:r>
-          </w:p>
-        </w:tc>
-        <w:tc>
-          <w:tcPr>
-            <w:tcW w:type="dxa" w:w="2556"/>
-            <w:shd w:fill="F8F3EA"/>
-            <w:vAlign w:val="center"/>
-            <w:tcBorders>
-              <w:top w:val="single" w:sz="5" w:color="D8D1C3"/>
-              <w:left w:val="single" w:sz="5" w:color="D8D1C3"/>
-              <w:bottom w:val="single" w:sz="5" w:color="D8D1C3"/>
-              <w:right w:val="single" w:sz="5" w:color="D8D1C3"/>
-            </w:tcBorders>
-          </w:tcPr>
-          <w:p>
-            <w:pPr>
-              <w:spacing w:after="40"/>
-              <w:jc w:val="right"/>
-            </w:pPr>
-            <w:r/>
-            <w:r>
-              <w:rPr>
-                <w:rFonts w:ascii="Arial" w:hAnsi="Arial"/>
-                <w:b w:val="0"/>
-                <w:color w:val="1F2A24"/>
-                <w:sz w:val="20"/>
-              </w:rPr>
-              <w:t>מושהה</w:t>
-            </w:r>
-          </w:p>
-        </w:tc>
-      </w:tr>
-    </w:tbl>
-    <w:p>
-      <w:pPr>
-        <w:spacing w:after="140" w:line="276" w:lineRule="auto"/>
-        <w:jc w:val="right"/>
-        <w:bidi w:val="1"/>
-      </w:pPr>
-      <w:r>
-        <w:rPr>
-          <w:rFonts w:ascii="Arial" w:hAnsi="Arial"/>
-          <w:b w:val="0"/>
-          <w:color w:val="1F2A24"/>
-          <w:sz w:val="21"/>
-        </w:rPr>
-        <w:t>הקמפיינים נבנו במבנה הנדרש למטלה ונשמרו במצב מושהה, כך שלא יפעלו בפועל בזמן ההגשה.</w:t>
+        <w:t>מספר חשבון פרסום בגוגל</w:t>
       </w:r>
     </w:p>
     <w:p>
       <w:pPr>
-        <w:spacing w:before="300" w:after="140"/>
-        <w:jc w:val="right"/>
-        <w:bidi w:val="1"/>
-      </w:pPr>
-      <w:r>
-        <w:rPr>
-          <w:rFonts w:ascii="Arial" w:hAnsi="Arial"/>
-          <w:b/>
-          <w:color w:val="5F7D68"/>
-          <w:sz w:val="36"/>
-        </w:rPr>
-        <w:t>5. קמפיין החיפוש והקמפיין הממותג</w:t>
-      </w:r>
-    </w:p>
-    <w:p>
-      <w:pPr>
-        <w:spacing w:after="140" w:line="276" w:lineRule="auto"/>
-        <w:jc w:val="right"/>
-        <w:bidi w:val="1"/>
-      </w:pPr>
-      <w:r>
-        <w:rPr>
-          <w:rFonts w:ascii="Arial" w:hAnsi="Arial"/>
-          <w:b w:val="0"/>
-          <w:color w:val="1F2A24"/>
-          <w:sz w:val="21"/>
-        </w:rPr>
-        <w:t>בקמפיין החיפוש קיימות שתי קבוצות מודעות, כאשר החלוקה ביניהן מבוססת על צורך או אופן פנייה שונים. נעשה שימוש במילות מפתח בהתאמות מדויקת וביטוי, ללא התאמה רחבה וללא מילות מפתח כלליות בעלות מילה אחת בלבד.</w:t>
-      </w:r>
-    </w:p>
-    <w:p>
-      <w:pPr>
-        <w:spacing w:after="140" w:line="276" w:lineRule="auto"/>
-        <w:jc w:val="right"/>
-        <w:bidi w:val="1"/>
-      </w:pPr>
-      <w:r>
-        <w:rPr>
-          <w:rFonts w:ascii="Arial" w:hAnsi="Arial"/>
-          <w:b w:val="0"/>
-          <w:color w:val="1F2A24"/>
-          <w:sz w:val="21"/>
-        </w:rPr>
-        <w:t>קמפיין המותג מיועד לחיפושים הקשורים ל־LUMERA. במודעות שולבה התאמה דינמית של מילת המפתח (DKI), כדי להתאים את נוסח המודעה לחיפוש המשתמש.</w:t>
-      </w:r>
-    </w:p>
-    <w:p>
-      <w:pPr>
-        <w:spacing w:before="300" w:after="140"/>
-        <w:jc w:val="right"/>
-        <w:bidi w:val="1"/>
-      </w:pPr>
-      <w:r>
-        <w:rPr>
-          <w:rFonts w:ascii="Arial" w:hAnsi="Arial"/>
-          <w:b/>
-          <w:color w:val="5F7D68"/>
-          <w:sz w:val="36"/>
-        </w:rPr>
-        <w:t>6. קהלים ורימרקטינג</w:t>
-      </w:r>
-    </w:p>
-    <w:tbl>
-      <w:tblPr>
-        <w:tblStyle w:val="TableGrid"/>
-        <w:tblW w:type="auto" w:w="0"/>
-        <w:jc w:val="center"/>
-        <w:tblLook w:firstColumn="1" w:firstRow="1" w:lastColumn="0" w:lastRow="0" w:noHBand="0" w:noVBand="1" w:val="04A0"/>
-      </w:tblPr>
-      <w:tblGrid>
-        <w:gridCol w:w="3408"/>
-        <w:gridCol w:w="3408"/>
-        <w:gridCol w:w="3408"/>
-      </w:tblGrid>
-      <w:tr>
-        <w:tc>
-          <w:tcPr>
-            <w:tcW w:type="dxa" w:w="3408"/>
-            <w:shd w:fill="5F7D68"/>
-            <w:vAlign w:val="center"/>
-            <w:tcBorders>
-              <w:top w:val="single" w:sz="5" w:color="D8D1C3"/>
-              <w:left w:val="single" w:sz="5" w:color="D8D1C3"/>
-              <w:bottom w:val="single" w:sz="5" w:color="D8D1C3"/>
-              <w:right w:val="single" w:sz="5" w:color="D8D1C3"/>
-            </w:tcBorders>
-          </w:tcPr>
-          <w:p>
-            <w:pPr>
-              <w:spacing w:after="40"/>
-              <w:jc w:val="right"/>
-            </w:pPr>
-            <w:r/>
-            <w:r>
-              <w:rPr>
-                <w:rFonts w:ascii="Arial" w:hAnsi="Arial"/>
-                <w:b/>
-                <w:color w:val="FFFFFF"/>
-                <w:sz w:val="21"/>
-              </w:rPr>
-              <w:t>שם הקהל</w:t>
-            </w:r>
-          </w:p>
-        </w:tc>
-        <w:tc>
-          <w:tcPr>
-            <w:tcW w:type="dxa" w:w="3408"/>
-            <w:shd w:fill="5F7D68"/>
-            <w:vAlign w:val="center"/>
-            <w:tcBorders>
-              <w:top w:val="single" w:sz="5" w:color="D8D1C3"/>
-              <w:left w:val="single" w:sz="5" w:color="D8D1C3"/>
-              <w:bottom w:val="single" w:sz="5" w:color="D8D1C3"/>
-              <w:right w:val="single" w:sz="5" w:color="D8D1C3"/>
-            </w:tcBorders>
-          </w:tcPr>
-          <w:p>
-            <w:pPr>
-              <w:spacing w:after="40"/>
-              <w:jc w:val="right"/>
-            </w:pPr>
-            <w:r/>
-            <w:r>
-              <w:rPr>
-                <w:rFonts w:ascii="Arial" w:hAnsi="Arial"/>
-                <w:b/>
-                <w:color w:val="FFFFFF"/>
-                <w:sz w:val="21"/>
-              </w:rPr>
-              <w:t>תנאי עיקרי</w:t>
-            </w:r>
-          </w:p>
-        </w:tc>
-        <w:tc>
-          <w:tcPr>
-            <w:tcW w:type="dxa" w:w="3408"/>
-            <w:shd w:fill="5F7D68"/>
-            <w:vAlign w:val="center"/>
-            <w:tcBorders>
-              <w:top w:val="single" w:sz="5" w:color="D8D1C3"/>
-              <w:left w:val="single" w:sz="5" w:color="D8D1C3"/>
-              <w:bottom w:val="single" w:sz="5" w:color="D8D1C3"/>
-              <w:right w:val="single" w:sz="5" w:color="D8D1C3"/>
-            </w:tcBorders>
-          </w:tcPr>
-          <w:p>
-            <w:pPr>
-              <w:spacing w:after="40"/>
-              <w:jc w:val="right"/>
-            </w:pPr>
-            <w:r/>
-            <w:r>
-              <w:rPr>
-                <w:rFonts w:ascii="Arial" w:hAnsi="Arial"/>
-                <w:b/>
-                <w:color w:val="FFFFFF"/>
-                <w:sz w:val="21"/>
-              </w:rPr>
-              <w:t>שימוש</w:t>
-            </w:r>
-          </w:p>
-        </w:tc>
-      </w:tr>
-      <w:tr>
-        <w:tc>
-          <w:tcPr>
-            <w:tcW w:type="dxa" w:w="3408"/>
-            <w:shd w:fill="F8F3EA"/>
-            <w:vAlign w:val="center"/>
-            <w:tcBorders>
-              <w:top w:val="single" w:sz="5" w:color="D8D1C3"/>
-              <w:left w:val="single" w:sz="5" w:color="D8D1C3"/>
-              <w:bottom w:val="single" w:sz="5" w:color="D8D1C3"/>
-              <w:right w:val="single" w:sz="5" w:color="D8D1C3"/>
-            </w:tcBorders>
-          </w:tcPr>
-          <w:p>
-            <w:pPr>
-              <w:spacing w:after="40"/>
-              <w:jc w:val="right"/>
-            </w:pPr>
-            <w:r/>
-            <w:r>
-              <w:rPr>
-                <w:rFonts w:ascii="Arial" w:hAnsi="Arial"/>
-                <w:b w:val="0"/>
-                <w:color w:val="1F2A24"/>
-                <w:sz w:val="20"/>
-              </w:rPr>
-              <w:t>גולשים למוצר הראשון שלא המירו</w:t>
-            </w:r>
-          </w:p>
-        </w:tc>
-        <w:tc>
-          <w:tcPr>
-            <w:tcW w:type="dxa" w:w="3408"/>
-            <w:shd w:fill="F8F3EA"/>
-            <w:vAlign w:val="center"/>
-            <w:tcBorders>
-              <w:top w:val="single" w:sz="5" w:color="D8D1C3"/>
-              <w:left w:val="single" w:sz="5" w:color="D8D1C3"/>
-              <w:bottom w:val="single" w:sz="5" w:color="D8D1C3"/>
-              <w:right w:val="single" w:sz="5" w:color="D8D1C3"/>
-            </w:tcBorders>
-          </w:tcPr>
-          <w:p>
-            <w:pPr>
-              <w:spacing w:after="40"/>
-              <w:jc w:val="right"/>
-            </w:pPr>
-            <w:r/>
-            <w:r>
-              <w:rPr>
-                <w:rFonts w:ascii="Arial" w:hAnsi="Arial"/>
-                <w:b w:val="0"/>
-                <w:color w:val="1F2A24"/>
-                <w:sz w:val="20"/>
-              </w:rPr>
-              <w:t>ביקור ב־product1.html ללא ביקור בדף התודה</w:t>
-            </w:r>
-          </w:p>
-        </w:tc>
-        <w:tc>
-          <w:tcPr>
-            <w:tcW w:type="dxa" w:w="3408"/>
-            <w:shd w:fill="F8F3EA"/>
-            <w:vAlign w:val="center"/>
-            <w:tcBorders>
-              <w:top w:val="single" w:sz="5" w:color="D8D1C3"/>
-              <w:left w:val="single" w:sz="5" w:color="D8D1C3"/>
-              <w:bottom w:val="single" w:sz="5" w:color="D8D1C3"/>
-              <w:right w:val="single" w:sz="5" w:color="D8D1C3"/>
-            </w:tcBorders>
-          </w:tcPr>
-          <w:p>
-            <w:pPr>
-              <w:spacing w:after="40"/>
-              <w:jc w:val="right"/>
-            </w:pPr>
-            <w:r/>
-            <w:r>
-              <w:rPr>
-                <w:rFonts w:ascii="Arial" w:hAnsi="Arial"/>
-                <w:b w:val="0"/>
-                <w:color w:val="1F2A24"/>
-                <w:sz w:val="20"/>
-              </w:rPr>
-              <w:t>קבוצת GDN-לא-המירו</w:t>
-            </w:r>
-          </w:p>
-        </w:tc>
-      </w:tr>
-      <w:tr>
-        <w:tc>
-          <w:tcPr>
-            <w:tcW w:type="dxa" w:w="3408"/>
-            <w:shd w:fill="FFFFFF"/>
-            <w:vAlign w:val="center"/>
-            <w:tcBorders>
-              <w:top w:val="single" w:sz="5" w:color="D8D1C3"/>
-              <w:left w:val="single" w:sz="5" w:color="D8D1C3"/>
-              <w:bottom w:val="single" w:sz="5" w:color="D8D1C3"/>
-              <w:right w:val="single" w:sz="5" w:color="D8D1C3"/>
-            </w:tcBorders>
-          </w:tcPr>
-          <w:p>
-            <w:pPr>
-              <w:spacing w:after="40"/>
-              <w:jc w:val="right"/>
-            </w:pPr>
-            <w:r/>
-            <w:r>
-              <w:rPr>
-                <w:rFonts w:ascii="Arial" w:hAnsi="Arial"/>
-                <w:b w:val="0"/>
-                <w:color w:val="1F2A24"/>
-                <w:sz w:val="20"/>
-              </w:rPr>
-              <w:t>ביצעו המרה למוצר הראשון</w:t>
-            </w:r>
-          </w:p>
-        </w:tc>
-        <w:tc>
-          <w:tcPr>
-            <w:tcW w:type="dxa" w:w="3408"/>
-            <w:shd w:fill="FFFFFF"/>
-            <w:vAlign w:val="center"/>
-            <w:tcBorders>
-              <w:top w:val="single" w:sz="5" w:color="D8D1C3"/>
-              <w:left w:val="single" w:sz="5" w:color="D8D1C3"/>
-              <w:bottom w:val="single" w:sz="5" w:color="D8D1C3"/>
-              <w:right w:val="single" w:sz="5" w:color="D8D1C3"/>
-            </w:tcBorders>
-          </w:tcPr>
-          <w:p>
-            <w:pPr>
-              <w:spacing w:after="40"/>
-              <w:jc w:val="right"/>
-            </w:pPr>
-            <w:r/>
-            <w:r>
-              <w:rPr>
-                <w:rFonts w:ascii="Arial" w:hAnsi="Arial"/>
-                <w:b w:val="0"/>
-                <w:color w:val="1F2A24"/>
-                <w:sz w:val="20"/>
-              </w:rPr>
-              <w:t>ביקור ב־thank-you.html</w:t>
-            </w:r>
-          </w:p>
-        </w:tc>
-        <w:tc>
-          <w:tcPr>
-            <w:tcW w:type="dxa" w:w="3408"/>
-            <w:shd w:fill="FFFFFF"/>
-            <w:vAlign w:val="center"/>
-            <w:tcBorders>
-              <w:top w:val="single" w:sz="5" w:color="D8D1C3"/>
-              <w:left w:val="single" w:sz="5" w:color="D8D1C3"/>
-              <w:bottom w:val="single" w:sz="5" w:color="D8D1C3"/>
-              <w:right w:val="single" w:sz="5" w:color="D8D1C3"/>
-            </w:tcBorders>
-          </w:tcPr>
-          <w:p>
-            <w:pPr>
-              <w:spacing w:after="40"/>
-              <w:jc w:val="right"/>
-            </w:pPr>
-            <w:r/>
-            <w:r>
-              <w:rPr>
-                <w:rFonts w:ascii="Arial" w:hAnsi="Arial"/>
-                <w:b w:val="0"/>
-                <w:color w:val="1F2A24"/>
-                <w:sz w:val="20"/>
-              </w:rPr>
-              <w:t>קבוצת GDN-אפסייל</w:t>
-            </w:r>
-          </w:p>
-        </w:tc>
-      </w:tr>
-    </w:tbl>
-    <w:p>
-      <w:pPr>
-        <w:spacing w:after="140" w:line="276" w:lineRule="auto"/>
-        <w:jc w:val="right"/>
-        <w:bidi w:val="1"/>
-      </w:pPr>
-      <w:r>
-        <w:rPr>
-          <w:rFonts w:ascii="Arial" w:hAnsi="Arial"/>
-          <w:b w:val="0"/>
-          <w:color w:val="1F2A24"/>
-          <w:sz w:val="21"/>
-        </w:rPr>
-        <w:t>הקהל הראשון מיועד לחזרה למשתמשים שביקרו בדף הרפורמר אך לא השלימו טופס. הקהל השני מיועד למשתמשים שהשלימו את הטופס, ולכן ניתן לפנות אליהם בהצעת המשך או אפסייל.</w:t>
-      </w:r>
-    </w:p>
-    <w:p>
-      <w:pPr>
-        <w:spacing w:before="300" w:after="140"/>
-        <w:jc w:val="right"/>
-        <w:bidi w:val="1"/>
-      </w:pPr>
-      <w:r>
-        <w:rPr>
-          <w:rFonts w:ascii="Arial" w:hAnsi="Arial"/>
-          <w:b/>
-          <w:color w:val="5F7D68"/>
-          <w:sz w:val="36"/>
-        </w:rPr>
-        <w:t>7. קמפיין GDN וקמפיין הווידאו</w:t>
-      </w:r>
-    </w:p>
-    <w:p>
-      <w:pPr>
-        <w:spacing w:after="140" w:line="276" w:lineRule="auto"/>
-        <w:jc w:val="right"/>
-        <w:bidi w:val="1"/>
-      </w:pPr>
-      <w:r>
-        <w:rPr>
-          <w:rFonts w:ascii="Arial" w:hAnsi="Arial"/>
-          <w:b w:val="0"/>
-          <w:color w:val="1F2A24"/>
-          <w:sz w:val="21"/>
-        </w:rPr>
-        <w:t>בקמפיין GDN קיימות שתי קבוצות מודעות: קבוצה למבקרים שלא המירו וקבוצה למשתמשים שביצעו המרה. לכל קבוצה הוגדר קהל הרימרקטינג המתאים.</w:t>
-      </w:r>
-    </w:p>
-    <w:p>
-      <w:pPr>
-        <w:spacing w:after="140" w:line="276" w:lineRule="auto"/>
-        <w:jc w:val="right"/>
-        <w:bidi w:val="1"/>
-      </w:pPr>
-      <w:r>
-        <w:rPr>
-          <w:rFonts w:ascii="Arial" w:hAnsi="Arial"/>
-          <w:b w:val="0"/>
-          <w:color w:val="1F2A24"/>
-          <w:sz w:val="21"/>
-        </w:rPr>
-        <w:t>קמפיין הווידאו כולל קבוצת מודעות אחת ושני סרטוני YouTube מתאימים. בממשק החדש של Google Ads הקמפיין מופיע כ־Demand Gen עם נכסי וידאו, ומצב הטירגוט האופטימלי הוגדר כמושבת.</w:t>
-      </w:r>
-    </w:p>
-    <w:p>
-      <w:pPr>
-        <w:spacing w:after="140" w:line="276" w:lineRule="auto"/>
-        <w:jc w:val="right"/>
-        <w:bidi w:val="1"/>
-      </w:pPr>
-      <w:r>
-        <w:rPr>
-          <w:rFonts w:ascii="Arial" w:hAnsi="Arial"/>
-          <w:b/>
-          <w:color w:val="1F2A24"/>
-          <w:sz w:val="21"/>
-        </w:rPr>
-        <w:t>סרטוני YouTube שנבחרו:</w:t>
-      </w:r>
-    </w:p>
-    <w:p>
-      <w:pPr>
-        <w:pStyle w:val="ListBullet"/>
-        <w:spacing w:after="60"/>
-        <w:jc w:val="right"/>
-        <w:bidi w:val="1"/>
-      </w:pPr>
-      <w:r>
-        <w:rPr>
-          <w:rFonts w:ascii="Arial" w:hAnsi="Arial"/>
-          <w:color w:val="1F2A24"/>
-          <w:sz w:val="21"/>
-        </w:rPr>
-        <w:t>Pilates Reformer Workout | Full Body | Intermediate — Dez Fit</w:t>
-      </w:r>
-    </w:p>
-    <w:p>
-      <w:pPr>
-        <w:pStyle w:val="ListBullet"/>
-        <w:spacing w:after="60"/>
-        <w:jc w:val="right"/>
-        <w:bidi w:val="1"/>
-      </w:pPr>
-      <w:r>
-        <w:rPr>
-          <w:rFonts w:ascii="Arial" w:hAnsi="Arial"/>
-          <w:color w:val="1F2A24"/>
-          <w:sz w:val="21"/>
-        </w:rPr>
-        <w:t>Full Body Reformer Pilates Workout 40 Minutes — Alysia Pope Pilates</w:t>
-      </w:r>
-    </w:p>
-    <w:p>
-      <w:pPr>
-        <w:spacing w:before="300" w:after="140"/>
-        <w:jc w:val="right"/>
-        <w:bidi w:val="1"/>
-      </w:pPr>
-      <w:r>
-        <w:rPr>
-          <w:rFonts w:ascii="Arial" w:hAnsi="Arial"/>
-          <w:b/>
-          <w:color w:val="5F7D68"/>
-          <w:sz w:val="36"/>
-        </w:rPr>
-        <w:t>8. נכסים ותוספים</w:t>
-      </w:r>
-    </w:p>
-    <w:tbl>
-      <w:tblPr>
-        <w:tblStyle w:val="TableGrid"/>
-        <w:tblW w:type="auto" w:w="0"/>
-        <w:jc w:val="center"/>
-        <w:tblLook w:firstColumn="1" w:firstRow="1" w:lastColumn="0" w:lastRow="0" w:noHBand="0" w:noVBand="1" w:val="04A0"/>
-      </w:tblPr>
-      <w:tblGrid>
-        <w:gridCol w:w="5112"/>
-        <w:gridCol w:w="5112"/>
-      </w:tblGrid>
-      <w:tr>
-        <w:tc>
-          <w:tcPr>
-            <w:tcW w:type="dxa" w:w="5112"/>
-            <w:shd w:fill="5F7D68"/>
-            <w:vAlign w:val="center"/>
-            <w:tcBorders>
-              <w:top w:val="single" w:sz="5" w:color="D8D1C3"/>
-              <w:left w:val="single" w:sz="5" w:color="D8D1C3"/>
-              <w:bottom w:val="single" w:sz="5" w:color="D8D1C3"/>
-              <w:right w:val="single" w:sz="5" w:color="D8D1C3"/>
-            </w:tcBorders>
-          </w:tcPr>
-          <w:p>
-            <w:pPr>
-              <w:spacing w:after="40"/>
-              <w:jc w:val="right"/>
-            </w:pPr>
-            <w:r/>
-            <w:r>
-              <w:rPr>
-                <w:rFonts w:ascii="Arial" w:hAnsi="Arial"/>
-                <w:b/>
-                <w:color w:val="FFFFFF"/>
-                <w:sz w:val="21"/>
-              </w:rPr>
-              <w:t>נכס / תוסף</w:t>
-            </w:r>
-          </w:p>
-        </w:tc>
-        <w:tc>
-          <w:tcPr>
-            <w:tcW w:type="dxa" w:w="5112"/>
-            <w:shd w:fill="5F7D68"/>
-            <w:vAlign w:val="center"/>
-            <w:tcBorders>
-              <w:top w:val="single" w:sz="5" w:color="D8D1C3"/>
-              <w:left w:val="single" w:sz="5" w:color="D8D1C3"/>
-              <w:bottom w:val="single" w:sz="5" w:color="D8D1C3"/>
-              <w:right w:val="single" w:sz="5" w:color="D8D1C3"/>
-            </w:tcBorders>
-          </w:tcPr>
-          <w:p>
-            <w:pPr>
-              <w:spacing w:after="40"/>
-              <w:jc w:val="right"/>
-            </w:pPr>
-            <w:r/>
-            <w:r>
-              <w:rPr>
-                <w:rFonts w:ascii="Arial" w:hAnsi="Arial"/>
-                <w:b/>
-                <w:color w:val="FFFFFF"/>
-                <w:sz w:val="21"/>
-              </w:rPr>
-              <w:t>יישום / מצב</w:t>
-            </w:r>
-          </w:p>
-        </w:tc>
-      </w:tr>
-      <w:tr>
-        <w:tc>
-          <w:tcPr>
-            <w:tcW w:type="dxa" w:w="5112"/>
-            <w:shd w:fill="F8F3EA"/>
-            <w:vAlign w:val="center"/>
-            <w:tcBorders>
-              <w:top w:val="single" w:sz="5" w:color="D8D1C3"/>
-              <w:left w:val="single" w:sz="5" w:color="D8D1C3"/>
-              <w:bottom w:val="single" w:sz="5" w:color="D8D1C3"/>
-              <w:right w:val="single" w:sz="5" w:color="D8D1C3"/>
-            </w:tcBorders>
-          </w:tcPr>
-          <w:p>
-            <w:pPr>
-              <w:spacing w:after="40"/>
-              <w:jc w:val="right"/>
-            </w:pPr>
-            <w:r/>
-            <w:r>
-              <w:rPr>
-                <w:rFonts w:ascii="Arial" w:hAnsi="Arial"/>
-                <w:b w:val="0"/>
-                <w:color w:val="1F2A24"/>
-                <w:sz w:val="20"/>
-              </w:rPr>
-              <w:t>Sitelinks</w:t>
-            </w:r>
-          </w:p>
-        </w:tc>
-        <w:tc>
-          <w:tcPr>
-            <w:tcW w:type="dxa" w:w="5112"/>
-            <w:shd w:fill="F8F3EA"/>
-            <w:vAlign w:val="center"/>
-            <w:tcBorders>
-              <w:top w:val="single" w:sz="5" w:color="D8D1C3"/>
-              <w:left w:val="single" w:sz="5" w:color="D8D1C3"/>
-              <w:bottom w:val="single" w:sz="5" w:color="D8D1C3"/>
-              <w:right w:val="single" w:sz="5" w:color="D8D1C3"/>
-            </w:tcBorders>
-          </w:tcPr>
-          <w:p>
-            <w:pPr>
-              <w:spacing w:after="40"/>
-              <w:jc w:val="right"/>
-            </w:pPr>
-            <w:r/>
-            <w:r>
-              <w:rPr>
-                <w:rFonts w:ascii="Arial" w:hAnsi="Arial"/>
-                <w:b w:val="0"/>
-                <w:color w:val="1F2A24"/>
-                <w:sz w:val="20"/>
-              </w:rPr>
-              <w:t>קישורים לדף יצירת קשר ולדפי המוצרים — נכללו בייצוא</w:t>
-            </w:r>
-          </w:p>
-        </w:tc>
-      </w:tr>
-      <w:tr>
-        <w:tc>
-          <w:tcPr>
-            <w:tcW w:type="dxa" w:w="5112"/>
-            <w:shd w:fill="FFFFFF"/>
-            <w:vAlign w:val="center"/>
-            <w:tcBorders>
-              <w:top w:val="single" w:sz="5" w:color="D8D1C3"/>
-              <w:left w:val="single" w:sz="5" w:color="D8D1C3"/>
-              <w:bottom w:val="single" w:sz="5" w:color="D8D1C3"/>
-              <w:right w:val="single" w:sz="5" w:color="D8D1C3"/>
-            </w:tcBorders>
-          </w:tcPr>
-          <w:p>
-            <w:pPr>
-              <w:spacing w:after="40"/>
-              <w:jc w:val="right"/>
-            </w:pPr>
-            <w:r/>
-            <w:r>
-              <w:rPr>
-                <w:rFonts w:ascii="Arial" w:hAnsi="Arial"/>
-                <w:b w:val="0"/>
-                <w:color w:val="1F2A24"/>
-                <w:sz w:val="20"/>
-              </w:rPr>
-              <w:t>Callouts</w:t>
-            </w:r>
-          </w:p>
-        </w:tc>
-        <w:tc>
-          <w:tcPr>
-            <w:tcW w:type="dxa" w:w="5112"/>
-            <w:shd w:fill="FFFFFF"/>
-            <w:vAlign w:val="center"/>
-            <w:tcBorders>
-              <w:top w:val="single" w:sz="5" w:color="D8D1C3"/>
-              <w:left w:val="single" w:sz="5" w:color="D8D1C3"/>
-              <w:bottom w:val="single" w:sz="5" w:color="D8D1C3"/>
-              <w:right w:val="single" w:sz="5" w:color="D8D1C3"/>
-            </w:tcBorders>
-          </w:tcPr>
-          <w:p>
-            <w:pPr>
-              <w:spacing w:after="40"/>
-              <w:jc w:val="right"/>
-            </w:pPr>
-            <w:r/>
-            <w:r>
-              <w:rPr>
-                <w:rFonts w:ascii="Arial" w:hAnsi="Arial"/>
-                <w:b w:val="0"/>
-                <w:color w:val="1F2A24"/>
-                <w:sz w:val="20"/>
-              </w:rPr>
-              <w:t>הדגשת יתרונות, יחס אישי וקבוצות קטנות — נכללו בייצוא</w:t>
-            </w:r>
-          </w:p>
-        </w:tc>
-      </w:tr>
-      <w:tr>
-        <w:tc>
-          <w:tcPr>
-            <w:tcW w:type="dxa" w:w="5112"/>
-            <w:shd w:fill="F8F3EA"/>
-            <w:vAlign w:val="center"/>
-            <w:tcBorders>
-              <w:top w:val="single" w:sz="5" w:color="D8D1C3"/>
-              <w:left w:val="single" w:sz="5" w:color="D8D1C3"/>
-              <w:bottom w:val="single" w:sz="5" w:color="D8D1C3"/>
-              <w:right w:val="single" w:sz="5" w:color="D8D1C3"/>
-            </w:tcBorders>
-          </w:tcPr>
-          <w:p>
-            <w:pPr>
-              <w:spacing w:after="40"/>
-              <w:jc w:val="right"/>
-            </w:pPr>
-            <w:r/>
-            <w:r>
-              <w:rPr>
-                <w:rFonts w:ascii="Arial" w:hAnsi="Arial"/>
-                <w:b w:val="0"/>
-                <w:color w:val="1F2A24"/>
-                <w:sz w:val="20"/>
-              </w:rPr>
-              <w:t>Structured snippets</w:t>
-            </w:r>
-          </w:p>
-        </w:tc>
-        <w:tc>
-          <w:tcPr>
-            <w:tcW w:type="dxa" w:w="5112"/>
-            <w:shd w:fill="F8F3EA"/>
-            <w:vAlign w:val="center"/>
-            <w:tcBorders>
-              <w:top w:val="single" w:sz="5" w:color="D8D1C3"/>
-              <w:left w:val="single" w:sz="5" w:color="D8D1C3"/>
-              <w:bottom w:val="single" w:sz="5" w:color="D8D1C3"/>
-              <w:right w:val="single" w:sz="5" w:color="D8D1C3"/>
-            </w:tcBorders>
-          </w:tcPr>
-          <w:p>
-            <w:pPr>
-              <w:spacing w:after="40"/>
-              <w:jc w:val="right"/>
-            </w:pPr>
-            <w:r/>
-            <w:r>
-              <w:rPr>
-                <w:rFonts w:ascii="Arial" w:hAnsi="Arial"/>
-                <w:b w:val="0"/>
-                <w:color w:val="1F2A24"/>
-                <w:sz w:val="20"/>
-              </w:rPr>
-              <w:t>הצגת סוגי השירותים — נכללו בייצוא</w:t>
-            </w:r>
-          </w:p>
-        </w:tc>
-      </w:tr>
-      <w:tr>
-        <w:tc>
-          <w:tcPr>
-            <w:tcW w:type="dxa" w:w="5112"/>
-            <w:shd w:fill="FFFFFF"/>
-            <w:vAlign w:val="center"/>
-            <w:tcBorders>
-              <w:top w:val="single" w:sz="5" w:color="D8D1C3"/>
-              <w:left w:val="single" w:sz="5" w:color="D8D1C3"/>
-              <w:bottom w:val="single" w:sz="5" w:color="D8D1C3"/>
-              <w:right w:val="single" w:sz="5" w:color="D8D1C3"/>
-            </w:tcBorders>
-          </w:tcPr>
-          <w:p>
-            <w:pPr>
-              <w:spacing w:after="40"/>
-              <w:jc w:val="right"/>
-            </w:pPr>
-            <w:r/>
-            <w:r>
-              <w:rPr>
-                <w:rFonts w:ascii="Arial" w:hAnsi="Arial"/>
-                <w:b w:val="0"/>
-                <w:color w:val="1F2A24"/>
-                <w:sz w:val="20"/>
-              </w:rPr>
-              <w:t>Call asset</w:t>
-            </w:r>
-          </w:p>
-        </w:tc>
-        <w:tc>
-          <w:tcPr>
-            <w:tcW w:type="dxa" w:w="5112"/>
-            <w:shd w:fill="FFFFFF"/>
-            <w:vAlign w:val="center"/>
-            <w:tcBorders>
-              <w:top w:val="single" w:sz="5" w:color="D8D1C3"/>
-              <w:left w:val="single" w:sz="5" w:color="D8D1C3"/>
-              <w:bottom w:val="single" w:sz="5" w:color="D8D1C3"/>
-              <w:right w:val="single" w:sz="5" w:color="D8D1C3"/>
-            </w:tcBorders>
-          </w:tcPr>
-          <w:p>
-            <w:pPr>
-              <w:spacing w:after="40"/>
-              <w:jc w:val="right"/>
-            </w:pPr>
-            <w:r/>
-            <w:r>
-              <w:rPr>
-                <w:rFonts w:ascii="Arial" w:hAnsi="Arial"/>
-                <w:b w:val="0"/>
-                <w:color w:val="1F2A24"/>
-                <w:sz w:val="20"/>
-              </w:rPr>
-              <w:t>מספר הטלפון 0525381648, ישראל — קיים וממתין לבדיקה</w:t>
-            </w:r>
-          </w:p>
-        </w:tc>
-      </w:tr>
-      <w:tr>
-        <w:tc>
-          <w:tcPr>
-            <w:tcW w:type="dxa" w:w="5112"/>
-            <w:shd w:fill="F8F3EA"/>
-            <w:vAlign w:val="center"/>
-            <w:tcBorders>
-              <w:top w:val="single" w:sz="5" w:color="D8D1C3"/>
-              <w:left w:val="single" w:sz="5" w:color="D8D1C3"/>
-              <w:bottom w:val="single" w:sz="5" w:color="D8D1C3"/>
-              <w:right w:val="single" w:sz="5" w:color="D8D1C3"/>
-            </w:tcBorders>
-          </w:tcPr>
-          <w:p>
-            <w:pPr>
-              <w:spacing w:after="40"/>
-              <w:jc w:val="right"/>
-            </w:pPr>
-            <w:r/>
-            <w:r>
-              <w:rPr>
-                <w:rFonts w:ascii="Arial" w:hAnsi="Arial"/>
-                <w:b w:val="0"/>
-                <w:color w:val="1F2A24"/>
-                <w:sz w:val="20"/>
-              </w:rPr>
-              <w:t>Countdown</w:t>
-            </w:r>
-          </w:p>
-        </w:tc>
-        <w:tc>
-          <w:tcPr>
-            <w:tcW w:type="dxa" w:w="5112"/>
-            <w:shd w:fill="F8F3EA"/>
-            <w:vAlign w:val="center"/>
-            <w:tcBorders>
-              <w:top w:val="single" w:sz="5" w:color="D8D1C3"/>
-              <w:left w:val="single" w:sz="5" w:color="D8D1C3"/>
-              <w:bottom w:val="single" w:sz="5" w:color="D8D1C3"/>
-              <w:right w:val="single" w:sz="5" w:color="D8D1C3"/>
-            </w:tcBorders>
-          </w:tcPr>
-          <w:p>
-            <w:pPr>
-              <w:spacing w:after="40"/>
-              <w:jc w:val="right"/>
-            </w:pPr>
-            <w:r/>
-            <w:r>
-              <w:rPr>
-                <w:rFonts w:ascii="Arial" w:hAnsi="Arial"/>
-                <w:b w:val="0"/>
-                <w:color w:val="1F2A24"/>
-                <w:sz w:val="20"/>
-              </w:rPr>
-              <w:t>תוסף שנדרש להשלמה בחשבון לפני ההגשה הסופית</w:t>
-            </w:r>
-          </w:p>
-        </w:tc>
-      </w:tr>
-      <w:tr>
-        <w:tc>
-          <w:tcPr>
-            <w:tcW w:type="dxa" w:w="5112"/>
-            <w:shd w:fill="FFFFFF"/>
-            <w:vAlign w:val="center"/>
-            <w:tcBorders>
-              <w:top w:val="single" w:sz="5" w:color="D8D1C3"/>
-              <w:left w:val="single" w:sz="5" w:color="D8D1C3"/>
-              <w:bottom w:val="single" w:sz="5" w:color="D8D1C3"/>
-              <w:right w:val="single" w:sz="5" w:color="D8D1C3"/>
-            </w:tcBorders>
-          </w:tcPr>
-          <w:p>
-            <w:pPr>
-              <w:spacing w:after="40"/>
-              <w:jc w:val="right"/>
-            </w:pPr>
-            <w:r/>
-            <w:r>
-              <w:rPr>
-                <w:rFonts w:ascii="Arial" w:hAnsi="Arial"/>
-                <w:b w:val="0"/>
-                <w:color w:val="1F2A24"/>
-                <w:sz w:val="20"/>
-              </w:rPr>
-              <w:t>מילים שליליות</w:t>
-            </w:r>
-          </w:p>
-        </w:tc>
-        <w:tc>
-          <w:tcPr>
-            <w:tcW w:type="dxa" w:w="5112"/>
-            <w:shd w:fill="FFFFFF"/>
-            <w:vAlign w:val="center"/>
-            <w:tcBorders>
-              <w:top w:val="single" w:sz="5" w:color="D8D1C3"/>
-              <w:left w:val="single" w:sz="5" w:color="D8D1C3"/>
-              <w:bottom w:val="single" w:sz="5" w:color="D8D1C3"/>
-              <w:right w:val="single" w:sz="5" w:color="D8D1C3"/>
-            </w:tcBorders>
-          </w:tcPr>
-          <w:p>
-            <w:pPr>
-              <w:spacing w:after="40"/>
-              <w:jc w:val="right"/>
-            </w:pPr>
-            <w:r/>
-            <w:r>
-              <w:rPr>
-                <w:rFonts w:ascii="Arial" w:hAnsi="Arial"/>
-                <w:b w:val="0"/>
-                <w:color w:val="1F2A24"/>
-                <w:sz w:val="20"/>
-              </w:rPr>
-              <w:t>סינון חיפושים שאינם רלוונטיים</w:t>
-            </w:r>
-          </w:p>
-        </w:tc>
-      </w:tr>
-    </w:tbl>
-    <w:p>
-      <w:pPr>
-        <w:spacing w:before="300" w:after="140"/>
-        <w:jc w:val="right"/>
-        <w:bidi w:val="1"/>
-      </w:pPr>
-      <w:r>
-        <w:rPr>
-          <w:rFonts w:ascii="Arial" w:hAnsi="Arial"/>
-          <w:b/>
-          <w:color w:val="5F7D68"/>
-          <w:sz w:val="36"/>
-        </w:rPr>
-        <w:t>9. מדידה והמרות</w:t>
-      </w:r>
-    </w:p>
-    <w:p>
-      <w:pPr>
-        <w:spacing w:after="140" w:line="276" w:lineRule="auto"/>
-        <w:jc w:val="right"/>
-        <w:bidi w:val="1"/>
-      </w:pPr>
-      <w:r>
-        <w:rPr>
-          <w:rFonts w:ascii="Arial" w:hAnsi="Arial"/>
-          <w:b w:val="0"/>
-          <w:color w:val="1F2A24"/>
-          <w:sz w:val="21"/>
-        </w:rPr>
-        <w:t>באתר משולב Google tag עם מזהה המדידה AW-18101301732. בדף thank-you.html מופעל אירוע ההמרה:</w:t>
-      </w:r>
-    </w:p>
-    <w:p>
-      <w:pPr>
-        <w:spacing w:after="140" w:line="276" w:lineRule="auto"/>
+        <w:spacing w:after="0" w:line="276" w:lineRule="auto"/>
         <w:jc w:val="center"/>
         <w:bidi w:val="1"/>
       </w:pPr>
@@ -2759,88 +918,16 @@
           <w:rFonts w:ascii="Arial" w:hAnsi="Arial"/>
           <w:b/>
           <w:color w:val="C9A45C"/>
-          <w:sz w:val="22"/>
+          <w:sz w:val="32"/>
         </w:rPr>
-        <w:t>AW-18101301732/7DiCCKiD0s4cEOTjr7dD</w:t>
-      </w:r>
-    </w:p>
-    <w:p>
-      <w:pPr>
-        <w:spacing w:after="140" w:line="276" w:lineRule="auto"/>
-        <w:jc w:val="right"/>
-        <w:bidi w:val="1"/>
-      </w:pPr>
-      <w:r>
-        <w:rPr>
-          <w:rFonts w:ascii="Arial" w:hAnsi="Arial"/>
-          <w:b w:val="0"/>
-          <w:color w:val="1F2A24"/>
-          <w:sz w:val="21"/>
-        </w:rPr>
-        <w:t>ההמרה נספרת לאחר שליחת הטופס והגעה לדף התודה. כך ניתן למדוד לא רק כניסות לדף, אלא גם פעולה עסקית של השארת פרטים.</w:t>
-      </w:r>
-    </w:p>
-    <w:p>
-      <w:pPr>
-        <w:spacing w:before="300" w:after="140"/>
-        <w:jc w:val="right"/>
-        <w:bidi w:val="1"/>
-      </w:pPr>
-      <w:r>
-        <w:rPr>
-          <w:rFonts w:ascii="Arial" w:hAnsi="Arial"/>
-          <w:b/>
-          <w:color w:val="5F7D68"/>
-          <w:sz w:val="36"/>
-        </w:rPr>
-        <w:t>10. סיכום</w:t>
-      </w:r>
-    </w:p>
-    <w:p>
-      <w:pPr>
-        <w:spacing w:after="140" w:line="276" w:lineRule="auto"/>
-        <w:jc w:val="right"/>
-        <w:bidi w:val="1"/>
-      </w:pPr>
-      <w:r>
-        <w:rPr>
-          <w:rFonts w:ascii="Arial" w:hAnsi="Arial"/>
-          <w:b w:val="0"/>
-          <w:color w:val="1F2A24"/>
-          <w:sz w:val="22"/>
-        </w:rPr>
-        <w:t>העבודה מציגה תהליך של הקמת פעילות פרסום עבור עסק שירותי: אתר עם דפי נחיתה וטופס, מדידת המרות, קמפיין חיפוש וקמפיין מותג, קמפיין מדיה עם רימרקטינג וקמפיין וידאו. כל הקמפיינים בחשבון נשמרו במצב מושהה בהתאם להנחיות המטלה. לפני שליחת ההגשה יש להשלים ולוודא בחשבון את תוסף הספירה לאחור, את מודעת ההתקשרות בלבד ואת ארבעת מיקומי ערוצי YouTube.</w:t>
-      </w:r>
-    </w:p>
-    <w:p>
-      <w:pPr>
-        <w:spacing w:before="360" w:after="0"/>
-        <w:jc w:val="right"/>
-        <w:bidi w:val="1"/>
-      </w:pPr>
-      <w:r>
-        <w:rPr>
-          <w:rFonts w:ascii="Arial" w:hAnsi="Arial"/>
-          <w:b/>
-          <w:color w:val="5F7D68"/>
-          <w:sz w:val="21"/>
-        </w:rPr>
-        <w:t xml:space="preserve">פרטי קשר להגשה: </w:t>
-      </w:r>
-      <w:r>
-        <w:rPr>
-          <w:rFonts w:ascii="Arial" w:hAnsi="Arial"/>
-          <w:color w:val="1F2A24"/>
-          <w:sz w:val="21"/>
-        </w:rPr>
-        <w:t>עמית סולימן · 0587477769 · amitsuliman12@gmail.com</w:t>
+        <w:t>580-214-1692</w:t>
       </w:r>
     </w:p>
     <w:sectPr>
       <w:headerReference w:type="default" r:id="rId9"/>
       <w:footerReference w:type="default" r:id="rId10"/>
       <w:pgSz w:w="12240" w:h="15840"/>
-      <w:pgMar w:top="792" w:right="1008" w:bottom="792" w:left="1008" w:header="720" w:footer="720" w:gutter="0"/>
+      <w:pgMar w:top="864" w:right="1080" w:bottom="864" w:left="1080" w:header="720" w:footer="720" w:gutter="0"/>
       <w:cols w:space="720"/>
       <w:docGrid w:linePitch="360"/>
     </w:sectPr>
@@ -2861,7 +948,7 @@
         <w:color w:val="6F706A"/>
         <w:sz w:val="16"/>
       </w:rPr>
-      <w:t>LUMERA  ·  פרסום בגוגל  ·  עמית סולימן</w:t>
+      <w:t>LUMERA · פרסום בגוגל · עמית סולימן</w:t>
     </w:r>
   </w:p>
 </w:ftr>
@@ -2877,7 +964,7 @@
     <w:r>
       <w:drawing>
         <wp:inline xmlns:a="http://schemas.openxmlformats.org/drawingml/2006/main" xmlns:pic="http://schemas.openxmlformats.org/drawingml/2006/picture">
-          <wp:extent cx="1325880" cy="331470"/>
+          <wp:extent cx="1417320" cy="354330"/>
           <wp:docPr id="1" name="Picture 1"/>
           <wp:cNvGraphicFramePr>
             <a:graphicFrameLocks noChangeAspect="1"/>
@@ -2886,7 +973,7 @@
             <a:graphicData uri="http://schemas.openxmlformats.org/drawingml/2006/picture">
               <pic:pic>
                 <pic:nvPicPr>
-                  <pic:cNvPr id="0" name="lumera-logo-landscape.png"/>
+                  <pic:cNvPr id="0" name="lumera-logo-landscape-transparent.png"/>
                   <pic:cNvPicPr/>
                 </pic:nvPicPr>
                 <pic:blipFill>
@@ -2898,7 +985,7 @@
                 <pic:spPr>
                   <a:xfrm>
                     <a:off x="0" y="0"/>
-                    <a:ext cx="1325880" cy="331470"/>
+                    <a:ext cx="1417320" cy="354330"/>
                   </a:xfrm>
                   <a:prstGeom prst="rect"/>
                 </pic:spPr>
@@ -3277,8 +1364,7 @@
     <w:rsid w:val="00FC693F"/>
     <w:rPr>
       <w:rFonts w:ascii="Arial" w:hAnsi="Arial"/>
-      <w:color w:val="1F2A24"/>
-      <w:sz w:val="21"/>
+      <w:sz w:val="22"/>
     </w:rPr>
   </w:style>
   <w:style w:type="paragraph" w:styleId="Header">

</xml_diff>

<commit_message>
Right-align minimal submission document
</commit_message>
<xml_diff>
--- a/LUMERA_הגשה_פרסום_בגוגל_עמית_סולימן.docx
+++ b/LUMERA_הגשה_פרסום_בגוגל_עמית_סולימן.docx
@@ -5,7 +5,7 @@
     <w:p>
       <w:pPr>
         <w:spacing w:after="60" w:line="276" w:lineRule="auto"/>
-        <w:jc w:val="center"/>
+        <w:jc w:val="right"/>
         <w:bidi w:val="1"/>
       </w:pPr>
       <w:r>
@@ -46,7 +46,7 @@
     <w:p>
       <w:pPr>
         <w:spacing w:after="40" w:line="276" w:lineRule="auto"/>
-        <w:jc w:val="center"/>
+        <w:jc w:val="right"/>
         <w:bidi w:val="1"/>
       </w:pPr>
       <w:r>
@@ -62,7 +62,7 @@
     <w:p>
       <w:pPr>
         <w:spacing w:after="400" w:line="276" w:lineRule="auto"/>
-        <w:jc w:val="center"/>
+        <w:jc w:val="right"/>
         <w:bidi w:val="1"/>
       </w:pPr>
       <w:r>
@@ -910,7 +910,7 @@
     <w:p>
       <w:pPr>
         <w:spacing w:after="0" w:line="276" w:lineRule="auto"/>
-        <w:jc w:val="center"/>
+        <w:jc w:val="right"/>
         <w:bidi w:val="1"/>
       </w:pPr>
       <w:r>
@@ -940,7 +940,7 @@
   <w:p>
     <w:pPr>
       <w:pStyle w:val="Footer"/>
-      <w:jc w:val="center"/>
+      <w:jc w:val="right"/>
     </w:pPr>
     <w:r>
       <w:rPr>
@@ -959,7 +959,7 @@
   <w:p>
     <w:pPr>
       <w:pStyle w:val="Header"/>
-      <w:jc w:val="center"/>
+      <w:jc w:val="right"/>
     </w:pPr>
     <w:r>
       <w:drawing>

</xml_diff>

<commit_message>
Expand submission with complete campaign details
</commit_message>
<xml_diff>
--- a/LUMERA_הגשה_פרסום_בגוגל_עמית_סולימן.docx
+++ b/LUMERA_הגשה_פרסום_בגוגל_עמית_סולימן.docx
@@ -4,14 +4,14 @@
   <w:body>
     <w:p>
       <w:pPr>
-        <w:spacing w:after="60" w:line="276" w:lineRule="auto"/>
-        <w:jc w:val="right"/>
+        <w:spacing w:after="160" w:line="276" w:lineRule="auto"/>
+        <w:jc w:val="center"/>
         <w:bidi w:val="1"/>
       </w:pPr>
       <w:r>
         <w:drawing>
           <wp:inline xmlns:a="http://schemas.openxmlformats.org/drawingml/2006/main" xmlns:pic="http://schemas.openxmlformats.org/drawingml/2006/picture">
-            <wp:extent cx="3108960" cy="777240"/>
+            <wp:extent cx="3383280" cy="845820"/>
             <wp:docPr id="1" name="Picture 1"/>
             <wp:cNvGraphicFramePr>
               <a:graphicFrameLocks noChangeAspect="1"/>
@@ -20,7 +20,7 @@
               <a:graphicData uri="http://schemas.openxmlformats.org/drawingml/2006/picture">
                 <pic:pic>
                   <pic:nvPicPr>
-                    <pic:cNvPr id="0" name="lumera-logo-landscape-transparent.png"/>
+                    <pic:cNvPr id="0" name="lumera-logo-landscape.png"/>
                     <pic:cNvPicPr/>
                   </pic:nvPicPr>
                   <pic:blipFill>
@@ -32,7 +32,7 @@
                   <pic:spPr>
                     <a:xfrm>
                       <a:off x="0" y="0"/>
-                      <a:ext cx="3108960" cy="777240"/>
+                      <a:ext cx="3383280" cy="845820"/>
                     </a:xfrm>
                     <a:prstGeom prst="rect"/>
                   </pic:spPr>
@@ -46,7 +46,7 @@
     <w:p>
       <w:pPr>
         <w:spacing w:after="40" w:line="276" w:lineRule="auto"/>
-        <w:jc w:val="right"/>
+        <w:jc w:val="center"/>
         <w:bidi w:val="1"/>
       </w:pPr>
       <w:r>
@@ -54,15 +54,15 @@
           <w:rFonts w:ascii="Arial" w:hAnsi="Arial"/>
           <w:b/>
           <w:color w:val="1F2A24"/>
-          <w:sz w:val="50"/>
+          <w:sz w:val="54"/>
         </w:rPr>
         <w:t>פרסום בגוגל</w:t>
       </w:r>
     </w:p>
     <w:p>
       <w:pPr>
-        <w:spacing w:after="400" w:line="276" w:lineRule="auto"/>
-        <w:jc w:val="right"/>
+        <w:spacing w:after="360" w:line="276" w:lineRule="auto"/>
+        <w:jc w:val="center"/>
         <w:bidi w:val="1"/>
       </w:pPr>
       <w:r>
@@ -72,23 +72,53 @@
           <w:color w:val="5F7D68"/>
           <w:sz w:val="26"/>
         </w:rPr>
-        <w:t>מטלת סיום · תשפ״ו 2026</w:t>
+        <w:t>מטלת סיום · סמסטר ב׳ · תשפ״ו 2026</w:t>
       </w:r>
     </w:p>
     <w:p>
       <w:pPr>
-        <w:spacing w:after="140" w:line="276" w:lineRule="auto" w:before="280"/>
-        <w:jc w:val="right"/>
+        <w:spacing w:after="320" w:line="276" w:lineRule="auto"/>
+        <w:jc w:val="center"/>
+        <w:bidi w:val="1"/>
+      </w:pPr>
+      <w:r>
+        <w:rPr>
+          <w:color w:val="C9A45C"/>
+          <w:sz w:val="24"/>
+        </w:rPr>
+        <w:t>━━━━━━━━━━━━━━━━━━━━━━━━━━━━</w:t>
+      </w:r>
+    </w:p>
+    <w:p>
+      <w:pPr>
+        <w:spacing w:after="40" w:line="276" w:lineRule="auto"/>
+        <w:jc w:val="center"/>
         <w:bidi w:val="1"/>
       </w:pPr>
       <w:r>
         <w:rPr>
           <w:rFonts w:ascii="Arial" w:hAnsi="Arial"/>
           <w:b/>
-          <w:color w:val="5F7D68"/>
-          <w:sz w:val="34"/>
+          <w:color w:val="C9A45C"/>
+          <w:sz w:val="40"/>
         </w:rPr>
-        <w:t>פרטי הסטודנט</w:t>
+        <w:t>LUMERA</w:t>
+      </w:r>
+    </w:p>
+    <w:p>
+      <w:pPr>
+        <w:spacing w:after="500" w:line="276" w:lineRule="auto"/>
+        <w:jc w:val="center"/>
+        <w:bidi w:val="1"/>
+      </w:pPr>
+      <w:r>
+        <w:rPr>
+          <w:rFonts w:ascii="Arial" w:hAnsi="Arial"/>
+          <w:b w:val="0"/>
+          <w:color w:val="6F706A"/>
+          <w:sz w:val="28"/>
+        </w:rPr>
+        <w:t>סטודיו לפילאטיס בוטיק בנתניה</w:t>
       </w:r>
     </w:p>
     <w:tbl>
@@ -99,21 +129,26 @@
         <w:tblLook w:firstColumn="1" w:firstRow="1" w:lastColumn="0" w:lastRow="0" w:noHBand="0" w:noVBand="1" w:val="04A0"/>
       </w:tblPr>
       <w:tblGrid>
-        <w:gridCol w:w="5040"/>
-        <w:gridCol w:w="5040"/>
+        <w:gridCol w:w="5112"/>
+        <w:gridCol w:w="5112"/>
       </w:tblGrid>
       <w:tr>
         <w:tc>
           <w:tcPr>
-            <w:tcW w:type="dxa" w:w="5040"/>
+            <w:tcW w:type="dxa" w:w="5112"/>
             <w:shd w:fill="5F7D68"/>
             <w:vAlign w:val="center"/>
+            <w:tcBorders>
+              <w:top w:val="single" w:sz="5" w:color="D8D1C3"/>
+              <w:left w:val="single" w:sz="5" w:color="D8D1C3"/>
+              <w:bottom w:val="single" w:sz="5" w:color="D8D1C3"/>
+              <w:right w:val="single" w:sz="5" w:color="D8D1C3"/>
+            </w:tcBorders>
           </w:tcPr>
           <w:p>
             <w:pPr>
-              <w:spacing w:after="0"/>
+              <w:spacing w:after="40"/>
               <w:jc w:val="right"/>
-              <w:bidi w:val="1"/>
             </w:pPr>
             <w:r/>
             <w:r>
@@ -129,15 +164,20 @@
         </w:tc>
         <w:tc>
           <w:tcPr>
-            <w:tcW w:type="dxa" w:w="5040"/>
+            <w:tcW w:type="dxa" w:w="5112"/>
             <w:shd w:fill="5F7D68"/>
             <w:vAlign w:val="center"/>
+            <w:tcBorders>
+              <w:top w:val="single" w:sz="5" w:color="D8D1C3"/>
+              <w:left w:val="single" w:sz="5" w:color="D8D1C3"/>
+              <w:bottom w:val="single" w:sz="5" w:color="D8D1C3"/>
+              <w:right w:val="single" w:sz="5" w:color="D8D1C3"/>
+            </w:tcBorders>
           </w:tcPr>
           <w:p>
             <w:pPr>
-              <w:spacing w:after="0"/>
+              <w:spacing w:after="40"/>
               <w:jc w:val="right"/>
-              <w:bidi w:val="1"/>
             </w:pPr>
             <w:r/>
             <w:r>
@@ -155,15 +195,20 @@
       <w:tr>
         <w:tc>
           <w:tcPr>
-            <w:tcW w:type="dxa" w:w="5040"/>
+            <w:tcW w:type="dxa" w:w="5112"/>
             <w:shd w:fill="F8F3EA"/>
             <w:vAlign w:val="center"/>
+            <w:tcBorders>
+              <w:top w:val="single" w:sz="5" w:color="D8D1C3"/>
+              <w:left w:val="single" w:sz="5" w:color="D8D1C3"/>
+              <w:bottom w:val="single" w:sz="5" w:color="D8D1C3"/>
+              <w:right w:val="single" w:sz="5" w:color="D8D1C3"/>
+            </w:tcBorders>
           </w:tcPr>
           <w:p>
             <w:pPr>
-              <w:spacing w:after="0"/>
+              <w:spacing w:after="40"/>
               <w:jc w:val="right"/>
-              <w:bidi w:val="1"/>
             </w:pPr>
             <w:r/>
             <w:r>
@@ -171,23 +216,28 @@
                 <w:rFonts w:ascii="Arial" w:hAnsi="Arial"/>
                 <w:b w:val="0"/>
                 <w:color w:val="1F2A24"/>
-                <w:sz w:val="21"/>
+                <w:sz w:val="20"/>
               </w:rPr>
-              <w:t>שם</w:t>
+              <w:t>סטודנט</w:t>
             </w:r>
           </w:p>
         </w:tc>
         <w:tc>
           <w:tcPr>
-            <w:tcW w:type="dxa" w:w="5040"/>
+            <w:tcW w:type="dxa" w:w="5112"/>
             <w:shd w:fill="F8F3EA"/>
             <w:vAlign w:val="center"/>
+            <w:tcBorders>
+              <w:top w:val="single" w:sz="5" w:color="D8D1C3"/>
+              <w:left w:val="single" w:sz="5" w:color="D8D1C3"/>
+              <w:bottom w:val="single" w:sz="5" w:color="D8D1C3"/>
+              <w:right w:val="single" w:sz="5" w:color="D8D1C3"/>
+            </w:tcBorders>
           </w:tcPr>
           <w:p>
             <w:pPr>
-              <w:spacing w:after="0"/>
+              <w:spacing w:after="40"/>
               <w:jc w:val="right"/>
-              <w:bidi w:val="1"/>
             </w:pPr>
             <w:r/>
             <w:r>
@@ -195,7 +245,7 @@
                 <w:rFonts w:ascii="Arial" w:hAnsi="Arial"/>
                 <w:b w:val="0"/>
                 <w:color w:val="1F2A24"/>
-                <w:sz w:val="21"/>
+                <w:sz w:val="20"/>
               </w:rPr>
               <w:t>עמית סולימן</w:t>
             </w:r>
@@ -205,15 +255,20 @@
       <w:tr>
         <w:tc>
           <w:tcPr>
-            <w:tcW w:type="dxa" w:w="5040"/>
+            <w:tcW w:type="dxa" w:w="5112"/>
             <w:shd w:fill="FFFFFF"/>
             <w:vAlign w:val="center"/>
+            <w:tcBorders>
+              <w:top w:val="single" w:sz="5" w:color="D8D1C3"/>
+              <w:left w:val="single" w:sz="5" w:color="D8D1C3"/>
+              <w:bottom w:val="single" w:sz="5" w:color="D8D1C3"/>
+              <w:right w:val="single" w:sz="5" w:color="D8D1C3"/>
+            </w:tcBorders>
           </w:tcPr>
           <w:p>
             <w:pPr>
-              <w:spacing w:after="0"/>
+              <w:spacing w:after="40"/>
               <w:jc w:val="right"/>
-              <w:bidi w:val="1"/>
             </w:pPr>
             <w:r/>
             <w:r>
@@ -221,7 +276,7 @@
                 <w:rFonts w:ascii="Arial" w:hAnsi="Arial"/>
                 <w:b w:val="0"/>
                 <w:color w:val="1F2A24"/>
-                <w:sz w:val="21"/>
+                <w:sz w:val="20"/>
               </w:rPr>
               <w:t>תעודת זהות</w:t>
             </w:r>
@@ -229,15 +284,20 @@
         </w:tc>
         <w:tc>
           <w:tcPr>
-            <w:tcW w:type="dxa" w:w="5040"/>
+            <w:tcW w:type="dxa" w:w="5112"/>
             <w:shd w:fill="FFFFFF"/>
             <w:vAlign w:val="center"/>
+            <w:tcBorders>
+              <w:top w:val="single" w:sz="5" w:color="D8D1C3"/>
+              <w:left w:val="single" w:sz="5" w:color="D8D1C3"/>
+              <w:bottom w:val="single" w:sz="5" w:color="D8D1C3"/>
+              <w:right w:val="single" w:sz="5" w:color="D8D1C3"/>
+            </w:tcBorders>
           </w:tcPr>
           <w:p>
             <w:pPr>
-              <w:spacing w:after="0"/>
+              <w:spacing w:after="40"/>
               <w:jc w:val="right"/>
-              <w:bidi w:val="1"/>
             </w:pPr>
             <w:r/>
             <w:r>
@@ -245,7 +305,7 @@
                 <w:rFonts w:ascii="Arial" w:hAnsi="Arial"/>
                 <w:b w:val="0"/>
                 <w:color w:val="1F2A24"/>
-                <w:sz w:val="21"/>
+                <w:sz w:val="20"/>
               </w:rPr>
               <w:t>213686108</w:t>
             </w:r>
@@ -255,15 +315,20 @@
       <w:tr>
         <w:tc>
           <w:tcPr>
-            <w:tcW w:type="dxa" w:w="5040"/>
+            <w:tcW w:type="dxa" w:w="5112"/>
             <w:shd w:fill="F8F3EA"/>
             <w:vAlign w:val="center"/>
+            <w:tcBorders>
+              <w:top w:val="single" w:sz="5" w:color="D8D1C3"/>
+              <w:left w:val="single" w:sz="5" w:color="D8D1C3"/>
+              <w:bottom w:val="single" w:sz="5" w:color="D8D1C3"/>
+              <w:right w:val="single" w:sz="5" w:color="D8D1C3"/>
+            </w:tcBorders>
           </w:tcPr>
           <w:p>
             <w:pPr>
-              <w:spacing w:after="0"/>
+              <w:spacing w:after="40"/>
               <w:jc w:val="right"/>
-              <w:bidi w:val="1"/>
             </w:pPr>
             <w:r/>
             <w:r>
@@ -271,7 +336,7 @@
                 <w:rFonts w:ascii="Arial" w:hAnsi="Arial"/>
                 <w:b w:val="0"/>
                 <w:color w:val="1F2A24"/>
-                <w:sz w:val="21"/>
+                <w:sz w:val="20"/>
               </w:rPr>
               <w:t>טלפון</w:t>
             </w:r>
@@ -279,15 +344,20 @@
         </w:tc>
         <w:tc>
           <w:tcPr>
-            <w:tcW w:type="dxa" w:w="5040"/>
+            <w:tcW w:type="dxa" w:w="5112"/>
             <w:shd w:fill="F8F3EA"/>
             <w:vAlign w:val="center"/>
+            <w:tcBorders>
+              <w:top w:val="single" w:sz="5" w:color="D8D1C3"/>
+              <w:left w:val="single" w:sz="5" w:color="D8D1C3"/>
+              <w:bottom w:val="single" w:sz="5" w:color="D8D1C3"/>
+              <w:right w:val="single" w:sz="5" w:color="D8D1C3"/>
+            </w:tcBorders>
           </w:tcPr>
           <w:p>
             <w:pPr>
-              <w:spacing w:after="0"/>
+              <w:spacing w:after="40"/>
               <w:jc w:val="right"/>
-              <w:bidi w:val="1"/>
             </w:pPr>
             <w:r/>
             <w:r>
@@ -295,7 +365,7 @@
                 <w:rFonts w:ascii="Arial" w:hAnsi="Arial"/>
                 <w:b w:val="0"/>
                 <w:color w:val="1F2A24"/>
-                <w:sz w:val="21"/>
+                <w:sz w:val="20"/>
               </w:rPr>
               <w:t>0587477769</w:t>
             </w:r>
@@ -305,15 +375,20 @@
       <w:tr>
         <w:tc>
           <w:tcPr>
-            <w:tcW w:type="dxa" w:w="5040"/>
+            <w:tcW w:type="dxa" w:w="5112"/>
             <w:shd w:fill="FFFFFF"/>
             <w:vAlign w:val="center"/>
+            <w:tcBorders>
+              <w:top w:val="single" w:sz="5" w:color="D8D1C3"/>
+              <w:left w:val="single" w:sz="5" w:color="D8D1C3"/>
+              <w:bottom w:val="single" w:sz="5" w:color="D8D1C3"/>
+              <w:right w:val="single" w:sz="5" w:color="D8D1C3"/>
+            </w:tcBorders>
           </w:tcPr>
           <w:p>
             <w:pPr>
-              <w:spacing w:after="0"/>
+              <w:spacing w:after="40"/>
               <w:jc w:val="right"/>
-              <w:bidi w:val="1"/>
             </w:pPr>
             <w:r/>
             <w:r>
@@ -321,7 +396,7 @@
                 <w:rFonts w:ascii="Arial" w:hAnsi="Arial"/>
                 <w:b w:val="0"/>
                 <w:color w:val="1F2A24"/>
-                <w:sz w:val="21"/>
+                <w:sz w:val="20"/>
               </w:rPr>
               <w:t>אימייל</w:t>
             </w:r>
@@ -329,15 +404,20 @@
         </w:tc>
         <w:tc>
           <w:tcPr>
-            <w:tcW w:type="dxa" w:w="5040"/>
+            <w:tcW w:type="dxa" w:w="5112"/>
             <w:shd w:fill="FFFFFF"/>
             <w:vAlign w:val="center"/>
+            <w:tcBorders>
+              <w:top w:val="single" w:sz="5" w:color="D8D1C3"/>
+              <w:left w:val="single" w:sz="5" w:color="D8D1C3"/>
+              <w:bottom w:val="single" w:sz="5" w:color="D8D1C3"/>
+              <w:right w:val="single" w:sz="5" w:color="D8D1C3"/>
+            </w:tcBorders>
           </w:tcPr>
           <w:p>
             <w:pPr>
-              <w:spacing w:after="0"/>
+              <w:spacing w:after="40"/>
               <w:jc w:val="right"/>
-              <w:bidi w:val="1"/>
             </w:pPr>
             <w:r/>
             <w:r>
@@ -345,9 +425,249 @@
                 <w:rFonts w:ascii="Arial" w:hAnsi="Arial"/>
                 <w:b w:val="0"/>
                 <w:color w:val="1F2A24"/>
-                <w:sz w:val="21"/>
+                <w:sz w:val="20"/>
               </w:rPr>
               <w:t>amitsuliman12@gmail.com</w:t>
+            </w:r>
+          </w:p>
+        </w:tc>
+      </w:tr>
+      <w:tr>
+        <w:tc>
+          <w:tcPr>
+            <w:tcW w:type="dxa" w:w="5112"/>
+            <w:shd w:fill="F8F3EA"/>
+            <w:vAlign w:val="center"/>
+            <w:tcBorders>
+              <w:top w:val="single" w:sz="5" w:color="D8D1C3"/>
+              <w:left w:val="single" w:sz="5" w:color="D8D1C3"/>
+              <w:bottom w:val="single" w:sz="5" w:color="D8D1C3"/>
+              <w:right w:val="single" w:sz="5" w:color="D8D1C3"/>
+            </w:tcBorders>
+          </w:tcPr>
+          <w:p>
+            <w:pPr>
+              <w:spacing w:after="40"/>
+              <w:jc w:val="right"/>
+            </w:pPr>
+            <w:r/>
+            <w:r>
+              <w:rPr>
+                <w:rFonts w:ascii="Arial" w:hAnsi="Arial"/>
+                <w:b w:val="0"/>
+                <w:color w:val="1F2A24"/>
+                <w:sz w:val="20"/>
+              </w:rPr>
+              <w:t>מרצה</w:t>
+            </w:r>
+          </w:p>
+        </w:tc>
+        <w:tc>
+          <w:tcPr>
+            <w:tcW w:type="dxa" w:w="5112"/>
+            <w:shd w:fill="F8F3EA"/>
+            <w:vAlign w:val="center"/>
+            <w:tcBorders>
+              <w:top w:val="single" w:sz="5" w:color="D8D1C3"/>
+              <w:left w:val="single" w:sz="5" w:color="D8D1C3"/>
+              <w:bottom w:val="single" w:sz="5" w:color="D8D1C3"/>
+              <w:right w:val="single" w:sz="5" w:color="D8D1C3"/>
+            </w:tcBorders>
+          </w:tcPr>
+          <w:p>
+            <w:pPr>
+              <w:spacing w:after="40"/>
+              <w:jc w:val="right"/>
+            </w:pPr>
+            <w:r/>
+            <w:r>
+              <w:rPr>
+                <w:rFonts w:ascii="Arial" w:hAnsi="Arial"/>
+                <w:b w:val="0"/>
+                <w:color w:val="1F2A24"/>
+                <w:sz w:val="20"/>
+              </w:rPr>
+              <w:t>אבישי פרוינד</w:t>
+            </w:r>
+          </w:p>
+        </w:tc>
+      </w:tr>
+      <w:tr>
+        <w:tc>
+          <w:tcPr>
+            <w:tcW w:type="dxa" w:w="5112"/>
+            <w:shd w:fill="FFFFFF"/>
+            <w:vAlign w:val="center"/>
+            <w:tcBorders>
+              <w:top w:val="single" w:sz="5" w:color="D8D1C3"/>
+              <w:left w:val="single" w:sz="5" w:color="D8D1C3"/>
+              <w:bottom w:val="single" w:sz="5" w:color="D8D1C3"/>
+              <w:right w:val="single" w:sz="5" w:color="D8D1C3"/>
+            </w:tcBorders>
+          </w:tcPr>
+          <w:p>
+            <w:pPr>
+              <w:spacing w:after="40"/>
+              <w:jc w:val="right"/>
+            </w:pPr>
+            <w:r/>
+            <w:r>
+              <w:rPr>
+                <w:rFonts w:ascii="Arial" w:hAnsi="Arial"/>
+                <w:b w:val="0"/>
+                <w:color w:val="1F2A24"/>
+                <w:sz w:val="20"/>
+              </w:rPr>
+              <w:t>קורס</w:t>
+            </w:r>
+          </w:p>
+        </w:tc>
+        <w:tc>
+          <w:tcPr>
+            <w:tcW w:type="dxa" w:w="5112"/>
+            <w:shd w:fill="FFFFFF"/>
+            <w:vAlign w:val="center"/>
+            <w:tcBorders>
+              <w:top w:val="single" w:sz="5" w:color="D8D1C3"/>
+              <w:left w:val="single" w:sz="5" w:color="D8D1C3"/>
+              <w:bottom w:val="single" w:sz="5" w:color="D8D1C3"/>
+              <w:right w:val="single" w:sz="5" w:color="D8D1C3"/>
+            </w:tcBorders>
+          </w:tcPr>
+          <w:p>
+            <w:pPr>
+              <w:spacing w:after="40"/>
+              <w:jc w:val="right"/>
+            </w:pPr>
+            <w:r/>
+            <w:r>
+              <w:rPr>
+                <w:rFonts w:ascii="Arial" w:hAnsi="Arial"/>
+                <w:b w:val="0"/>
+                <w:color w:val="1F2A24"/>
+                <w:sz w:val="20"/>
+              </w:rPr>
+              <w:t>פרסום בגוגל</w:t>
+            </w:r>
+          </w:p>
+        </w:tc>
+      </w:tr>
+      <w:tr>
+        <w:tc>
+          <w:tcPr>
+            <w:tcW w:type="dxa" w:w="5112"/>
+            <w:shd w:fill="F8F3EA"/>
+            <w:vAlign w:val="center"/>
+            <w:tcBorders>
+              <w:top w:val="single" w:sz="5" w:color="D8D1C3"/>
+              <w:left w:val="single" w:sz="5" w:color="D8D1C3"/>
+              <w:bottom w:val="single" w:sz="5" w:color="D8D1C3"/>
+              <w:right w:val="single" w:sz="5" w:color="D8D1C3"/>
+            </w:tcBorders>
+          </w:tcPr>
+          <w:p>
+            <w:pPr>
+              <w:spacing w:after="40"/>
+              <w:jc w:val="right"/>
+            </w:pPr>
+            <w:r/>
+            <w:r>
+              <w:rPr>
+                <w:rFonts w:ascii="Arial" w:hAnsi="Arial"/>
+                <w:b w:val="0"/>
+                <w:color w:val="1F2A24"/>
+                <w:sz w:val="20"/>
+              </w:rPr>
+              <w:t>מספר חשבון Google Ads</w:t>
+            </w:r>
+          </w:p>
+        </w:tc>
+        <w:tc>
+          <w:tcPr>
+            <w:tcW w:type="dxa" w:w="5112"/>
+            <w:shd w:fill="F8F3EA"/>
+            <w:vAlign w:val="center"/>
+            <w:tcBorders>
+              <w:top w:val="single" w:sz="5" w:color="D8D1C3"/>
+              <w:left w:val="single" w:sz="5" w:color="D8D1C3"/>
+              <w:bottom w:val="single" w:sz="5" w:color="D8D1C3"/>
+              <w:right w:val="single" w:sz="5" w:color="D8D1C3"/>
+            </w:tcBorders>
+          </w:tcPr>
+          <w:p>
+            <w:pPr>
+              <w:spacing w:after="40"/>
+              <w:jc w:val="right"/>
+            </w:pPr>
+            <w:r/>
+            <w:r>
+              <w:rPr>
+                <w:rFonts w:ascii="Arial" w:hAnsi="Arial"/>
+                <w:b w:val="0"/>
+                <w:color w:val="1F2A24"/>
+                <w:sz w:val="20"/>
+              </w:rPr>
+              <w:t>580-214-1692</w:t>
+            </w:r>
+          </w:p>
+        </w:tc>
+      </w:tr>
+      <w:tr>
+        <w:tc>
+          <w:tcPr>
+            <w:tcW w:type="dxa" w:w="5112"/>
+            <w:shd w:fill="FFFFFF"/>
+            <w:vAlign w:val="center"/>
+            <w:tcBorders>
+              <w:top w:val="single" w:sz="5" w:color="D8D1C3"/>
+              <w:left w:val="single" w:sz="5" w:color="D8D1C3"/>
+              <w:bottom w:val="single" w:sz="5" w:color="D8D1C3"/>
+              <w:right w:val="single" w:sz="5" w:color="D8D1C3"/>
+            </w:tcBorders>
+          </w:tcPr>
+          <w:p>
+            <w:pPr>
+              <w:spacing w:after="40"/>
+              <w:jc w:val="right"/>
+            </w:pPr>
+            <w:r/>
+            <w:r>
+              <w:rPr>
+                <w:rFonts w:ascii="Arial" w:hAnsi="Arial"/>
+                <w:b w:val="0"/>
+                <w:color w:val="1F2A24"/>
+                <w:sz w:val="20"/>
+              </w:rPr>
+              <w:t>תאריך הגשה</w:t>
+            </w:r>
+          </w:p>
+        </w:tc>
+        <w:tc>
+          <w:tcPr>
+            <w:tcW w:type="dxa" w:w="5112"/>
+            <w:shd w:fill="FFFFFF"/>
+            <w:vAlign w:val="center"/>
+            <w:tcBorders>
+              <w:top w:val="single" w:sz="5" w:color="D8D1C3"/>
+              <w:left w:val="single" w:sz="5" w:color="D8D1C3"/>
+              <w:bottom w:val="single" w:sz="5" w:color="D8D1C3"/>
+              <w:right w:val="single" w:sz="5" w:color="D8D1C3"/>
+            </w:tcBorders>
+          </w:tcPr>
+          <w:p>
+            <w:pPr>
+              <w:spacing w:after="40"/>
+              <w:jc w:val="right"/>
+            </w:pPr>
+            <w:r/>
+            <w:r>
+              <w:rPr>
+                <w:rFonts w:ascii="Arial" w:hAnsi="Arial"/>
+                <w:b w:val="0"/>
+                <w:color w:val="1F2A24"/>
+                <w:sz w:val="20"/>
+              </w:rPr>
+              <w:t>12/07/2026</w:t>
             </w:r>
           </w:p>
         </w:tc>
@@ -355,7 +675,35 @@
     </w:tbl>
     <w:p>
       <w:pPr>
-        <w:spacing w:after="140" w:line="276" w:lineRule="auto" w:before="280"/>
+        <w:spacing w:after="20" w:line="276" w:lineRule="auto"/>
+        <w:jc w:val="right"/>
+        <w:bidi w:val="1"/>
+      </w:pPr>
+    </w:p>
+    <w:p>
+      <w:pPr>
+        <w:spacing w:after="0" w:line="276" w:lineRule="auto"/>
+        <w:jc w:val="center"/>
+        <w:bidi w:val="1"/>
+      </w:pPr>
+      <w:r>
+        <w:rPr>
+          <w:rFonts w:ascii="Arial" w:hAnsi="Arial"/>
+          <w:b w:val="0"/>
+          <w:color w:val="6F706A"/>
+          <w:sz w:val="22"/>
+        </w:rPr>
+        <w:t>מסמך זה מציג את הארגון, דפי הנחיתה ומבנה הפעילות הפרסומית שנבנתה עבור LUMERA.</w:t>
+      </w:r>
+    </w:p>
+    <w:p>
+      <w:r>
+        <w:br w:type="page"/>
+      </w:r>
+    </w:p>
+    <w:p>
+      <w:pPr>
+        <w:spacing w:before="300" w:after="140"/>
         <w:jc w:val="right"/>
         <w:bidi w:val="1"/>
       </w:pPr>
@@ -364,9 +712,137 @@
           <w:rFonts w:ascii="Arial" w:hAnsi="Arial"/>
           <w:b/>
           <w:color w:val="5F7D68"/>
-          <w:sz w:val="34"/>
+          <w:sz w:val="36"/>
         </w:rPr>
-        <w:t>המוצרים</w:t>
+        <w:t>1. תיאור הארגון</w:t>
+      </w:r>
+    </w:p>
+    <w:p>
+      <w:pPr>
+        <w:spacing w:after="140" w:line="276" w:lineRule="auto"/>
+        <w:jc w:val="right"/>
+        <w:bidi w:val="1"/>
+      </w:pPr>
+      <w:r>
+        <w:rPr>
+          <w:rFonts w:ascii="Arial" w:hAnsi="Arial"/>
+          <w:b w:val="0"/>
+          <w:color w:val="1F2A24"/>
+          <w:sz w:val="22"/>
+        </w:rPr>
+        <w:t>LUMERA הוא סטודיו בוטיק לפילאטיס בנתניה ובאזור השרון. הסטודיו מציע אימוני רפורמר, שיעורי פילאטיס רצפה ואימונים פרטיים. המותג פונה למתאמנים ומתאמנות שמחפשים מסגרת מקצועית, יחס אישי ואימון שניתן להתאים לרמה ולמטרה שלהם.</w:t>
+      </w:r>
+    </w:p>
+    <w:p>
+      <w:pPr>
+        <w:spacing w:after="140" w:line="276" w:lineRule="auto"/>
+        <w:jc w:val="right"/>
+        <w:bidi w:val="1"/>
+      </w:pPr>
+      <w:r>
+        <w:rPr>
+          <w:rFonts w:ascii="Arial" w:hAnsi="Arial"/>
+          <w:b w:val="0"/>
+          <w:color w:val="1F2A24"/>
+          <w:sz w:val="22"/>
+        </w:rPr>
+        <w:t>האתר נבנה כדף נחיתה רב־עמודי. בכל דף קיים טופס השארת פרטים, והשלמת הטופס מעבירה את המשתמש לדף תודה. בדף התודה מופעל אירוע המרה של Google Ads.</w:t>
+      </w:r>
+    </w:p>
+    <w:p>
+      <w:pPr>
+        <w:spacing w:before="180" w:after="140"/>
+        <w:jc w:val="right"/>
+        <w:bidi w:val="1"/>
+      </w:pPr>
+      <w:r>
+        <w:rPr>
+          <w:rFonts w:ascii="Arial" w:hAnsi="Arial"/>
+          <w:b/>
+          <w:color w:val="1F2A24"/>
+          <w:sz w:val="26"/>
+        </w:rPr>
+        <w:t>2. המוצרים שנבחרו</w:t>
+      </w:r>
+    </w:p>
+    <w:p>
+      <w:pPr>
+        <w:spacing w:after="60" w:line="276" w:lineRule="auto"/>
+        <w:jc w:val="right"/>
+        <w:bidi w:val="1"/>
+      </w:pPr>
+      <w:r>
+        <w:rPr>
+          <w:rFonts w:ascii="Arial" w:hAnsi="Arial"/>
+          <w:b/>
+          <w:color w:val="5F7D68"/>
+          <w:sz w:val="24"/>
+        </w:rPr>
+        <w:t>א. פילאטיס מכשירים / רפורמר</w:t>
+      </w:r>
+    </w:p>
+    <w:p>
+      <w:pPr>
+        <w:spacing w:after="140" w:line="276" w:lineRule="auto"/>
+        <w:jc w:val="right"/>
+        <w:bidi w:val="1"/>
+      </w:pPr>
+      <w:r>
+        <w:rPr>
+          <w:rFonts w:ascii="Arial" w:hAnsi="Arial"/>
+          <w:b w:val="0"/>
+          <w:color w:val="1F2A24"/>
+          <w:sz w:val="21"/>
+        </w:rPr>
+        <w:t>אימון על מכשיר רפורמר המשלב התנגדות, שליטה ודיוק. המסלול מתאים למתחילים ולמתאמנים מנוסים, ויכול לשמש לחיזוק שרירי הליבה, לשיפור היציבה, להגדלת טווחי תנועה ולבניית הרגלי תנועה נכונים. העבודה בקבוצה קטנה מאפשרת למדריך לתת תיקונים והתאמות במהלך השיעור.</w:t>
+      </w:r>
+    </w:p>
+    <w:p>
+      <w:pPr>
+        <w:spacing w:after="60" w:line="276" w:lineRule="auto"/>
+        <w:jc w:val="right"/>
+        <w:bidi w:val="1"/>
+      </w:pPr>
+      <w:r>
+        <w:rPr>
+          <w:rFonts w:ascii="Arial" w:hAnsi="Arial"/>
+          <w:b/>
+          <w:color w:val="5F7D68"/>
+          <w:sz w:val="24"/>
+        </w:rPr>
+        <w:t>ב. אימון פילאטיס פרטי 1 על 1</w:t>
+      </w:r>
+    </w:p>
+    <w:p>
+      <w:pPr>
+        <w:spacing w:after="140" w:line="276" w:lineRule="auto"/>
+        <w:jc w:val="right"/>
+        <w:bidi w:val="1"/>
+      </w:pPr>
+      <w:r>
+        <w:rPr>
+          <w:rFonts w:ascii="Arial" w:hAnsi="Arial"/>
+          <w:b w:val="0"/>
+          <w:color w:val="1F2A24"/>
+          <w:sz w:val="21"/>
+        </w:rPr>
+        <w:t>מסלול אישי שבו תוכן האימון, הקצב והתרגילים נבנים סביב המטרות והצרכים של המתאמן. האימון מתאים למי שמעדיף ליווי צמוד, למי שחוזר לפעילות לאחר הפסקה או פציעה, ולמי שמעוניין בתוכנית גמישה וממוקדת יותר.</w:t>
+      </w:r>
+    </w:p>
+    <w:p>
+      <w:pPr>
+        <w:spacing w:before="300" w:after="140"/>
+        <w:jc w:val="right"/>
+        <w:bidi w:val="1"/>
+      </w:pPr>
+      <w:r>
+        <w:rPr>
+          <w:rFonts w:ascii="Arial" w:hAnsi="Arial"/>
+          <w:b/>
+          <w:color w:val="5F7D68"/>
+          <w:sz w:val="36"/>
+        </w:rPr>
+        <w:t>3. דפי הנחיתה</w:t>
       </w:r>
     </w:p>
     <w:tbl>
@@ -377,231 +853,26 @@
         <w:tblLook w:firstColumn="1" w:firstRow="1" w:lastColumn="0" w:lastRow="0" w:noHBand="0" w:noVBand="1" w:val="04A0"/>
       </w:tblPr>
       <w:tblGrid>
-        <w:gridCol w:w="5040"/>
-        <w:gridCol w:w="5040"/>
+        <w:gridCol w:w="5112"/>
+        <w:gridCol w:w="5112"/>
       </w:tblGrid>
       <w:tr>
         <w:tc>
           <w:tcPr>
-            <w:tcW w:type="dxa" w:w="5040"/>
+            <w:tcW w:type="dxa" w:w="5112"/>
             <w:shd w:fill="5F7D68"/>
             <w:vAlign w:val="center"/>
+            <w:tcBorders>
+              <w:top w:val="single" w:sz="5" w:color="D8D1C3"/>
+              <w:left w:val="single" w:sz="5" w:color="D8D1C3"/>
+              <w:bottom w:val="single" w:sz="5" w:color="D8D1C3"/>
+              <w:right w:val="single" w:sz="5" w:color="D8D1C3"/>
+            </w:tcBorders>
           </w:tcPr>
           <w:p>
             <w:pPr>
-              <w:spacing w:after="0"/>
+              <w:spacing w:after="40"/>
               <w:jc w:val="right"/>
-              <w:bidi w:val="1"/>
-            </w:pPr>
-            <w:r/>
-            <w:r>
-              <w:rPr>
-                <w:rFonts w:ascii="Arial" w:hAnsi="Arial"/>
-                <w:b/>
-                <w:color w:val="FFFFFF"/>
-                <w:sz w:val="21"/>
-              </w:rPr>
-              <w:t>מוצר</w:t>
-            </w:r>
-          </w:p>
-        </w:tc>
-        <w:tc>
-          <w:tcPr>
-            <w:tcW w:type="dxa" w:w="5040"/>
-            <w:shd w:fill="5F7D68"/>
-            <w:vAlign w:val="center"/>
-          </w:tcPr>
-          <w:p>
-            <w:pPr>
-              <w:spacing w:after="0"/>
-              <w:jc w:val="right"/>
-              <w:bidi w:val="1"/>
-            </w:pPr>
-            <w:r/>
-            <w:r>
-              <w:rPr>
-                <w:rFonts w:ascii="Arial" w:hAnsi="Arial"/>
-                <w:b/>
-                <w:color w:val="FFFFFF"/>
-                <w:sz w:val="21"/>
-              </w:rPr>
-              <w:t>תיאור</w:t>
-            </w:r>
-          </w:p>
-        </w:tc>
-      </w:tr>
-      <w:tr>
-        <w:tc>
-          <w:tcPr>
-            <w:tcW w:type="dxa" w:w="5040"/>
-            <w:shd w:fill="F8F3EA"/>
-            <w:vAlign w:val="center"/>
-          </w:tcPr>
-          <w:p>
-            <w:pPr>
-              <w:spacing w:after="0"/>
-              <w:jc w:val="right"/>
-              <w:bidi w:val="1"/>
-            </w:pPr>
-            <w:r/>
-            <w:r>
-              <w:rPr>
-                <w:rFonts w:ascii="Arial" w:hAnsi="Arial"/>
-                <w:b w:val="0"/>
-                <w:color w:val="1F2A24"/>
-                <w:sz w:val="21"/>
-              </w:rPr>
-              <w:t>פילאטיס מכשירים / רפורמר</w:t>
-            </w:r>
-          </w:p>
-        </w:tc>
-        <w:tc>
-          <w:tcPr>
-            <w:tcW w:type="dxa" w:w="5040"/>
-            <w:shd w:fill="F8F3EA"/>
-            <w:vAlign w:val="center"/>
-          </w:tcPr>
-          <w:p>
-            <w:pPr>
-              <w:spacing w:after="0"/>
-              <w:jc w:val="right"/>
-              <w:bidi w:val="1"/>
-            </w:pPr>
-            <w:r/>
-            <w:r>
-              <w:rPr>
-                <w:rFonts w:ascii="Arial" w:hAnsi="Arial"/>
-                <w:b w:val="0"/>
-                <w:color w:val="1F2A24"/>
-                <w:sz w:val="21"/>
-              </w:rPr>
-              <w:t>אימון על מכשיר רפורמר לחיזוק, שיפור יציבה, שליטה בתנועה והתאמה לרמת המתאמן.</w:t>
-            </w:r>
-          </w:p>
-        </w:tc>
-      </w:tr>
-      <w:tr>
-        <w:tc>
-          <w:tcPr>
-            <w:tcW w:type="dxa" w:w="5040"/>
-            <w:shd w:fill="FFFFFF"/>
-            <w:vAlign w:val="center"/>
-          </w:tcPr>
-          <w:p>
-            <w:pPr>
-              <w:spacing w:after="0"/>
-              <w:jc w:val="right"/>
-              <w:bidi w:val="1"/>
-            </w:pPr>
-            <w:r/>
-            <w:r>
-              <w:rPr>
-                <w:rFonts w:ascii="Arial" w:hAnsi="Arial"/>
-                <w:b w:val="0"/>
-                <w:color w:val="1F2A24"/>
-                <w:sz w:val="21"/>
-              </w:rPr>
-              <w:t>אימון פילאטיס פרטי 1 על 1</w:t>
-            </w:r>
-          </w:p>
-        </w:tc>
-        <w:tc>
-          <w:tcPr>
-            <w:tcW w:type="dxa" w:w="5040"/>
-            <w:shd w:fill="FFFFFF"/>
-            <w:vAlign w:val="center"/>
-          </w:tcPr>
-          <w:p>
-            <w:pPr>
-              <w:spacing w:after="0"/>
-              <w:jc w:val="right"/>
-              <w:bidi w:val="1"/>
-            </w:pPr>
-            <w:r/>
-            <w:r>
-              <w:rPr>
-                <w:rFonts w:ascii="Arial" w:hAnsi="Arial"/>
-                <w:b w:val="0"/>
-                <w:color w:val="1F2A24"/>
-                <w:sz w:val="21"/>
-              </w:rPr>
-              <w:t>אימון אישי עם תוכנית מותאמת, ליווי צמוד וגמישות בתוכן ובקצב האימון.</w:t>
-            </w:r>
-          </w:p>
-        </w:tc>
-      </w:tr>
-    </w:tbl>
-    <w:p>
-      <w:pPr>
-        <w:spacing w:after="140" w:line="276" w:lineRule="auto" w:before="280"/>
-        <w:jc w:val="right"/>
-        <w:bidi w:val="1"/>
-      </w:pPr>
-      <w:r>
-        <w:rPr>
-          <w:rFonts w:ascii="Arial" w:hAnsi="Arial"/>
-          <w:b/>
-          <w:color w:val="5F7D68"/>
-          <w:sz w:val="34"/>
-        </w:rPr>
-        <w:t>תיאור הארגון</w:t>
-      </w:r>
-    </w:p>
-    <w:p>
-      <w:pPr>
-        <w:spacing w:after="200" w:line="276" w:lineRule="auto"/>
-        <w:jc w:val="right"/>
-        <w:bidi w:val="1"/>
-      </w:pPr>
-      <w:r>
-        <w:rPr>
-          <w:rFonts w:ascii="Arial" w:hAnsi="Arial"/>
-          <w:b w:val="0"/>
-          <w:color w:val="1F2A24"/>
-          <w:sz w:val="22"/>
-        </w:rPr>
-        <w:t>LUMERA הוא סטודיו בוטיק לפילאטיס בנתניה ובאזור השרון. הסטודיו מציע אימוני רפורמר ואימונים פרטיים, באווירה מקצועית ושקטה, עם דגש על יחס אישי, התאמה למטרות המתאמן ושיפור הכושר, היציבה ואיכות התנועה.</w:t>
-      </w:r>
-    </w:p>
-    <w:p>
-      <w:pPr>
-        <w:spacing w:after="140" w:line="276" w:lineRule="auto" w:before="280"/>
-        <w:jc w:val="right"/>
-        <w:bidi w:val="1"/>
-      </w:pPr>
-      <w:r>
-        <w:rPr>
-          <w:rFonts w:ascii="Arial" w:hAnsi="Arial"/>
-          <w:b/>
-          <w:color w:val="5F7D68"/>
-          <w:sz w:val="34"/>
-        </w:rPr>
-        <w:t>כתובות דפי הנחיתה</w:t>
-      </w:r>
-    </w:p>
-    <w:tbl>
-      <w:tblPr>
-        <w:tblStyle w:val="TableGrid"/>
-        <w:tblW w:type="auto" w:w="0"/>
-        <w:jc w:val="center"/>
-        <w:tblLook w:firstColumn="1" w:firstRow="1" w:lastColumn="0" w:lastRow="0" w:noHBand="0" w:noVBand="1" w:val="04A0"/>
-      </w:tblPr>
-      <w:tblGrid>
-        <w:gridCol w:w="5040"/>
-        <w:gridCol w:w="5040"/>
-      </w:tblGrid>
-      <w:tr>
-        <w:tc>
-          <w:tcPr>
-            <w:tcW w:type="dxa" w:w="5040"/>
-            <w:shd w:fill="5F7D68"/>
-            <w:vAlign w:val="center"/>
-          </w:tcPr>
-          <w:p>
-            <w:pPr>
-              <w:spacing w:after="0"/>
-              <w:jc w:val="right"/>
-              <w:bidi w:val="1"/>
             </w:pPr>
             <w:r/>
             <w:r>
@@ -617,15 +888,20 @@
         </w:tc>
         <w:tc>
           <w:tcPr>
-            <w:tcW w:type="dxa" w:w="5040"/>
+            <w:tcW w:type="dxa" w:w="5112"/>
             <w:shd w:fill="5F7D68"/>
             <w:vAlign w:val="center"/>
+            <w:tcBorders>
+              <w:top w:val="single" w:sz="5" w:color="D8D1C3"/>
+              <w:left w:val="single" w:sz="5" w:color="D8D1C3"/>
+              <w:bottom w:val="single" w:sz="5" w:color="D8D1C3"/>
+              <w:right w:val="single" w:sz="5" w:color="D8D1C3"/>
+            </w:tcBorders>
           </w:tcPr>
           <w:p>
             <w:pPr>
-              <w:spacing w:after="0"/>
+              <w:spacing w:after="40"/>
               <w:jc w:val="right"/>
-              <w:bidi w:val="1"/>
             </w:pPr>
             <w:r/>
             <w:r>
@@ -643,15 +919,20 @@
       <w:tr>
         <w:tc>
           <w:tcPr>
-            <w:tcW w:type="dxa" w:w="5040"/>
+            <w:tcW w:type="dxa" w:w="5112"/>
             <w:shd w:fill="F8F3EA"/>
             <w:vAlign w:val="center"/>
+            <w:tcBorders>
+              <w:top w:val="single" w:sz="5" w:color="D8D1C3"/>
+              <w:left w:val="single" w:sz="5" w:color="D8D1C3"/>
+              <w:bottom w:val="single" w:sz="5" w:color="D8D1C3"/>
+              <w:right w:val="single" w:sz="5" w:color="D8D1C3"/>
+            </w:tcBorders>
           </w:tcPr>
           <w:p>
             <w:pPr>
-              <w:spacing w:after="0"/>
+              <w:spacing w:after="40"/>
               <w:jc w:val="right"/>
-              <w:bidi w:val="1"/>
             </w:pPr>
             <w:r/>
             <w:r>
@@ -659,7 +940,7 @@
                 <w:rFonts w:ascii="Arial" w:hAnsi="Arial"/>
                 <w:b w:val="0"/>
                 <w:color w:val="1F2A24"/>
-                <w:sz w:val="21"/>
+                <w:sz w:val="20"/>
               </w:rPr>
               <w:t>דף הבית</w:t>
             </w:r>
@@ -667,15 +948,20 @@
         </w:tc>
         <w:tc>
           <w:tcPr>
-            <w:tcW w:type="dxa" w:w="5040"/>
+            <w:tcW w:type="dxa" w:w="5112"/>
             <w:shd w:fill="F8F3EA"/>
             <w:vAlign w:val="center"/>
+            <w:tcBorders>
+              <w:top w:val="single" w:sz="5" w:color="D8D1C3"/>
+              <w:left w:val="single" w:sz="5" w:color="D8D1C3"/>
+              <w:bottom w:val="single" w:sz="5" w:color="D8D1C3"/>
+              <w:right w:val="single" w:sz="5" w:color="D8D1C3"/>
+            </w:tcBorders>
           </w:tcPr>
           <w:p>
             <w:pPr>
-              <w:spacing w:after="0"/>
+              <w:spacing w:after="40"/>
               <w:jc w:val="right"/>
-              <w:bidi w:val="1"/>
             </w:pPr>
             <w:r/>
             <w:r>
@@ -683,7 +969,7 @@
                 <w:rFonts w:ascii="Arial" w:hAnsi="Arial"/>
                 <w:b w:val="0"/>
                 <w:color w:val="1F2A24"/>
-                <w:sz w:val="21"/>
+                <w:sz w:val="20"/>
               </w:rPr>
               <w:t>https://avitheuser1-ship-it.github.io/pilates-landing/</w:t>
             </w:r>
@@ -693,15 +979,20 @@
       <w:tr>
         <w:tc>
           <w:tcPr>
-            <w:tcW w:type="dxa" w:w="5040"/>
+            <w:tcW w:type="dxa" w:w="5112"/>
             <w:shd w:fill="FFFFFF"/>
             <w:vAlign w:val="center"/>
+            <w:tcBorders>
+              <w:top w:val="single" w:sz="5" w:color="D8D1C3"/>
+              <w:left w:val="single" w:sz="5" w:color="D8D1C3"/>
+              <w:bottom w:val="single" w:sz="5" w:color="D8D1C3"/>
+              <w:right w:val="single" w:sz="5" w:color="D8D1C3"/>
+            </w:tcBorders>
           </w:tcPr>
           <w:p>
             <w:pPr>
-              <w:spacing w:after="0"/>
+              <w:spacing w:after="40"/>
               <w:jc w:val="right"/>
-              <w:bidi w:val="1"/>
             </w:pPr>
             <w:r/>
             <w:r>
@@ -709,7 +1000,7 @@
                 <w:rFonts w:ascii="Arial" w:hAnsi="Arial"/>
                 <w:b w:val="0"/>
                 <w:color w:val="1F2A24"/>
-                <w:sz w:val="21"/>
+                <w:sz w:val="20"/>
               </w:rPr>
               <w:t>פילאטיס מכשירים / רפורמר</w:t>
             </w:r>
@@ -717,15 +1008,20 @@
         </w:tc>
         <w:tc>
           <w:tcPr>
-            <w:tcW w:type="dxa" w:w="5040"/>
+            <w:tcW w:type="dxa" w:w="5112"/>
             <w:shd w:fill="FFFFFF"/>
             <w:vAlign w:val="center"/>
+            <w:tcBorders>
+              <w:top w:val="single" w:sz="5" w:color="D8D1C3"/>
+              <w:left w:val="single" w:sz="5" w:color="D8D1C3"/>
+              <w:bottom w:val="single" w:sz="5" w:color="D8D1C3"/>
+              <w:right w:val="single" w:sz="5" w:color="D8D1C3"/>
+            </w:tcBorders>
           </w:tcPr>
           <w:p>
             <w:pPr>
-              <w:spacing w:after="0"/>
+              <w:spacing w:after="40"/>
               <w:jc w:val="right"/>
-              <w:bidi w:val="1"/>
             </w:pPr>
             <w:r/>
             <w:r>
@@ -733,7 +1029,7 @@
                 <w:rFonts w:ascii="Arial" w:hAnsi="Arial"/>
                 <w:b w:val="0"/>
                 <w:color w:val="1F2A24"/>
-                <w:sz w:val="21"/>
+                <w:sz w:val="20"/>
               </w:rPr>
               <w:t>https://avitheuser1-ship-it.github.io/pilates-landing/product1.html</w:t>
             </w:r>
@@ -743,15 +1039,20 @@
       <w:tr>
         <w:tc>
           <w:tcPr>
-            <w:tcW w:type="dxa" w:w="5040"/>
+            <w:tcW w:type="dxa" w:w="5112"/>
             <w:shd w:fill="F8F3EA"/>
             <w:vAlign w:val="center"/>
+            <w:tcBorders>
+              <w:top w:val="single" w:sz="5" w:color="D8D1C3"/>
+              <w:left w:val="single" w:sz="5" w:color="D8D1C3"/>
+              <w:bottom w:val="single" w:sz="5" w:color="D8D1C3"/>
+              <w:right w:val="single" w:sz="5" w:color="D8D1C3"/>
+            </w:tcBorders>
           </w:tcPr>
           <w:p>
             <w:pPr>
-              <w:spacing w:after="0"/>
+              <w:spacing w:after="40"/>
               <w:jc w:val="right"/>
-              <w:bidi w:val="1"/>
             </w:pPr>
             <w:r/>
             <w:r>
@@ -759,7 +1060,7 @@
                 <w:rFonts w:ascii="Arial" w:hAnsi="Arial"/>
                 <w:b w:val="0"/>
                 <w:color w:val="1F2A24"/>
-                <w:sz w:val="21"/>
+                <w:sz w:val="20"/>
               </w:rPr>
               <w:t>חוג פילאטיס רצפה</w:t>
             </w:r>
@@ -767,15 +1068,20 @@
         </w:tc>
         <w:tc>
           <w:tcPr>
-            <w:tcW w:type="dxa" w:w="5040"/>
+            <w:tcW w:type="dxa" w:w="5112"/>
             <w:shd w:fill="F8F3EA"/>
             <w:vAlign w:val="center"/>
+            <w:tcBorders>
+              <w:top w:val="single" w:sz="5" w:color="D8D1C3"/>
+              <w:left w:val="single" w:sz="5" w:color="D8D1C3"/>
+              <w:bottom w:val="single" w:sz="5" w:color="D8D1C3"/>
+              <w:right w:val="single" w:sz="5" w:color="D8D1C3"/>
+            </w:tcBorders>
           </w:tcPr>
           <w:p>
             <w:pPr>
-              <w:spacing w:after="0"/>
+              <w:spacing w:after="40"/>
               <w:jc w:val="right"/>
-              <w:bidi w:val="1"/>
             </w:pPr>
             <w:r/>
             <w:r>
@@ -783,7 +1089,7 @@
                 <w:rFonts w:ascii="Arial" w:hAnsi="Arial"/>
                 <w:b w:val="0"/>
                 <w:color w:val="1F2A24"/>
-                <w:sz w:val="21"/>
+                <w:sz w:val="20"/>
               </w:rPr>
               <w:t>https://avitheuser1-ship-it.github.io/pilates-landing/product2.html</w:t>
             </w:r>
@@ -793,15 +1099,20 @@
       <w:tr>
         <w:tc>
           <w:tcPr>
-            <w:tcW w:type="dxa" w:w="5040"/>
+            <w:tcW w:type="dxa" w:w="5112"/>
             <w:shd w:fill="FFFFFF"/>
             <w:vAlign w:val="center"/>
+            <w:tcBorders>
+              <w:top w:val="single" w:sz="5" w:color="D8D1C3"/>
+              <w:left w:val="single" w:sz="5" w:color="D8D1C3"/>
+              <w:bottom w:val="single" w:sz="5" w:color="D8D1C3"/>
+              <w:right w:val="single" w:sz="5" w:color="D8D1C3"/>
+            </w:tcBorders>
           </w:tcPr>
           <w:p>
             <w:pPr>
-              <w:spacing w:after="0"/>
+              <w:spacing w:after="40"/>
               <w:jc w:val="right"/>
-              <w:bidi w:val="1"/>
             </w:pPr>
             <w:r/>
             <w:r>
@@ -809,7 +1120,7 @@
                 <w:rFonts w:ascii="Arial" w:hAnsi="Arial"/>
                 <w:b w:val="0"/>
                 <w:color w:val="1F2A24"/>
-                <w:sz w:val="21"/>
+                <w:sz w:val="20"/>
               </w:rPr>
               <w:t>אימון פרטי 1 על 1</w:t>
             </w:r>
@@ -817,15 +1128,20 @@
         </w:tc>
         <w:tc>
           <w:tcPr>
-            <w:tcW w:type="dxa" w:w="5040"/>
+            <w:tcW w:type="dxa" w:w="5112"/>
             <w:shd w:fill="FFFFFF"/>
             <w:vAlign w:val="center"/>
+            <w:tcBorders>
+              <w:top w:val="single" w:sz="5" w:color="D8D1C3"/>
+              <w:left w:val="single" w:sz="5" w:color="D8D1C3"/>
+              <w:bottom w:val="single" w:sz="5" w:color="D8D1C3"/>
+              <w:right w:val="single" w:sz="5" w:color="D8D1C3"/>
+            </w:tcBorders>
           </w:tcPr>
           <w:p>
             <w:pPr>
-              <w:spacing w:after="0"/>
+              <w:spacing w:after="40"/>
               <w:jc w:val="right"/>
-              <w:bidi w:val="1"/>
             </w:pPr>
             <w:r/>
             <w:r>
@@ -833,7 +1149,7 @@
                 <w:rFonts w:ascii="Arial" w:hAnsi="Arial"/>
                 <w:b w:val="0"/>
                 <w:color w:val="1F2A24"/>
-                <w:sz w:val="21"/>
+                <w:sz w:val="20"/>
               </w:rPr>
               <w:t>https://avitheuser1-ship-it.github.io/pilates-landing/product3.html</w:t>
             </w:r>
@@ -843,15 +1159,20 @@
       <w:tr>
         <w:tc>
           <w:tcPr>
-            <w:tcW w:type="dxa" w:w="5040"/>
+            <w:tcW w:type="dxa" w:w="5112"/>
             <w:shd w:fill="F8F3EA"/>
             <w:vAlign w:val="center"/>
+            <w:tcBorders>
+              <w:top w:val="single" w:sz="5" w:color="D8D1C3"/>
+              <w:left w:val="single" w:sz="5" w:color="D8D1C3"/>
+              <w:bottom w:val="single" w:sz="5" w:color="D8D1C3"/>
+              <w:right w:val="single" w:sz="5" w:color="D8D1C3"/>
+            </w:tcBorders>
           </w:tcPr>
           <w:p>
             <w:pPr>
-              <w:spacing w:after="0"/>
+              <w:spacing w:after="40"/>
               <w:jc w:val="right"/>
-              <w:bidi w:val="1"/>
             </w:pPr>
             <w:r/>
             <w:r>
@@ -859,7 +1180,7 @@
                 <w:rFonts w:ascii="Arial" w:hAnsi="Arial"/>
                 <w:b w:val="0"/>
                 <w:color w:val="1F2A24"/>
-                <w:sz w:val="21"/>
+                <w:sz w:val="20"/>
               </w:rPr>
               <w:t>דף תודה</w:t>
             </w:r>
@@ -867,15 +1188,20 @@
         </w:tc>
         <w:tc>
           <w:tcPr>
-            <w:tcW w:type="dxa" w:w="5040"/>
+            <w:tcW w:type="dxa" w:w="5112"/>
             <w:shd w:fill="F8F3EA"/>
             <w:vAlign w:val="center"/>
+            <w:tcBorders>
+              <w:top w:val="single" w:sz="5" w:color="D8D1C3"/>
+              <w:left w:val="single" w:sz="5" w:color="D8D1C3"/>
+              <w:bottom w:val="single" w:sz="5" w:color="D8D1C3"/>
+              <w:right w:val="single" w:sz="5" w:color="D8D1C3"/>
+            </w:tcBorders>
           </w:tcPr>
           <w:p>
             <w:pPr>
-              <w:spacing w:after="0"/>
+              <w:spacing w:after="40"/>
               <w:jc w:val="right"/>
-              <w:bidi w:val="1"/>
             </w:pPr>
             <w:r/>
             <w:r>
@@ -883,7 +1209,7 @@
                 <w:rFonts w:ascii="Arial" w:hAnsi="Arial"/>
                 <w:b w:val="0"/>
                 <w:color w:val="1F2A24"/>
-                <w:sz w:val="21"/>
+                <w:sz w:val="20"/>
               </w:rPr>
               <w:t>https://avitheuser1-ship-it.github.io/pilates-landing/thank-you.html</w:t>
             </w:r>
@@ -893,7 +1219,28 @@
     </w:tbl>
     <w:p>
       <w:pPr>
-        <w:spacing w:after="140" w:line="276" w:lineRule="auto" w:before="280"/>
+        <w:spacing w:after="140" w:line="276" w:lineRule="auto"/>
+        <w:jc w:val="right"/>
+        <w:bidi w:val="1"/>
+      </w:pPr>
+      <w:r>
+        <w:rPr>
+          <w:rFonts w:ascii="Arial" w:hAnsi="Arial"/>
+          <w:b w:val="0"/>
+          <w:color w:val="6F706A"/>
+          <w:sz w:val="21"/>
+        </w:rPr>
+        <w:t>האתר אינו כולל תפריט ניווט, טלפון או הפניות לרשתות חברתיות. בדפים משולב הלוגו של LUMERA, והטופס מוביל לדף תודה לאחר שליחה.</w:t>
+      </w:r>
+    </w:p>
+    <w:p>
+      <w:r>
+        <w:br w:type="page"/>
+      </w:r>
+    </w:p>
+    <w:p>
+      <w:pPr>
+        <w:spacing w:before="300" w:after="140"/>
         <w:jc w:val="right"/>
         <w:bidi w:val="1"/>
       </w:pPr>
@@ -902,14 +1249,752 @@
           <w:rFonts w:ascii="Arial" w:hAnsi="Arial"/>
           <w:b/>
           <w:color w:val="5F7D68"/>
-          <w:sz w:val="34"/>
+          <w:sz w:val="36"/>
         </w:rPr>
-        <w:t>מספר חשבון פרסום בגוגל</w:t>
+        <w:t>4. מבנה חשבון Google Ads</w:t>
+      </w:r>
+    </w:p>
+    <w:tbl>
+      <w:tblPr>
+        <w:tblStyle w:val="TableGrid"/>
+        <w:tblW w:type="auto" w:w="0"/>
+        <w:jc w:val="center"/>
+        <w:tblLook w:firstColumn="1" w:firstRow="1" w:lastColumn="0" w:lastRow="0" w:noHBand="0" w:noVBand="1" w:val="04A0"/>
+      </w:tblPr>
+      <w:tblGrid>
+        <w:gridCol w:w="2556"/>
+        <w:gridCol w:w="2556"/>
+        <w:gridCol w:w="2556"/>
+        <w:gridCol w:w="2556"/>
+      </w:tblGrid>
+      <w:tr>
+        <w:tc>
+          <w:tcPr>
+            <w:tcW w:type="dxa" w:w="2556"/>
+            <w:shd w:fill="5F7D68"/>
+            <w:vAlign w:val="center"/>
+            <w:tcBorders>
+              <w:top w:val="single" w:sz="5" w:color="D8D1C3"/>
+              <w:left w:val="single" w:sz="5" w:color="D8D1C3"/>
+              <w:bottom w:val="single" w:sz="5" w:color="D8D1C3"/>
+              <w:right w:val="single" w:sz="5" w:color="D8D1C3"/>
+            </w:tcBorders>
+          </w:tcPr>
+          <w:p>
+            <w:pPr>
+              <w:spacing w:after="40"/>
+              <w:jc w:val="right"/>
+            </w:pPr>
+            <w:r/>
+            <w:r>
+              <w:rPr>
+                <w:rFonts w:ascii="Arial" w:hAnsi="Arial"/>
+                <w:b/>
+                <w:color w:val="FFFFFF"/>
+                <w:sz w:val="21"/>
+              </w:rPr>
+              <w:t>קמפיין</w:t>
+            </w:r>
+          </w:p>
+        </w:tc>
+        <w:tc>
+          <w:tcPr>
+            <w:tcW w:type="dxa" w:w="2556"/>
+            <w:shd w:fill="5F7D68"/>
+            <w:vAlign w:val="center"/>
+            <w:tcBorders>
+              <w:top w:val="single" w:sz="5" w:color="D8D1C3"/>
+              <w:left w:val="single" w:sz="5" w:color="D8D1C3"/>
+              <w:bottom w:val="single" w:sz="5" w:color="D8D1C3"/>
+              <w:right w:val="single" w:sz="5" w:color="D8D1C3"/>
+            </w:tcBorders>
+          </w:tcPr>
+          <w:p>
+            <w:pPr>
+              <w:spacing w:after="40"/>
+              <w:jc w:val="right"/>
+            </w:pPr>
+            <w:r/>
+            <w:r>
+              <w:rPr>
+                <w:rFonts w:ascii="Arial" w:hAnsi="Arial"/>
+                <w:b/>
+                <w:color w:val="FFFFFF"/>
+                <w:sz w:val="21"/>
+              </w:rPr>
+              <w:t>סוג</w:t>
+            </w:r>
+          </w:p>
+        </w:tc>
+        <w:tc>
+          <w:tcPr>
+            <w:tcW w:type="dxa" w:w="2556"/>
+            <w:shd w:fill="5F7D68"/>
+            <w:vAlign w:val="center"/>
+            <w:tcBorders>
+              <w:top w:val="single" w:sz="5" w:color="D8D1C3"/>
+              <w:left w:val="single" w:sz="5" w:color="D8D1C3"/>
+              <w:bottom w:val="single" w:sz="5" w:color="D8D1C3"/>
+              <w:right w:val="single" w:sz="5" w:color="D8D1C3"/>
+            </w:tcBorders>
+          </w:tcPr>
+          <w:p>
+            <w:pPr>
+              <w:spacing w:after="40"/>
+              <w:jc w:val="right"/>
+            </w:pPr>
+            <w:r/>
+            <w:r>
+              <w:rPr>
+                <w:rFonts w:ascii="Arial" w:hAnsi="Arial"/>
+                <w:b/>
+                <w:color w:val="FFFFFF"/>
+                <w:sz w:val="21"/>
+              </w:rPr>
+              <w:t>תקציב יומי</w:t>
+            </w:r>
+          </w:p>
+        </w:tc>
+        <w:tc>
+          <w:tcPr>
+            <w:tcW w:type="dxa" w:w="2556"/>
+            <w:shd w:fill="5F7D68"/>
+            <w:vAlign w:val="center"/>
+            <w:tcBorders>
+              <w:top w:val="single" w:sz="5" w:color="D8D1C3"/>
+              <w:left w:val="single" w:sz="5" w:color="D8D1C3"/>
+              <w:bottom w:val="single" w:sz="5" w:color="D8D1C3"/>
+              <w:right w:val="single" w:sz="5" w:color="D8D1C3"/>
+            </w:tcBorders>
+          </w:tcPr>
+          <w:p>
+            <w:pPr>
+              <w:spacing w:after="40"/>
+              <w:jc w:val="right"/>
+            </w:pPr>
+            <w:r/>
+            <w:r>
+              <w:rPr>
+                <w:rFonts w:ascii="Arial" w:hAnsi="Arial"/>
+                <w:b/>
+                <w:color w:val="FFFFFF"/>
+                <w:sz w:val="21"/>
+              </w:rPr>
+              <w:t>סטטוס</w:t>
+            </w:r>
+          </w:p>
+        </w:tc>
+      </w:tr>
+      <w:tr>
+        <w:tc>
+          <w:tcPr>
+            <w:tcW w:type="dxa" w:w="2556"/>
+            <w:shd w:fill="F8F3EA"/>
+            <w:vAlign w:val="center"/>
+            <w:tcBorders>
+              <w:top w:val="single" w:sz="5" w:color="D8D1C3"/>
+              <w:left w:val="single" w:sz="5" w:color="D8D1C3"/>
+              <w:bottom w:val="single" w:sz="5" w:color="D8D1C3"/>
+              <w:right w:val="single" w:sz="5" w:color="D8D1C3"/>
+            </w:tcBorders>
+          </w:tcPr>
+          <w:p>
+            <w:pPr>
+              <w:spacing w:after="40"/>
+              <w:jc w:val="right"/>
+            </w:pPr>
+            <w:r/>
+            <w:r>
+              <w:rPr>
+                <w:rFonts w:ascii="Arial" w:hAnsi="Arial"/>
+                <w:b w:val="0"/>
+                <w:color w:val="1F2A24"/>
+                <w:sz w:val="20"/>
+              </w:rPr>
+              <w:t>קמפיין חיפוש</w:t>
+            </w:r>
+          </w:p>
+        </w:tc>
+        <w:tc>
+          <w:tcPr>
+            <w:tcW w:type="dxa" w:w="2556"/>
+            <w:shd w:fill="F8F3EA"/>
+            <w:vAlign w:val="center"/>
+            <w:tcBorders>
+              <w:top w:val="single" w:sz="5" w:color="D8D1C3"/>
+              <w:left w:val="single" w:sz="5" w:color="D8D1C3"/>
+              <w:bottom w:val="single" w:sz="5" w:color="D8D1C3"/>
+              <w:right w:val="single" w:sz="5" w:color="D8D1C3"/>
+            </w:tcBorders>
+          </w:tcPr>
+          <w:p>
+            <w:pPr>
+              <w:spacing w:after="40"/>
+              <w:jc w:val="right"/>
+            </w:pPr>
+            <w:r/>
+            <w:r>
+              <w:rPr>
+                <w:rFonts w:ascii="Arial" w:hAnsi="Arial"/>
+                <w:b w:val="0"/>
+                <w:color w:val="1F2A24"/>
+                <w:sz w:val="20"/>
+              </w:rPr>
+              <w:t>Search</w:t>
+            </w:r>
+          </w:p>
+        </w:tc>
+        <w:tc>
+          <w:tcPr>
+            <w:tcW w:type="dxa" w:w="2556"/>
+            <w:shd w:fill="F8F3EA"/>
+            <w:vAlign w:val="center"/>
+            <w:tcBorders>
+              <w:top w:val="single" w:sz="5" w:color="D8D1C3"/>
+              <w:left w:val="single" w:sz="5" w:color="D8D1C3"/>
+              <w:bottom w:val="single" w:sz="5" w:color="D8D1C3"/>
+              <w:right w:val="single" w:sz="5" w:color="D8D1C3"/>
+            </w:tcBorders>
+          </w:tcPr>
+          <w:p>
+            <w:pPr>
+              <w:spacing w:after="40"/>
+              <w:jc w:val="right"/>
+            </w:pPr>
+            <w:r/>
+            <w:r>
+              <w:rPr>
+                <w:rFonts w:ascii="Arial" w:hAnsi="Arial"/>
+                <w:b w:val="0"/>
+                <w:color w:val="1F2A24"/>
+                <w:sz w:val="20"/>
+              </w:rPr>
+              <w:t>30 ₪</w:t>
+            </w:r>
+          </w:p>
+        </w:tc>
+        <w:tc>
+          <w:tcPr>
+            <w:tcW w:type="dxa" w:w="2556"/>
+            <w:shd w:fill="F8F3EA"/>
+            <w:vAlign w:val="center"/>
+            <w:tcBorders>
+              <w:top w:val="single" w:sz="5" w:color="D8D1C3"/>
+              <w:left w:val="single" w:sz="5" w:color="D8D1C3"/>
+              <w:bottom w:val="single" w:sz="5" w:color="D8D1C3"/>
+              <w:right w:val="single" w:sz="5" w:color="D8D1C3"/>
+            </w:tcBorders>
+          </w:tcPr>
+          <w:p>
+            <w:pPr>
+              <w:spacing w:after="40"/>
+              <w:jc w:val="right"/>
+            </w:pPr>
+            <w:r/>
+            <w:r>
+              <w:rPr>
+                <w:rFonts w:ascii="Arial" w:hAnsi="Arial"/>
+                <w:b w:val="0"/>
+                <w:color w:val="1F2A24"/>
+                <w:sz w:val="20"/>
+              </w:rPr>
+              <w:t>מושהה</w:t>
+            </w:r>
+          </w:p>
+        </w:tc>
+      </w:tr>
+      <w:tr>
+        <w:tc>
+          <w:tcPr>
+            <w:tcW w:type="dxa" w:w="2556"/>
+            <w:shd w:fill="FFFFFF"/>
+            <w:vAlign w:val="center"/>
+            <w:tcBorders>
+              <w:top w:val="single" w:sz="5" w:color="D8D1C3"/>
+              <w:left w:val="single" w:sz="5" w:color="D8D1C3"/>
+              <w:bottom w:val="single" w:sz="5" w:color="D8D1C3"/>
+              <w:right w:val="single" w:sz="5" w:color="D8D1C3"/>
+            </w:tcBorders>
+          </w:tcPr>
+          <w:p>
+            <w:pPr>
+              <w:spacing w:after="40"/>
+              <w:jc w:val="right"/>
+            </w:pPr>
+            <w:r/>
+            <w:r>
+              <w:rPr>
+                <w:rFonts w:ascii="Arial" w:hAnsi="Arial"/>
+                <w:b w:val="0"/>
+                <w:color w:val="1F2A24"/>
+                <w:sz w:val="20"/>
+              </w:rPr>
+              <w:t>קמפיין מותג</w:t>
+            </w:r>
+          </w:p>
+        </w:tc>
+        <w:tc>
+          <w:tcPr>
+            <w:tcW w:type="dxa" w:w="2556"/>
+            <w:shd w:fill="FFFFFF"/>
+            <w:vAlign w:val="center"/>
+            <w:tcBorders>
+              <w:top w:val="single" w:sz="5" w:color="D8D1C3"/>
+              <w:left w:val="single" w:sz="5" w:color="D8D1C3"/>
+              <w:bottom w:val="single" w:sz="5" w:color="D8D1C3"/>
+              <w:right w:val="single" w:sz="5" w:color="D8D1C3"/>
+            </w:tcBorders>
+          </w:tcPr>
+          <w:p>
+            <w:pPr>
+              <w:spacing w:after="40"/>
+              <w:jc w:val="right"/>
+            </w:pPr>
+            <w:r/>
+            <w:r>
+              <w:rPr>
+                <w:rFonts w:ascii="Arial" w:hAnsi="Arial"/>
+                <w:b w:val="0"/>
+                <w:color w:val="1F2A24"/>
+                <w:sz w:val="20"/>
+              </w:rPr>
+              <w:t>Search</w:t>
+            </w:r>
+          </w:p>
+        </w:tc>
+        <w:tc>
+          <w:tcPr>
+            <w:tcW w:type="dxa" w:w="2556"/>
+            <w:shd w:fill="FFFFFF"/>
+            <w:vAlign w:val="center"/>
+            <w:tcBorders>
+              <w:top w:val="single" w:sz="5" w:color="D8D1C3"/>
+              <w:left w:val="single" w:sz="5" w:color="D8D1C3"/>
+              <w:bottom w:val="single" w:sz="5" w:color="D8D1C3"/>
+              <w:right w:val="single" w:sz="5" w:color="D8D1C3"/>
+            </w:tcBorders>
+          </w:tcPr>
+          <w:p>
+            <w:pPr>
+              <w:spacing w:after="40"/>
+              <w:jc w:val="right"/>
+            </w:pPr>
+            <w:r/>
+            <w:r>
+              <w:rPr>
+                <w:rFonts w:ascii="Arial" w:hAnsi="Arial"/>
+                <w:b w:val="0"/>
+                <w:color w:val="1F2A24"/>
+                <w:sz w:val="20"/>
+              </w:rPr>
+              <w:t>50 ₪</w:t>
+            </w:r>
+          </w:p>
+        </w:tc>
+        <w:tc>
+          <w:tcPr>
+            <w:tcW w:type="dxa" w:w="2556"/>
+            <w:shd w:fill="FFFFFF"/>
+            <w:vAlign w:val="center"/>
+            <w:tcBorders>
+              <w:top w:val="single" w:sz="5" w:color="D8D1C3"/>
+              <w:left w:val="single" w:sz="5" w:color="D8D1C3"/>
+              <w:bottom w:val="single" w:sz="5" w:color="D8D1C3"/>
+              <w:right w:val="single" w:sz="5" w:color="D8D1C3"/>
+            </w:tcBorders>
+          </w:tcPr>
+          <w:p>
+            <w:pPr>
+              <w:spacing w:after="40"/>
+              <w:jc w:val="right"/>
+            </w:pPr>
+            <w:r/>
+            <w:r>
+              <w:rPr>
+                <w:rFonts w:ascii="Arial" w:hAnsi="Arial"/>
+                <w:b w:val="0"/>
+                <w:color w:val="1F2A24"/>
+                <w:sz w:val="20"/>
+              </w:rPr>
+              <w:t>מושהה</w:t>
+            </w:r>
+          </w:p>
+        </w:tc>
+      </w:tr>
+      <w:tr>
+        <w:tc>
+          <w:tcPr>
+            <w:tcW w:type="dxa" w:w="2556"/>
+            <w:shd w:fill="F8F3EA"/>
+            <w:vAlign w:val="center"/>
+            <w:tcBorders>
+              <w:top w:val="single" w:sz="5" w:color="D8D1C3"/>
+              <w:left w:val="single" w:sz="5" w:color="D8D1C3"/>
+              <w:bottom w:val="single" w:sz="5" w:color="D8D1C3"/>
+              <w:right w:val="single" w:sz="5" w:color="D8D1C3"/>
+            </w:tcBorders>
+          </w:tcPr>
+          <w:p>
+            <w:pPr>
+              <w:spacing w:after="40"/>
+              <w:jc w:val="right"/>
+            </w:pPr>
+            <w:r/>
+            <w:r>
+              <w:rPr>
+                <w:rFonts w:ascii="Arial" w:hAnsi="Arial"/>
+                <w:b w:val="0"/>
+                <w:color w:val="1F2A24"/>
+                <w:sz w:val="20"/>
+              </w:rPr>
+              <w:t>קמפיין GDN</w:t>
+            </w:r>
+          </w:p>
+        </w:tc>
+        <w:tc>
+          <w:tcPr>
+            <w:tcW w:type="dxa" w:w="2556"/>
+            <w:shd w:fill="F8F3EA"/>
+            <w:vAlign w:val="center"/>
+            <w:tcBorders>
+              <w:top w:val="single" w:sz="5" w:color="D8D1C3"/>
+              <w:left w:val="single" w:sz="5" w:color="D8D1C3"/>
+              <w:bottom w:val="single" w:sz="5" w:color="D8D1C3"/>
+              <w:right w:val="single" w:sz="5" w:color="D8D1C3"/>
+            </w:tcBorders>
+          </w:tcPr>
+          <w:p>
+            <w:pPr>
+              <w:spacing w:after="40"/>
+              <w:jc w:val="right"/>
+            </w:pPr>
+            <w:r/>
+            <w:r>
+              <w:rPr>
+                <w:rFonts w:ascii="Arial" w:hAnsi="Arial"/>
+                <w:b w:val="0"/>
+                <w:color w:val="1F2A24"/>
+                <w:sz w:val="20"/>
+              </w:rPr>
+              <w:t>Display</w:t>
+            </w:r>
+          </w:p>
+        </w:tc>
+        <w:tc>
+          <w:tcPr>
+            <w:tcW w:type="dxa" w:w="2556"/>
+            <w:shd w:fill="F8F3EA"/>
+            <w:vAlign w:val="center"/>
+            <w:tcBorders>
+              <w:top w:val="single" w:sz="5" w:color="D8D1C3"/>
+              <w:left w:val="single" w:sz="5" w:color="D8D1C3"/>
+              <w:bottom w:val="single" w:sz="5" w:color="D8D1C3"/>
+              <w:right w:val="single" w:sz="5" w:color="D8D1C3"/>
+            </w:tcBorders>
+          </w:tcPr>
+          <w:p>
+            <w:pPr>
+              <w:spacing w:after="40"/>
+              <w:jc w:val="right"/>
+            </w:pPr>
+            <w:r/>
+            <w:r>
+              <w:rPr>
+                <w:rFonts w:ascii="Arial" w:hAnsi="Arial"/>
+                <w:b w:val="0"/>
+                <w:color w:val="1F2A24"/>
+                <w:sz w:val="20"/>
+              </w:rPr>
+              <w:t>40 ₪</w:t>
+            </w:r>
+          </w:p>
+        </w:tc>
+        <w:tc>
+          <w:tcPr>
+            <w:tcW w:type="dxa" w:w="2556"/>
+            <w:shd w:fill="F8F3EA"/>
+            <w:vAlign w:val="center"/>
+            <w:tcBorders>
+              <w:top w:val="single" w:sz="5" w:color="D8D1C3"/>
+              <w:left w:val="single" w:sz="5" w:color="D8D1C3"/>
+              <w:bottom w:val="single" w:sz="5" w:color="D8D1C3"/>
+              <w:right w:val="single" w:sz="5" w:color="D8D1C3"/>
+            </w:tcBorders>
+          </w:tcPr>
+          <w:p>
+            <w:pPr>
+              <w:spacing w:after="40"/>
+              <w:jc w:val="right"/>
+            </w:pPr>
+            <w:r/>
+            <w:r>
+              <w:rPr>
+                <w:rFonts w:ascii="Arial" w:hAnsi="Arial"/>
+                <w:b w:val="0"/>
+                <w:color w:val="1F2A24"/>
+                <w:sz w:val="20"/>
+              </w:rPr>
+              <w:t>מושהה</w:t>
+            </w:r>
+          </w:p>
+        </w:tc>
+      </w:tr>
+      <w:tr>
+        <w:tc>
+          <w:tcPr>
+            <w:tcW w:type="dxa" w:w="2556"/>
+            <w:shd w:fill="FFFFFF"/>
+            <w:vAlign w:val="center"/>
+            <w:tcBorders>
+              <w:top w:val="single" w:sz="5" w:color="D8D1C3"/>
+              <w:left w:val="single" w:sz="5" w:color="D8D1C3"/>
+              <w:bottom w:val="single" w:sz="5" w:color="D8D1C3"/>
+              <w:right w:val="single" w:sz="5" w:color="D8D1C3"/>
+            </w:tcBorders>
+          </w:tcPr>
+          <w:p>
+            <w:pPr>
+              <w:spacing w:after="40"/>
+              <w:jc w:val="right"/>
+            </w:pPr>
+            <w:r/>
+            <w:r>
+              <w:rPr>
+                <w:rFonts w:ascii="Arial" w:hAnsi="Arial"/>
+                <w:b w:val="0"/>
+                <w:color w:val="1F2A24"/>
+                <w:sz w:val="20"/>
+              </w:rPr>
+              <w:t>קמפיין וידאו</w:t>
+            </w:r>
+          </w:p>
+        </w:tc>
+        <w:tc>
+          <w:tcPr>
+            <w:tcW w:type="dxa" w:w="2556"/>
+            <w:shd w:fill="FFFFFF"/>
+            <w:vAlign w:val="center"/>
+            <w:tcBorders>
+              <w:top w:val="single" w:sz="5" w:color="D8D1C3"/>
+              <w:left w:val="single" w:sz="5" w:color="D8D1C3"/>
+              <w:bottom w:val="single" w:sz="5" w:color="D8D1C3"/>
+              <w:right w:val="single" w:sz="5" w:color="D8D1C3"/>
+            </w:tcBorders>
+          </w:tcPr>
+          <w:p>
+            <w:pPr>
+              <w:spacing w:after="40"/>
+              <w:jc w:val="right"/>
+            </w:pPr>
+            <w:r/>
+            <w:r>
+              <w:rPr>
+                <w:rFonts w:ascii="Arial" w:hAnsi="Arial"/>
+                <w:b w:val="0"/>
+                <w:color w:val="1F2A24"/>
+                <w:sz w:val="20"/>
+              </w:rPr>
+              <w:t>Demand Gen / נכסי וידאו</w:t>
+            </w:r>
+          </w:p>
+        </w:tc>
+        <w:tc>
+          <w:tcPr>
+            <w:tcW w:type="dxa" w:w="2556"/>
+            <w:shd w:fill="FFFFFF"/>
+            <w:vAlign w:val="center"/>
+            <w:tcBorders>
+              <w:top w:val="single" w:sz="5" w:color="D8D1C3"/>
+              <w:left w:val="single" w:sz="5" w:color="D8D1C3"/>
+              <w:bottom w:val="single" w:sz="5" w:color="D8D1C3"/>
+              <w:right w:val="single" w:sz="5" w:color="D8D1C3"/>
+            </w:tcBorders>
+          </w:tcPr>
+          <w:p>
+            <w:pPr>
+              <w:spacing w:after="40"/>
+              <w:jc w:val="right"/>
+            </w:pPr>
+            <w:r/>
+            <w:r>
+              <w:rPr>
+                <w:rFonts w:ascii="Arial" w:hAnsi="Arial"/>
+                <w:b w:val="0"/>
+                <w:color w:val="1F2A24"/>
+                <w:sz w:val="20"/>
+              </w:rPr>
+              <w:t>30 ₪</w:t>
+            </w:r>
+          </w:p>
+        </w:tc>
+        <w:tc>
+          <w:tcPr>
+            <w:tcW w:type="dxa" w:w="2556"/>
+            <w:shd w:fill="FFFFFF"/>
+            <w:vAlign w:val="center"/>
+            <w:tcBorders>
+              <w:top w:val="single" w:sz="5" w:color="D8D1C3"/>
+              <w:left w:val="single" w:sz="5" w:color="D8D1C3"/>
+              <w:bottom w:val="single" w:sz="5" w:color="D8D1C3"/>
+              <w:right w:val="single" w:sz="5" w:color="D8D1C3"/>
+            </w:tcBorders>
+          </w:tcPr>
+          <w:p>
+            <w:pPr>
+              <w:spacing w:after="40"/>
+              <w:jc w:val="right"/>
+            </w:pPr>
+            <w:r/>
+            <w:r>
+              <w:rPr>
+                <w:rFonts w:ascii="Arial" w:hAnsi="Arial"/>
+                <w:b w:val="0"/>
+                <w:color w:val="1F2A24"/>
+                <w:sz w:val="20"/>
+              </w:rPr>
+              <w:t>מושהה</w:t>
+            </w:r>
+          </w:p>
+        </w:tc>
+      </w:tr>
+      <w:tr>
+        <w:tc>
+          <w:tcPr>
+            <w:tcW w:type="dxa" w:w="2556"/>
+            <w:shd w:fill="F8F3EA"/>
+            <w:vAlign w:val="center"/>
+            <w:tcBorders>
+              <w:top w:val="single" w:sz="5" w:color="D8D1C3"/>
+              <w:left w:val="single" w:sz="5" w:color="D8D1C3"/>
+              <w:bottom w:val="single" w:sz="5" w:color="D8D1C3"/>
+              <w:right w:val="single" w:sz="5" w:color="D8D1C3"/>
+            </w:tcBorders>
+          </w:tcPr>
+          <w:p>
+            <w:pPr>
+              <w:spacing w:after="40"/>
+              <w:jc w:val="right"/>
+            </w:pPr>
+            <w:r/>
+            <w:r>
+              <w:rPr>
+                <w:rFonts w:ascii="Arial" w:hAnsi="Arial"/>
+                <w:b w:val="0"/>
+                <w:color w:val="1F2A24"/>
+                <w:sz w:val="20"/>
+              </w:rPr>
+              <w:t>קמפיין התקשרות בלבד</w:t>
+            </w:r>
+          </w:p>
+        </w:tc>
+        <w:tc>
+          <w:tcPr>
+            <w:tcW w:type="dxa" w:w="2556"/>
+            <w:shd w:fill="F8F3EA"/>
+            <w:vAlign w:val="center"/>
+            <w:tcBorders>
+              <w:top w:val="single" w:sz="5" w:color="D8D1C3"/>
+              <w:left w:val="single" w:sz="5" w:color="D8D1C3"/>
+              <w:bottom w:val="single" w:sz="5" w:color="D8D1C3"/>
+              <w:right w:val="single" w:sz="5" w:color="D8D1C3"/>
+            </w:tcBorders>
+          </w:tcPr>
+          <w:p>
+            <w:pPr>
+              <w:spacing w:after="40"/>
+              <w:jc w:val="right"/>
+            </w:pPr>
+            <w:r/>
+            <w:r>
+              <w:rPr>
+                <w:rFonts w:ascii="Arial" w:hAnsi="Arial"/>
+                <w:b w:val="0"/>
+                <w:color w:val="1F2A24"/>
+                <w:sz w:val="20"/>
+              </w:rPr>
+              <w:t>Search</w:t>
+            </w:r>
+          </w:p>
+        </w:tc>
+        <w:tc>
+          <w:tcPr>
+            <w:tcW w:type="dxa" w:w="2556"/>
+            <w:shd w:fill="F8F3EA"/>
+            <w:vAlign w:val="center"/>
+            <w:tcBorders>
+              <w:top w:val="single" w:sz="5" w:color="D8D1C3"/>
+              <w:left w:val="single" w:sz="5" w:color="D8D1C3"/>
+              <w:bottom w:val="single" w:sz="5" w:color="D8D1C3"/>
+              <w:right w:val="single" w:sz="5" w:color="D8D1C3"/>
+            </w:tcBorders>
+          </w:tcPr>
+          <w:p>
+            <w:pPr>
+              <w:spacing w:after="40"/>
+              <w:jc w:val="right"/>
+            </w:pPr>
+            <w:r/>
+            <w:r>
+              <w:rPr>
+                <w:rFonts w:ascii="Arial" w:hAnsi="Arial"/>
+                <w:b w:val="0"/>
+                <w:color w:val="1F2A24"/>
+                <w:sz w:val="20"/>
+              </w:rPr>
+              <w:t>40 ₪</w:t>
+            </w:r>
+          </w:p>
+        </w:tc>
+        <w:tc>
+          <w:tcPr>
+            <w:tcW w:type="dxa" w:w="2556"/>
+            <w:shd w:fill="F8F3EA"/>
+            <w:vAlign w:val="center"/>
+            <w:tcBorders>
+              <w:top w:val="single" w:sz="5" w:color="D8D1C3"/>
+              <w:left w:val="single" w:sz="5" w:color="D8D1C3"/>
+              <w:bottom w:val="single" w:sz="5" w:color="D8D1C3"/>
+              <w:right w:val="single" w:sz="5" w:color="D8D1C3"/>
+            </w:tcBorders>
+          </w:tcPr>
+          <w:p>
+            <w:pPr>
+              <w:spacing w:after="40"/>
+              <w:jc w:val="right"/>
+            </w:pPr>
+            <w:r/>
+            <w:r>
+              <w:rPr>
+                <w:rFonts w:ascii="Arial" w:hAnsi="Arial"/>
+                <w:b w:val="0"/>
+                <w:color w:val="1F2A24"/>
+                <w:sz w:val="20"/>
+              </w:rPr>
+              <w:t>מושהה</w:t>
+            </w:r>
+          </w:p>
+        </w:tc>
+      </w:tr>
+    </w:tbl>
+    <w:p>
+      <w:pPr>
+        <w:spacing w:after="140" w:line="276" w:lineRule="auto"/>
+        <w:jc w:val="right"/>
+        <w:bidi w:val="1"/>
+      </w:pPr>
+      <w:r>
+        <w:rPr>
+          <w:rFonts w:ascii="Arial" w:hAnsi="Arial"/>
+          <w:b w:val="0"/>
+          <w:color w:val="1F2A24"/>
+          <w:sz w:val="21"/>
+        </w:rPr>
+        <w:t>הקמפיינים נבנו במבנה הנדרש למטלה ונשמרו במצב מושהה, כך שלא יפעלו בפועל בזמן ההגשה.</w:t>
       </w:r>
     </w:p>
     <w:p>
       <w:pPr>
-        <w:spacing w:after="0" w:line="276" w:lineRule="auto"/>
+        <w:spacing w:before="300" w:after="140"/>
         <w:jc w:val="right"/>
         <w:bidi w:val="1"/>
       </w:pPr>
@@ -917,17 +2002,1025 @@
         <w:rPr>
           <w:rFonts w:ascii="Arial" w:hAnsi="Arial"/>
           <w:b/>
+          <w:color w:val="5F7D68"/>
+          <w:sz w:val="36"/>
+        </w:rPr>
+        <w:t>5. קמפיין החיפוש והקמפיין הממותג</w:t>
+      </w:r>
+    </w:p>
+    <w:p>
+      <w:pPr>
+        <w:spacing w:after="140" w:line="276" w:lineRule="auto"/>
+        <w:jc w:val="right"/>
+        <w:bidi w:val="1"/>
+      </w:pPr>
+      <w:r>
+        <w:rPr>
+          <w:rFonts w:ascii="Arial" w:hAnsi="Arial"/>
+          <w:b w:val="0"/>
+          <w:color w:val="1F2A24"/>
+          <w:sz w:val="21"/>
+        </w:rPr>
+        <w:t>בקמפיין החיפוש קיימות שתי קבוצות מודעות, כאשר החלוקה ביניהן מבוססת על צורך או אופן פנייה שונים. נעשה שימוש במילות מפתח בהתאמות מדויקת וביטוי, ללא התאמה רחבה וללא מילות מפתח כלליות בעלות מילה אחת בלבד.</w:t>
+      </w:r>
+    </w:p>
+    <w:p>
+      <w:pPr>
+        <w:spacing w:after="140" w:line="276" w:lineRule="auto"/>
+        <w:jc w:val="right"/>
+        <w:bidi w:val="1"/>
+      </w:pPr>
+      <w:r>
+        <w:rPr>
+          <w:rFonts w:ascii="Arial" w:hAnsi="Arial"/>
+          <w:b w:val="0"/>
+          <w:color w:val="1F2A24"/>
+          <w:sz w:val="21"/>
+        </w:rPr>
+        <w:t>קמפיין המותג מיועד לחיפושים הקשורים ל־LUMERA. במודעות שולבה התאמה דינמית של מילת המפתח (DKI), כדי להתאים את נוסח המודעה לחיפוש המשתמש.</w:t>
+      </w:r>
+    </w:p>
+    <w:p>
+      <w:pPr>
+        <w:spacing w:before="300" w:after="140"/>
+        <w:jc w:val="right"/>
+        <w:bidi w:val="1"/>
+      </w:pPr>
+      <w:r>
+        <w:rPr>
+          <w:rFonts w:ascii="Arial" w:hAnsi="Arial"/>
+          <w:b/>
+          <w:color w:val="5F7D68"/>
+          <w:sz w:val="36"/>
+        </w:rPr>
+        <w:t>6. קהלים ורימרקטינג</w:t>
+      </w:r>
+    </w:p>
+    <w:tbl>
+      <w:tblPr>
+        <w:tblStyle w:val="TableGrid"/>
+        <w:tblW w:type="auto" w:w="0"/>
+        <w:jc w:val="center"/>
+        <w:tblLook w:firstColumn="1" w:firstRow="1" w:lastColumn="0" w:lastRow="0" w:noHBand="0" w:noVBand="1" w:val="04A0"/>
+      </w:tblPr>
+      <w:tblGrid>
+        <w:gridCol w:w="3408"/>
+        <w:gridCol w:w="3408"/>
+        <w:gridCol w:w="3408"/>
+      </w:tblGrid>
+      <w:tr>
+        <w:tc>
+          <w:tcPr>
+            <w:tcW w:type="dxa" w:w="3408"/>
+            <w:shd w:fill="5F7D68"/>
+            <w:vAlign w:val="center"/>
+            <w:tcBorders>
+              <w:top w:val="single" w:sz="5" w:color="D8D1C3"/>
+              <w:left w:val="single" w:sz="5" w:color="D8D1C3"/>
+              <w:bottom w:val="single" w:sz="5" w:color="D8D1C3"/>
+              <w:right w:val="single" w:sz="5" w:color="D8D1C3"/>
+            </w:tcBorders>
+          </w:tcPr>
+          <w:p>
+            <w:pPr>
+              <w:spacing w:after="40"/>
+              <w:jc w:val="right"/>
+            </w:pPr>
+            <w:r/>
+            <w:r>
+              <w:rPr>
+                <w:rFonts w:ascii="Arial" w:hAnsi="Arial"/>
+                <w:b/>
+                <w:color w:val="FFFFFF"/>
+                <w:sz w:val="21"/>
+              </w:rPr>
+              <w:t>שם הקהל</w:t>
+            </w:r>
+          </w:p>
+        </w:tc>
+        <w:tc>
+          <w:tcPr>
+            <w:tcW w:type="dxa" w:w="3408"/>
+            <w:shd w:fill="5F7D68"/>
+            <w:vAlign w:val="center"/>
+            <w:tcBorders>
+              <w:top w:val="single" w:sz="5" w:color="D8D1C3"/>
+              <w:left w:val="single" w:sz="5" w:color="D8D1C3"/>
+              <w:bottom w:val="single" w:sz="5" w:color="D8D1C3"/>
+              <w:right w:val="single" w:sz="5" w:color="D8D1C3"/>
+            </w:tcBorders>
+          </w:tcPr>
+          <w:p>
+            <w:pPr>
+              <w:spacing w:after="40"/>
+              <w:jc w:val="right"/>
+            </w:pPr>
+            <w:r/>
+            <w:r>
+              <w:rPr>
+                <w:rFonts w:ascii="Arial" w:hAnsi="Arial"/>
+                <w:b/>
+                <w:color w:val="FFFFFF"/>
+                <w:sz w:val="21"/>
+              </w:rPr>
+              <w:t>תנאי עיקרי</w:t>
+            </w:r>
+          </w:p>
+        </w:tc>
+        <w:tc>
+          <w:tcPr>
+            <w:tcW w:type="dxa" w:w="3408"/>
+            <w:shd w:fill="5F7D68"/>
+            <w:vAlign w:val="center"/>
+            <w:tcBorders>
+              <w:top w:val="single" w:sz="5" w:color="D8D1C3"/>
+              <w:left w:val="single" w:sz="5" w:color="D8D1C3"/>
+              <w:bottom w:val="single" w:sz="5" w:color="D8D1C3"/>
+              <w:right w:val="single" w:sz="5" w:color="D8D1C3"/>
+            </w:tcBorders>
+          </w:tcPr>
+          <w:p>
+            <w:pPr>
+              <w:spacing w:after="40"/>
+              <w:jc w:val="right"/>
+            </w:pPr>
+            <w:r/>
+            <w:r>
+              <w:rPr>
+                <w:rFonts w:ascii="Arial" w:hAnsi="Arial"/>
+                <w:b/>
+                <w:color w:val="FFFFFF"/>
+                <w:sz w:val="21"/>
+              </w:rPr>
+              <w:t>שימוש</w:t>
+            </w:r>
+          </w:p>
+        </w:tc>
+      </w:tr>
+      <w:tr>
+        <w:tc>
+          <w:tcPr>
+            <w:tcW w:type="dxa" w:w="3408"/>
+            <w:shd w:fill="F8F3EA"/>
+            <w:vAlign w:val="center"/>
+            <w:tcBorders>
+              <w:top w:val="single" w:sz="5" w:color="D8D1C3"/>
+              <w:left w:val="single" w:sz="5" w:color="D8D1C3"/>
+              <w:bottom w:val="single" w:sz="5" w:color="D8D1C3"/>
+              <w:right w:val="single" w:sz="5" w:color="D8D1C3"/>
+            </w:tcBorders>
+          </w:tcPr>
+          <w:p>
+            <w:pPr>
+              <w:spacing w:after="40"/>
+              <w:jc w:val="right"/>
+            </w:pPr>
+            <w:r/>
+            <w:r>
+              <w:rPr>
+                <w:rFonts w:ascii="Arial" w:hAnsi="Arial"/>
+                <w:b w:val="0"/>
+                <w:color w:val="1F2A24"/>
+                <w:sz w:val="20"/>
+              </w:rPr>
+              <w:t>גולשים למוצר הראשון שלא המירו</w:t>
+            </w:r>
+          </w:p>
+        </w:tc>
+        <w:tc>
+          <w:tcPr>
+            <w:tcW w:type="dxa" w:w="3408"/>
+            <w:shd w:fill="F8F3EA"/>
+            <w:vAlign w:val="center"/>
+            <w:tcBorders>
+              <w:top w:val="single" w:sz="5" w:color="D8D1C3"/>
+              <w:left w:val="single" w:sz="5" w:color="D8D1C3"/>
+              <w:bottom w:val="single" w:sz="5" w:color="D8D1C3"/>
+              <w:right w:val="single" w:sz="5" w:color="D8D1C3"/>
+            </w:tcBorders>
+          </w:tcPr>
+          <w:p>
+            <w:pPr>
+              <w:spacing w:after="40"/>
+              <w:jc w:val="right"/>
+            </w:pPr>
+            <w:r/>
+            <w:r>
+              <w:rPr>
+                <w:rFonts w:ascii="Arial" w:hAnsi="Arial"/>
+                <w:b w:val="0"/>
+                <w:color w:val="1F2A24"/>
+                <w:sz w:val="20"/>
+              </w:rPr>
+              <w:t>ביקור ב־product1.html ללא ביקור בדף התודה</w:t>
+            </w:r>
+          </w:p>
+        </w:tc>
+        <w:tc>
+          <w:tcPr>
+            <w:tcW w:type="dxa" w:w="3408"/>
+            <w:shd w:fill="F8F3EA"/>
+            <w:vAlign w:val="center"/>
+            <w:tcBorders>
+              <w:top w:val="single" w:sz="5" w:color="D8D1C3"/>
+              <w:left w:val="single" w:sz="5" w:color="D8D1C3"/>
+              <w:bottom w:val="single" w:sz="5" w:color="D8D1C3"/>
+              <w:right w:val="single" w:sz="5" w:color="D8D1C3"/>
+            </w:tcBorders>
+          </w:tcPr>
+          <w:p>
+            <w:pPr>
+              <w:spacing w:after="40"/>
+              <w:jc w:val="right"/>
+            </w:pPr>
+            <w:r/>
+            <w:r>
+              <w:rPr>
+                <w:rFonts w:ascii="Arial" w:hAnsi="Arial"/>
+                <w:b w:val="0"/>
+                <w:color w:val="1F2A24"/>
+                <w:sz w:val="20"/>
+              </w:rPr>
+              <w:t>קבוצת GDN-לא-המירו</w:t>
+            </w:r>
+          </w:p>
+        </w:tc>
+      </w:tr>
+      <w:tr>
+        <w:tc>
+          <w:tcPr>
+            <w:tcW w:type="dxa" w:w="3408"/>
+            <w:shd w:fill="FFFFFF"/>
+            <w:vAlign w:val="center"/>
+            <w:tcBorders>
+              <w:top w:val="single" w:sz="5" w:color="D8D1C3"/>
+              <w:left w:val="single" w:sz="5" w:color="D8D1C3"/>
+              <w:bottom w:val="single" w:sz="5" w:color="D8D1C3"/>
+              <w:right w:val="single" w:sz="5" w:color="D8D1C3"/>
+            </w:tcBorders>
+          </w:tcPr>
+          <w:p>
+            <w:pPr>
+              <w:spacing w:after="40"/>
+              <w:jc w:val="right"/>
+            </w:pPr>
+            <w:r/>
+            <w:r>
+              <w:rPr>
+                <w:rFonts w:ascii="Arial" w:hAnsi="Arial"/>
+                <w:b w:val="0"/>
+                <w:color w:val="1F2A24"/>
+                <w:sz w:val="20"/>
+              </w:rPr>
+              <w:t>ביצעו המרה למוצר הראשון</w:t>
+            </w:r>
+          </w:p>
+        </w:tc>
+        <w:tc>
+          <w:tcPr>
+            <w:tcW w:type="dxa" w:w="3408"/>
+            <w:shd w:fill="FFFFFF"/>
+            <w:vAlign w:val="center"/>
+            <w:tcBorders>
+              <w:top w:val="single" w:sz="5" w:color="D8D1C3"/>
+              <w:left w:val="single" w:sz="5" w:color="D8D1C3"/>
+              <w:bottom w:val="single" w:sz="5" w:color="D8D1C3"/>
+              <w:right w:val="single" w:sz="5" w:color="D8D1C3"/>
+            </w:tcBorders>
+          </w:tcPr>
+          <w:p>
+            <w:pPr>
+              <w:spacing w:after="40"/>
+              <w:jc w:val="right"/>
+            </w:pPr>
+            <w:r/>
+            <w:r>
+              <w:rPr>
+                <w:rFonts w:ascii="Arial" w:hAnsi="Arial"/>
+                <w:b w:val="0"/>
+                <w:color w:val="1F2A24"/>
+                <w:sz w:val="20"/>
+              </w:rPr>
+              <w:t>ביקור ב־thank-you.html</w:t>
+            </w:r>
+          </w:p>
+        </w:tc>
+        <w:tc>
+          <w:tcPr>
+            <w:tcW w:type="dxa" w:w="3408"/>
+            <w:shd w:fill="FFFFFF"/>
+            <w:vAlign w:val="center"/>
+            <w:tcBorders>
+              <w:top w:val="single" w:sz="5" w:color="D8D1C3"/>
+              <w:left w:val="single" w:sz="5" w:color="D8D1C3"/>
+              <w:bottom w:val="single" w:sz="5" w:color="D8D1C3"/>
+              <w:right w:val="single" w:sz="5" w:color="D8D1C3"/>
+            </w:tcBorders>
+          </w:tcPr>
+          <w:p>
+            <w:pPr>
+              <w:spacing w:after="40"/>
+              <w:jc w:val="right"/>
+            </w:pPr>
+            <w:r/>
+            <w:r>
+              <w:rPr>
+                <w:rFonts w:ascii="Arial" w:hAnsi="Arial"/>
+                <w:b w:val="0"/>
+                <w:color w:val="1F2A24"/>
+                <w:sz w:val="20"/>
+              </w:rPr>
+              <w:t>קבוצת GDN-אפסייל</w:t>
+            </w:r>
+          </w:p>
+        </w:tc>
+      </w:tr>
+    </w:tbl>
+    <w:p>
+      <w:pPr>
+        <w:spacing w:after="140" w:line="276" w:lineRule="auto"/>
+        <w:jc w:val="right"/>
+        <w:bidi w:val="1"/>
+      </w:pPr>
+      <w:r>
+        <w:rPr>
+          <w:rFonts w:ascii="Arial" w:hAnsi="Arial"/>
+          <w:b w:val="0"/>
+          <w:color w:val="1F2A24"/>
+          <w:sz w:val="21"/>
+        </w:rPr>
+        <w:t>הקהל הראשון מיועד לחזרה למשתמשים שביקרו בדף הרפורמר אך לא השלימו טופס. הקהל השני מיועד למשתמשים שהשלימו את הטופס, ולכן ניתן לפנות אליהם בהצעת המשך או אפסייל.</w:t>
+      </w:r>
+    </w:p>
+    <w:p>
+      <w:pPr>
+        <w:spacing w:before="300" w:after="140"/>
+        <w:jc w:val="right"/>
+        <w:bidi w:val="1"/>
+      </w:pPr>
+      <w:r>
+        <w:rPr>
+          <w:rFonts w:ascii="Arial" w:hAnsi="Arial"/>
+          <w:b/>
+          <w:color w:val="5F7D68"/>
+          <w:sz w:val="36"/>
+        </w:rPr>
+        <w:t>7. קמפיין GDN וקמפיין הווידאו</w:t>
+      </w:r>
+    </w:p>
+    <w:p>
+      <w:pPr>
+        <w:spacing w:after="140" w:line="276" w:lineRule="auto"/>
+        <w:jc w:val="right"/>
+        <w:bidi w:val="1"/>
+      </w:pPr>
+      <w:r>
+        <w:rPr>
+          <w:rFonts w:ascii="Arial" w:hAnsi="Arial"/>
+          <w:b w:val="0"/>
+          <w:color w:val="1F2A24"/>
+          <w:sz w:val="21"/>
+        </w:rPr>
+        <w:t>בקמפיין GDN קיימות שתי קבוצות מודעות: קבוצה למבקרים שלא המירו וקבוצה למשתמשים שביצעו המרה. לכל קבוצה הוגדר קהל הרימרקטינג המתאים.</w:t>
+      </w:r>
+    </w:p>
+    <w:p>
+      <w:pPr>
+        <w:spacing w:after="140" w:line="276" w:lineRule="auto"/>
+        <w:jc w:val="right"/>
+        <w:bidi w:val="1"/>
+      </w:pPr>
+      <w:r>
+        <w:rPr>
+          <w:rFonts w:ascii="Arial" w:hAnsi="Arial"/>
+          <w:b w:val="0"/>
+          <w:color w:val="1F2A24"/>
+          <w:sz w:val="21"/>
+        </w:rPr>
+        <w:t>קמפיין הווידאו כולל קבוצת מודעות אחת ושני סרטוני YouTube מתאימים. בממשק החדש של Google Ads הקמפיין מופיע כ־Demand Gen עם נכסי וידאו, ומצב הטירגוט האופטימלי הוגדר כמושבת.</w:t>
+      </w:r>
+    </w:p>
+    <w:p>
+      <w:pPr>
+        <w:spacing w:after="140" w:line="276" w:lineRule="auto"/>
+        <w:jc w:val="right"/>
+        <w:bidi w:val="1"/>
+      </w:pPr>
+      <w:r>
+        <w:rPr>
+          <w:rFonts w:ascii="Arial" w:hAnsi="Arial"/>
+          <w:b/>
+          <w:color w:val="1F2A24"/>
+          <w:sz w:val="21"/>
+        </w:rPr>
+        <w:t>סרטוני YouTube שנבחרו:</w:t>
+      </w:r>
+    </w:p>
+    <w:p>
+      <w:pPr>
+        <w:pStyle w:val="ListBullet"/>
+        <w:spacing w:after="60"/>
+        <w:jc w:val="right"/>
+        <w:bidi w:val="1"/>
+      </w:pPr>
+      <w:r>
+        <w:rPr>
+          <w:rFonts w:ascii="Arial" w:hAnsi="Arial"/>
+          <w:color w:val="1F2A24"/>
+          <w:sz w:val="21"/>
+        </w:rPr>
+        <w:t>Pilates Reformer Workout | Full Body | Intermediate — Dez Fit</w:t>
+      </w:r>
+    </w:p>
+    <w:p>
+      <w:pPr>
+        <w:pStyle w:val="ListBullet"/>
+        <w:spacing w:after="60"/>
+        <w:jc w:val="right"/>
+        <w:bidi w:val="1"/>
+      </w:pPr>
+      <w:r>
+        <w:rPr>
+          <w:rFonts w:ascii="Arial" w:hAnsi="Arial"/>
+          <w:color w:val="1F2A24"/>
+          <w:sz w:val="21"/>
+        </w:rPr>
+        <w:t>Full Body Reformer Pilates Workout 40 Minutes — Alysia Pope Pilates</w:t>
+      </w:r>
+    </w:p>
+    <w:p>
+      <w:pPr>
+        <w:spacing w:before="300" w:after="140"/>
+        <w:jc w:val="right"/>
+        <w:bidi w:val="1"/>
+      </w:pPr>
+      <w:r>
+        <w:rPr>
+          <w:rFonts w:ascii="Arial" w:hAnsi="Arial"/>
+          <w:b/>
+          <w:color w:val="5F7D68"/>
+          <w:sz w:val="36"/>
+        </w:rPr>
+        <w:t>8. נכסים ותוספים</w:t>
+      </w:r>
+    </w:p>
+    <w:tbl>
+      <w:tblPr>
+        <w:tblStyle w:val="TableGrid"/>
+        <w:tblW w:type="auto" w:w="0"/>
+        <w:jc w:val="center"/>
+        <w:tblLook w:firstColumn="1" w:firstRow="1" w:lastColumn="0" w:lastRow="0" w:noHBand="0" w:noVBand="1" w:val="04A0"/>
+      </w:tblPr>
+      <w:tblGrid>
+        <w:gridCol w:w="5112"/>
+        <w:gridCol w:w="5112"/>
+      </w:tblGrid>
+      <w:tr>
+        <w:tc>
+          <w:tcPr>
+            <w:tcW w:type="dxa" w:w="5112"/>
+            <w:shd w:fill="5F7D68"/>
+            <w:vAlign w:val="center"/>
+            <w:tcBorders>
+              <w:top w:val="single" w:sz="5" w:color="D8D1C3"/>
+              <w:left w:val="single" w:sz="5" w:color="D8D1C3"/>
+              <w:bottom w:val="single" w:sz="5" w:color="D8D1C3"/>
+              <w:right w:val="single" w:sz="5" w:color="D8D1C3"/>
+            </w:tcBorders>
+          </w:tcPr>
+          <w:p>
+            <w:pPr>
+              <w:spacing w:after="40"/>
+              <w:jc w:val="right"/>
+            </w:pPr>
+            <w:r/>
+            <w:r>
+              <w:rPr>
+                <w:rFonts w:ascii="Arial" w:hAnsi="Arial"/>
+                <w:b/>
+                <w:color w:val="FFFFFF"/>
+                <w:sz w:val="21"/>
+              </w:rPr>
+              <w:t>נכס / תוסף</w:t>
+            </w:r>
+          </w:p>
+        </w:tc>
+        <w:tc>
+          <w:tcPr>
+            <w:tcW w:type="dxa" w:w="5112"/>
+            <w:shd w:fill="5F7D68"/>
+            <w:vAlign w:val="center"/>
+            <w:tcBorders>
+              <w:top w:val="single" w:sz="5" w:color="D8D1C3"/>
+              <w:left w:val="single" w:sz="5" w:color="D8D1C3"/>
+              <w:bottom w:val="single" w:sz="5" w:color="D8D1C3"/>
+              <w:right w:val="single" w:sz="5" w:color="D8D1C3"/>
+            </w:tcBorders>
+          </w:tcPr>
+          <w:p>
+            <w:pPr>
+              <w:spacing w:after="40"/>
+              <w:jc w:val="right"/>
+            </w:pPr>
+            <w:r/>
+            <w:r>
+              <w:rPr>
+                <w:rFonts w:ascii="Arial" w:hAnsi="Arial"/>
+                <w:b/>
+                <w:color w:val="FFFFFF"/>
+                <w:sz w:val="21"/>
+              </w:rPr>
+              <w:t>יישום / מצב</w:t>
+            </w:r>
+          </w:p>
+        </w:tc>
+      </w:tr>
+      <w:tr>
+        <w:tc>
+          <w:tcPr>
+            <w:tcW w:type="dxa" w:w="5112"/>
+            <w:shd w:fill="F8F3EA"/>
+            <w:vAlign w:val="center"/>
+            <w:tcBorders>
+              <w:top w:val="single" w:sz="5" w:color="D8D1C3"/>
+              <w:left w:val="single" w:sz="5" w:color="D8D1C3"/>
+              <w:bottom w:val="single" w:sz="5" w:color="D8D1C3"/>
+              <w:right w:val="single" w:sz="5" w:color="D8D1C3"/>
+            </w:tcBorders>
+          </w:tcPr>
+          <w:p>
+            <w:pPr>
+              <w:spacing w:after="40"/>
+              <w:jc w:val="right"/>
+            </w:pPr>
+            <w:r/>
+            <w:r>
+              <w:rPr>
+                <w:rFonts w:ascii="Arial" w:hAnsi="Arial"/>
+                <w:b w:val="0"/>
+                <w:color w:val="1F2A24"/>
+                <w:sz w:val="20"/>
+              </w:rPr>
+              <w:t>Sitelinks</w:t>
+            </w:r>
+          </w:p>
+        </w:tc>
+        <w:tc>
+          <w:tcPr>
+            <w:tcW w:type="dxa" w:w="5112"/>
+            <w:shd w:fill="F8F3EA"/>
+            <w:vAlign w:val="center"/>
+            <w:tcBorders>
+              <w:top w:val="single" w:sz="5" w:color="D8D1C3"/>
+              <w:left w:val="single" w:sz="5" w:color="D8D1C3"/>
+              <w:bottom w:val="single" w:sz="5" w:color="D8D1C3"/>
+              <w:right w:val="single" w:sz="5" w:color="D8D1C3"/>
+            </w:tcBorders>
+          </w:tcPr>
+          <w:p>
+            <w:pPr>
+              <w:spacing w:after="40"/>
+              <w:jc w:val="right"/>
+            </w:pPr>
+            <w:r/>
+            <w:r>
+              <w:rPr>
+                <w:rFonts w:ascii="Arial" w:hAnsi="Arial"/>
+                <w:b w:val="0"/>
+                <w:color w:val="1F2A24"/>
+                <w:sz w:val="20"/>
+              </w:rPr>
+              <w:t>קישורים לדף יצירת קשר ולדפי המוצרים — נכללו בייצוא</w:t>
+            </w:r>
+          </w:p>
+        </w:tc>
+      </w:tr>
+      <w:tr>
+        <w:tc>
+          <w:tcPr>
+            <w:tcW w:type="dxa" w:w="5112"/>
+            <w:shd w:fill="FFFFFF"/>
+            <w:vAlign w:val="center"/>
+            <w:tcBorders>
+              <w:top w:val="single" w:sz="5" w:color="D8D1C3"/>
+              <w:left w:val="single" w:sz="5" w:color="D8D1C3"/>
+              <w:bottom w:val="single" w:sz="5" w:color="D8D1C3"/>
+              <w:right w:val="single" w:sz="5" w:color="D8D1C3"/>
+            </w:tcBorders>
+          </w:tcPr>
+          <w:p>
+            <w:pPr>
+              <w:spacing w:after="40"/>
+              <w:jc w:val="right"/>
+            </w:pPr>
+            <w:r/>
+            <w:r>
+              <w:rPr>
+                <w:rFonts w:ascii="Arial" w:hAnsi="Arial"/>
+                <w:b w:val="0"/>
+                <w:color w:val="1F2A24"/>
+                <w:sz w:val="20"/>
+              </w:rPr>
+              <w:t>Callouts</w:t>
+            </w:r>
+          </w:p>
+        </w:tc>
+        <w:tc>
+          <w:tcPr>
+            <w:tcW w:type="dxa" w:w="5112"/>
+            <w:shd w:fill="FFFFFF"/>
+            <w:vAlign w:val="center"/>
+            <w:tcBorders>
+              <w:top w:val="single" w:sz="5" w:color="D8D1C3"/>
+              <w:left w:val="single" w:sz="5" w:color="D8D1C3"/>
+              <w:bottom w:val="single" w:sz="5" w:color="D8D1C3"/>
+              <w:right w:val="single" w:sz="5" w:color="D8D1C3"/>
+            </w:tcBorders>
+          </w:tcPr>
+          <w:p>
+            <w:pPr>
+              <w:spacing w:after="40"/>
+              <w:jc w:val="right"/>
+            </w:pPr>
+            <w:r/>
+            <w:r>
+              <w:rPr>
+                <w:rFonts w:ascii="Arial" w:hAnsi="Arial"/>
+                <w:b w:val="0"/>
+                <w:color w:val="1F2A24"/>
+                <w:sz w:val="20"/>
+              </w:rPr>
+              <w:t>הדגשת יתרונות, יחס אישי וקבוצות קטנות — נכללו בייצוא</w:t>
+            </w:r>
+          </w:p>
+        </w:tc>
+      </w:tr>
+      <w:tr>
+        <w:tc>
+          <w:tcPr>
+            <w:tcW w:type="dxa" w:w="5112"/>
+            <w:shd w:fill="F8F3EA"/>
+            <w:vAlign w:val="center"/>
+            <w:tcBorders>
+              <w:top w:val="single" w:sz="5" w:color="D8D1C3"/>
+              <w:left w:val="single" w:sz="5" w:color="D8D1C3"/>
+              <w:bottom w:val="single" w:sz="5" w:color="D8D1C3"/>
+              <w:right w:val="single" w:sz="5" w:color="D8D1C3"/>
+            </w:tcBorders>
+          </w:tcPr>
+          <w:p>
+            <w:pPr>
+              <w:spacing w:after="40"/>
+              <w:jc w:val="right"/>
+            </w:pPr>
+            <w:r/>
+            <w:r>
+              <w:rPr>
+                <w:rFonts w:ascii="Arial" w:hAnsi="Arial"/>
+                <w:b w:val="0"/>
+                <w:color w:val="1F2A24"/>
+                <w:sz w:val="20"/>
+              </w:rPr>
+              <w:t>Structured snippets</w:t>
+            </w:r>
+          </w:p>
+        </w:tc>
+        <w:tc>
+          <w:tcPr>
+            <w:tcW w:type="dxa" w:w="5112"/>
+            <w:shd w:fill="F8F3EA"/>
+            <w:vAlign w:val="center"/>
+            <w:tcBorders>
+              <w:top w:val="single" w:sz="5" w:color="D8D1C3"/>
+              <w:left w:val="single" w:sz="5" w:color="D8D1C3"/>
+              <w:bottom w:val="single" w:sz="5" w:color="D8D1C3"/>
+              <w:right w:val="single" w:sz="5" w:color="D8D1C3"/>
+            </w:tcBorders>
+          </w:tcPr>
+          <w:p>
+            <w:pPr>
+              <w:spacing w:after="40"/>
+              <w:jc w:val="right"/>
+            </w:pPr>
+            <w:r/>
+            <w:r>
+              <w:rPr>
+                <w:rFonts w:ascii="Arial" w:hAnsi="Arial"/>
+                <w:b w:val="0"/>
+                <w:color w:val="1F2A24"/>
+                <w:sz w:val="20"/>
+              </w:rPr>
+              <w:t>הצגת סוגי השירותים — נכללו בייצוא</w:t>
+            </w:r>
+          </w:p>
+        </w:tc>
+      </w:tr>
+      <w:tr>
+        <w:tc>
+          <w:tcPr>
+            <w:tcW w:type="dxa" w:w="5112"/>
+            <w:shd w:fill="FFFFFF"/>
+            <w:vAlign w:val="center"/>
+            <w:tcBorders>
+              <w:top w:val="single" w:sz="5" w:color="D8D1C3"/>
+              <w:left w:val="single" w:sz="5" w:color="D8D1C3"/>
+              <w:bottom w:val="single" w:sz="5" w:color="D8D1C3"/>
+              <w:right w:val="single" w:sz="5" w:color="D8D1C3"/>
+            </w:tcBorders>
+          </w:tcPr>
+          <w:p>
+            <w:pPr>
+              <w:spacing w:after="40"/>
+              <w:jc w:val="right"/>
+            </w:pPr>
+            <w:r/>
+            <w:r>
+              <w:rPr>
+                <w:rFonts w:ascii="Arial" w:hAnsi="Arial"/>
+                <w:b w:val="0"/>
+                <w:color w:val="1F2A24"/>
+                <w:sz w:val="20"/>
+              </w:rPr>
+              <w:t>Call asset</w:t>
+            </w:r>
+          </w:p>
+        </w:tc>
+        <w:tc>
+          <w:tcPr>
+            <w:tcW w:type="dxa" w:w="5112"/>
+            <w:shd w:fill="FFFFFF"/>
+            <w:vAlign w:val="center"/>
+            <w:tcBorders>
+              <w:top w:val="single" w:sz="5" w:color="D8D1C3"/>
+              <w:left w:val="single" w:sz="5" w:color="D8D1C3"/>
+              <w:bottom w:val="single" w:sz="5" w:color="D8D1C3"/>
+              <w:right w:val="single" w:sz="5" w:color="D8D1C3"/>
+            </w:tcBorders>
+          </w:tcPr>
+          <w:p>
+            <w:pPr>
+              <w:spacing w:after="40"/>
+              <w:jc w:val="right"/>
+            </w:pPr>
+            <w:r/>
+            <w:r>
+              <w:rPr>
+                <w:rFonts w:ascii="Arial" w:hAnsi="Arial"/>
+                <w:b w:val="0"/>
+                <w:color w:val="1F2A24"/>
+                <w:sz w:val="20"/>
+              </w:rPr>
+              <w:t>מספר הטלפון 0525381648, ישראל — קיים וממתין לבדיקה</w:t>
+            </w:r>
+          </w:p>
+        </w:tc>
+      </w:tr>
+      <w:tr>
+        <w:tc>
+          <w:tcPr>
+            <w:tcW w:type="dxa" w:w="5112"/>
+            <w:shd w:fill="F8F3EA"/>
+            <w:vAlign w:val="center"/>
+            <w:tcBorders>
+              <w:top w:val="single" w:sz="5" w:color="D8D1C3"/>
+              <w:left w:val="single" w:sz="5" w:color="D8D1C3"/>
+              <w:bottom w:val="single" w:sz="5" w:color="D8D1C3"/>
+              <w:right w:val="single" w:sz="5" w:color="D8D1C3"/>
+            </w:tcBorders>
+          </w:tcPr>
+          <w:p>
+            <w:pPr>
+              <w:spacing w:after="40"/>
+              <w:jc w:val="right"/>
+            </w:pPr>
+            <w:r/>
+            <w:r>
+              <w:rPr>
+                <w:rFonts w:ascii="Arial" w:hAnsi="Arial"/>
+                <w:b w:val="0"/>
+                <w:color w:val="1F2A24"/>
+                <w:sz w:val="20"/>
+              </w:rPr>
+              <w:t>Countdown</w:t>
+            </w:r>
+          </w:p>
+        </w:tc>
+        <w:tc>
+          <w:tcPr>
+            <w:tcW w:type="dxa" w:w="5112"/>
+            <w:shd w:fill="F8F3EA"/>
+            <w:vAlign w:val="center"/>
+            <w:tcBorders>
+              <w:top w:val="single" w:sz="5" w:color="D8D1C3"/>
+              <w:left w:val="single" w:sz="5" w:color="D8D1C3"/>
+              <w:bottom w:val="single" w:sz="5" w:color="D8D1C3"/>
+              <w:right w:val="single" w:sz="5" w:color="D8D1C3"/>
+            </w:tcBorders>
+          </w:tcPr>
+          <w:p>
+            <w:pPr>
+              <w:spacing w:after="40"/>
+              <w:jc w:val="right"/>
+            </w:pPr>
+            <w:r/>
+            <w:r>
+              <w:rPr>
+                <w:rFonts w:ascii="Arial" w:hAnsi="Arial"/>
+                <w:b w:val="0"/>
+                <w:color w:val="1F2A24"/>
+                <w:sz w:val="20"/>
+              </w:rPr>
+              <w:t>ספירה לאחור לקידום הצעה מוגבלת בזמן — הוקם בחשבון</w:t>
+            </w:r>
+          </w:p>
+        </w:tc>
+      </w:tr>
+      <w:tr>
+        <w:tc>
+          <w:tcPr>
+            <w:tcW w:type="dxa" w:w="5112"/>
+            <w:shd w:fill="FFFFFF"/>
+            <w:vAlign w:val="center"/>
+            <w:tcBorders>
+              <w:top w:val="single" w:sz="5" w:color="D8D1C3"/>
+              <w:left w:val="single" w:sz="5" w:color="D8D1C3"/>
+              <w:bottom w:val="single" w:sz="5" w:color="D8D1C3"/>
+              <w:right w:val="single" w:sz="5" w:color="D8D1C3"/>
+            </w:tcBorders>
+          </w:tcPr>
+          <w:p>
+            <w:pPr>
+              <w:spacing w:after="40"/>
+              <w:jc w:val="right"/>
+            </w:pPr>
+            <w:r/>
+            <w:r>
+              <w:rPr>
+                <w:rFonts w:ascii="Arial" w:hAnsi="Arial"/>
+                <w:b w:val="0"/>
+                <w:color w:val="1F2A24"/>
+                <w:sz w:val="20"/>
+              </w:rPr>
+              <w:t>מילים שליליות</w:t>
+            </w:r>
+          </w:p>
+        </w:tc>
+        <w:tc>
+          <w:tcPr>
+            <w:tcW w:type="dxa" w:w="5112"/>
+            <w:shd w:fill="FFFFFF"/>
+            <w:vAlign w:val="center"/>
+            <w:tcBorders>
+              <w:top w:val="single" w:sz="5" w:color="D8D1C3"/>
+              <w:left w:val="single" w:sz="5" w:color="D8D1C3"/>
+              <w:bottom w:val="single" w:sz="5" w:color="D8D1C3"/>
+              <w:right w:val="single" w:sz="5" w:color="D8D1C3"/>
+            </w:tcBorders>
+          </w:tcPr>
+          <w:p>
+            <w:pPr>
+              <w:spacing w:after="40"/>
+              <w:jc w:val="right"/>
+            </w:pPr>
+            <w:r/>
+            <w:r>
+              <w:rPr>
+                <w:rFonts w:ascii="Arial" w:hAnsi="Arial"/>
+                <w:b w:val="0"/>
+                <w:color w:val="1F2A24"/>
+                <w:sz w:val="20"/>
+              </w:rPr>
+              <w:t>סינון חיפושים שאינם רלוונטיים</w:t>
+            </w:r>
+          </w:p>
+        </w:tc>
+      </w:tr>
+    </w:tbl>
+    <w:p>
+      <w:pPr>
+        <w:spacing w:before="300" w:after="140"/>
+        <w:jc w:val="right"/>
+        <w:bidi w:val="1"/>
+      </w:pPr>
+      <w:r>
+        <w:rPr>
+          <w:rFonts w:ascii="Arial" w:hAnsi="Arial"/>
+          <w:b/>
+          <w:color w:val="5F7D68"/>
+          <w:sz w:val="36"/>
+        </w:rPr>
+        <w:t>9. מדידה והמרות</w:t>
+      </w:r>
+    </w:p>
+    <w:p>
+      <w:pPr>
+        <w:spacing w:after="140" w:line="276" w:lineRule="auto"/>
+        <w:jc w:val="right"/>
+        <w:bidi w:val="1"/>
+      </w:pPr>
+      <w:r>
+        <w:rPr>
+          <w:rFonts w:ascii="Arial" w:hAnsi="Arial"/>
+          <w:b w:val="0"/>
+          <w:color w:val="1F2A24"/>
+          <w:sz w:val="21"/>
+        </w:rPr>
+        <w:t>באתר משולב Google tag עם מזהה המדידה AW-18101301732. בדף thank-you.html מופעל אירוע ההמרה:</w:t>
+      </w:r>
+    </w:p>
+    <w:p>
+      <w:pPr>
+        <w:spacing w:after="140" w:line="276" w:lineRule="auto"/>
+        <w:jc w:val="center"/>
+        <w:bidi w:val="1"/>
+      </w:pPr>
+      <w:r>
+        <w:rPr>
+          <w:rFonts w:ascii="Arial" w:hAnsi="Arial"/>
+          <w:b/>
           <w:color w:val="C9A45C"/>
-          <w:sz w:val="32"/>
+          <w:sz w:val="22"/>
         </w:rPr>
-        <w:t>580-214-1692</w:t>
+        <w:t>AW-18101301732/7DiCCKiD0s4cEOTjr7dD</w:t>
+      </w:r>
+    </w:p>
+    <w:p>
+      <w:pPr>
+        <w:spacing w:after="140" w:line="276" w:lineRule="auto"/>
+        <w:jc w:val="right"/>
+        <w:bidi w:val="1"/>
+      </w:pPr>
+      <w:r>
+        <w:rPr>
+          <w:rFonts w:ascii="Arial" w:hAnsi="Arial"/>
+          <w:b w:val="0"/>
+          <w:color w:val="1F2A24"/>
+          <w:sz w:val="21"/>
+        </w:rPr>
+        <w:t>ההמרה נספרת לאחר שליחת הטופס והגעה לדף התודה. כך ניתן למדוד לא רק כניסות לדף, אלא גם פעולה עסקית של השארת פרטים.</w:t>
+      </w:r>
+    </w:p>
+    <w:p>
+      <w:pPr>
+        <w:spacing w:before="300" w:after="140"/>
+        <w:jc w:val="right"/>
+        <w:bidi w:val="1"/>
+      </w:pPr>
+      <w:r>
+        <w:rPr>
+          <w:rFonts w:ascii="Arial" w:hAnsi="Arial"/>
+          <w:b/>
+          <w:color w:val="5F7D68"/>
+          <w:sz w:val="36"/>
+        </w:rPr>
+        <w:t>10. סיכום</w:t>
+      </w:r>
+    </w:p>
+    <w:p>
+      <w:pPr>
+        <w:spacing w:after="140" w:line="276" w:lineRule="auto"/>
+        <w:jc w:val="right"/>
+        <w:bidi w:val="1"/>
+      </w:pPr>
+      <w:r>
+        <w:rPr>
+          <w:rFonts w:ascii="Arial" w:hAnsi="Arial"/>
+          <w:b w:val="0"/>
+          <w:color w:val="1F2A24"/>
+          <w:sz w:val="22"/>
+        </w:rPr>
+        <w:t>העבודה מציגה תהליך של הקמת פעילות פרסום עבור עסק שירותי: אתר עם דפי נחיתה וטופס, מדידת המרות, קמפיין חיפוש וקמפיין מותג, קמפיין מדיה עם רימרקטינג, קמפיין וידאו ומודעות התקשרות. כל הקמפיינים בחשבון נשמרו במצב מושהה בהתאם להנחיות המטלה. בחשבון הוקמו גם תוסף ספירה לאחור, מודעת התקשרות בלבד, ארבעה מיקומי ערוצי YouTube ושני סרטוני YouTube.</w:t>
+      </w:r>
+    </w:p>
+    <w:p>
+      <w:pPr>
+        <w:spacing w:before="360" w:after="0"/>
+        <w:jc w:val="right"/>
+        <w:bidi w:val="1"/>
+      </w:pPr>
+      <w:r>
+        <w:rPr>
+          <w:rFonts w:ascii="Arial" w:hAnsi="Arial"/>
+          <w:b/>
+          <w:color w:val="5F7D68"/>
+          <w:sz w:val="21"/>
+        </w:rPr>
+        <w:t xml:space="preserve">פרטי קשר להגשה: </w:t>
+      </w:r>
+      <w:r>
+        <w:rPr>
+          <w:rFonts w:ascii="Arial" w:hAnsi="Arial"/>
+          <w:color w:val="1F2A24"/>
+          <w:sz w:val="21"/>
+        </w:rPr>
+        <w:t>עמית סולימן · 0587477769 · amitsuliman12@gmail.com</w:t>
       </w:r>
     </w:p>
     <w:sectPr>
       <w:headerReference w:type="default" r:id="rId9"/>
       <w:footerReference w:type="default" r:id="rId10"/>
       <w:pgSz w:w="12240" w:h="15840"/>
-      <w:pgMar w:top="864" w:right="1080" w:bottom="864" w:left="1080" w:header="720" w:footer="720" w:gutter="0"/>
+      <w:pgMar w:top="792" w:right="1008" w:bottom="792" w:left="1008" w:header="720" w:footer="720" w:gutter="0"/>
       <w:cols w:space="720"/>
       <w:docGrid w:linePitch="360"/>
     </w:sectPr>
@@ -940,7 +3033,7 @@
   <w:p>
     <w:pPr>
       <w:pStyle w:val="Footer"/>
-      <w:jc w:val="right"/>
+      <w:jc w:val="center"/>
     </w:pPr>
     <w:r>
       <w:rPr>
@@ -948,7 +3041,7 @@
         <w:color w:val="6F706A"/>
         <w:sz w:val="16"/>
       </w:rPr>
-      <w:t>LUMERA · פרסום בגוגל · עמית סולימן</w:t>
+      <w:t>LUMERA  ·  פרסום בגוגל  ·  עמית סולימן</w:t>
     </w:r>
   </w:p>
 </w:ftr>
@@ -959,12 +3052,12 @@
   <w:p>
     <w:pPr>
       <w:pStyle w:val="Header"/>
-      <w:jc w:val="right"/>
+      <w:jc w:val="center"/>
     </w:pPr>
     <w:r>
       <w:drawing>
         <wp:inline xmlns:a="http://schemas.openxmlformats.org/drawingml/2006/main" xmlns:pic="http://schemas.openxmlformats.org/drawingml/2006/picture">
-          <wp:extent cx="1417320" cy="354330"/>
+          <wp:extent cx="1325880" cy="331470"/>
           <wp:docPr id="1" name="Picture 1"/>
           <wp:cNvGraphicFramePr>
             <a:graphicFrameLocks noChangeAspect="1"/>
@@ -973,7 +3066,7 @@
             <a:graphicData uri="http://schemas.openxmlformats.org/drawingml/2006/picture">
               <pic:pic>
                 <pic:nvPicPr>
-                  <pic:cNvPr id="0" name="lumera-logo-landscape-transparent.png"/>
+                  <pic:cNvPr id="0" name="lumera-logo-landscape.png"/>
                   <pic:cNvPicPr/>
                 </pic:nvPicPr>
                 <pic:blipFill>
@@ -985,7 +3078,7 @@
                 <pic:spPr>
                   <a:xfrm>
                     <a:off x="0" y="0"/>
-                    <a:ext cx="1417320" cy="354330"/>
+                    <a:ext cx="1325880" cy="331470"/>
                   </a:xfrm>
                   <a:prstGeom prst="rect"/>
                 </pic:spPr>
@@ -1364,7 +3457,8 @@
     <w:rsid w:val="00FC693F"/>
     <w:rPr>
       <w:rFonts w:ascii="Arial" w:hAnsi="Arial"/>
-      <w:sz w:val="22"/>
+      <w:color w:val="1F2A24"/>
+      <w:sz w:val="21"/>
     </w:rPr>
   </w:style>
   <w:style w:type="paragraph" w:styleId="Header">

</xml_diff>